<commit_message>
free usg bill generate for civil
</commit_message>
<xml_diff>
--- a/MRI Scan/MRI DOCUMENT.docx
+++ b/MRI Scan/MRI DOCUMENT.docx
@@ -1,18 +1,19 @@
 
 <file path=word/document.xml><?xml version="1.0" encoding="utf-8"?>
-<w:document xmlns:o="urn:schemas-microsoft-com:office:office" xmlns:r="http://schemas.openxmlformats.org/officeDocument/2006/relationships" xmlns:v="urn:schemas-microsoft-com:vml" xmlns:w="http://schemas.openxmlformats.org/wordprocessingml/2006/main" xmlns:w10="urn:schemas-microsoft-com:office:word" xmlns:wp="http://schemas.openxmlformats.org/drawingml/2006/wordprocessingDrawing" xmlns:wps="http://schemas.microsoft.com/office/word/2010/wordprocessingShape" xmlns:wpg="http://schemas.microsoft.com/office/word/2010/wordprocessingGroup" xmlns:mc="http://schemas.openxmlformats.org/markup-compatibility/2006" xmlns:wp14="http://schemas.microsoft.com/office/word/2010/wordprocessingDrawing" xmlns:w14="http://schemas.microsoft.com/office/word/2010/wordml" mc:Ignorable="w14 wp14">
+<w:document xmlns:wpc="http://schemas.microsoft.com/office/word/2010/wordprocessingCanvas" xmlns:mc="http://schemas.openxmlformats.org/markup-compatibility/2006" xmlns:o="urn:schemas-microsoft-com:office:office" xmlns:r="http://schemas.openxmlformats.org/officeDocument/2006/relationships" xmlns:m="http://schemas.openxmlformats.org/officeDocument/2006/math" xmlns:v="urn:schemas-microsoft-com:vml" xmlns:wp14="http://schemas.microsoft.com/office/word/2010/wordprocessingDrawing" xmlns:wp="http://schemas.openxmlformats.org/drawingml/2006/wordprocessingDrawing" xmlns:w="http://schemas.openxmlformats.org/wordprocessingml/2006/main" xmlns:w14="http://schemas.microsoft.com/office/word/2010/wordml" xmlns:w10="urn:schemas-microsoft-com:office:word" xmlns:w15="http://schemas.microsoft.com/office/word/2012/wordml" xmlns:wpg="http://schemas.microsoft.com/office/word/2010/wordprocessingGroup" xmlns:wpi="http://schemas.microsoft.com/office/word/2010/wordprocessingInk" xmlns:wne="http://schemas.microsoft.com/office/word/2006/wordml" xmlns:wps="http://schemas.microsoft.com/office/word/2010/wordprocessingShape" xmlns:wpsCustomData="http://www.wps.cn/officeDocument/2013/wpsCustomData" mc:Ignorable="w14 w15 wp14">
   <w:background w:color="FFFFFF"/>
   <w:body>
     <w:tbl>
       <w:tblPr>
+        <w:tblStyle w:val="19"/>
         <w:tblW w:w="10318" w:type="dxa"/>
-        <w:jc w:val="start"/>
         <w:tblInd w:w="0" w:type="dxa"/>
+        <w:tblLayout w:type="fixed"/>
         <w:tblCellMar>
           <w:top w:w="0" w:type="dxa"/>
-          <w:start w:w="108" w:type="dxa"/>
+          <w:left w:w="108" w:type="dxa"/>
           <w:bottom w:w="0" w:type="dxa"/>
-          <w:end w:w="108" w:type="dxa"/>
+          <w:right w:w="108" w:type="dxa"/>
         </w:tblCellMar>
       </w:tblPr>
       <w:tblGrid>
@@ -21,17 +22,24 @@
         <w:gridCol w:w="2793"/>
       </w:tblGrid>
       <w:tr>
+        <w:tblPrEx>
+          <w:tblLayout w:type="fixed"/>
+          <w:tblCellMar>
+            <w:top w:w="0" w:type="dxa"/>
+            <w:left w:w="108" w:type="dxa"/>
+            <w:bottom w:w="0" w:type="dxa"/>
+            <w:right w:w="108" w:type="dxa"/>
+          </w:tblCellMar>
+        </w:tblPrEx>
         <w:trPr>
           <w:trHeight w:val="436" w:hRule="atLeast"/>
         </w:trPr>
         <w:tc>
           <w:tcPr>
             <w:tcW w:w="3630" w:type="dxa"/>
-            <w:tcBorders/>
           </w:tcPr>
           <w:p>
             <w:pPr>
-              <w:pStyle w:val="Normal"/>
               <w:spacing w:before="0" w:after="200"/>
               <w:rPr>
                 <w:sz w:val="24"/>
@@ -48,11 +56,9 @@
         <w:tc>
           <w:tcPr>
             <w:tcW w:w="3895" w:type="dxa"/>
-            <w:tcBorders/>
           </w:tcPr>
           <w:p>
             <w:pPr>
-              <w:pStyle w:val="Normal"/>
               <w:spacing w:before="0" w:after="200"/>
               <w:rPr>
                 <w:sz w:val="24"/>
@@ -69,11 +75,9 @@
         <w:tc>
           <w:tcPr>
             <w:tcW w:w="2793" w:type="dxa"/>
-            <w:tcBorders/>
           </w:tcPr>
           <w:p>
             <w:pPr>
-              <w:pStyle w:val="Normal"/>
               <w:spacing w:before="0" w:after="200"/>
               <w:rPr>
                 <w:sz w:val="24"/>
@@ -89,6 +93,15 @@
         </w:tc>
       </w:tr>
       <w:tr>
+        <w:tblPrEx>
+          <w:tblLayout w:type="fixed"/>
+          <w:tblCellMar>
+            <w:top w:w="0" w:type="dxa"/>
+            <w:left w:w="108" w:type="dxa"/>
+            <w:bottom w:w="0" w:type="dxa"/>
+            <w:right w:w="108" w:type="dxa"/>
+          </w:tblCellMar>
+        </w:tblPrEx>
         <w:trPr>
           <w:trHeight w:val="462" w:hRule="atLeast"/>
         </w:trPr>
@@ -96,11 +109,9 @@
           <w:tcPr>
             <w:tcW w:w="7525" w:type="dxa"/>
             <w:gridSpan w:val="2"/>
-            <w:tcBorders/>
           </w:tcPr>
           <w:p>
             <w:pPr>
-              <w:pStyle w:val="Normal"/>
               <w:spacing w:before="0" w:after="200"/>
               <w:rPr>
                 <w:sz w:val="24"/>
@@ -117,11 +128,9 @@
         <w:tc>
           <w:tcPr>
             <w:tcW w:w="2793" w:type="dxa"/>
-            <w:tcBorders/>
           </w:tcPr>
           <w:p>
             <w:pPr>
-              <w:pStyle w:val="Normal"/>
               <w:spacing w:before="0" w:after="200"/>
               <w:rPr>
                 <w:sz w:val="24"/>
@@ -138,211 +147,89 @@
       </w:tr>
     </w:tbl>
     <w:p>
-      <w:pPr>
-        <w:pStyle w:val="Normal"/>
-        <w:rPr/>
-      </w:pPr>
+      <w:pPr/>
+    </w:p>
+    <w:p>
+      <w:pPr/>
+    </w:p>
+    <w:p>
+      <w:pPr/>
+    </w:p>
+    <w:p>
+      <w:pPr/>
+    </w:p>
+    <w:p>
+      <w:pPr/>
+    </w:p>
+    <w:p>
+      <w:pPr/>
+    </w:p>
+    <w:p>
+      <w:pPr/>
+    </w:p>
+    <w:p>
+      <w:pPr/>
+    </w:p>
+    <w:p>
+      <w:pPr/>
+    </w:p>
+    <w:p>
+      <w:pPr/>
+    </w:p>
+    <w:p>
+      <w:pPr/>
+    </w:p>
+    <w:p>
+      <w:pPr/>
+    </w:p>
+    <w:p>
+      <w:pPr/>
+    </w:p>
+    <w:p>
+      <w:pPr/>
+    </w:p>
+    <w:p>
+      <w:pPr/>
+    </w:p>
+    <w:p>
+      <w:pPr/>
+    </w:p>
+    <w:p>
+      <w:pPr/>
+    </w:p>
+    <w:p>
+      <w:pPr/>
       <w:r>
-        <w:rPr/>
+        <w:t>_signature_</w:t>
       </w:r>
     </w:p>
     <w:p>
       <w:pPr>
-        <w:pStyle w:val="Normal"/>
-        <w:rPr/>
-      </w:pPr>
-      <w:r>
-        <w:rPr/>
-      </w:r>
-    </w:p>
-    <w:p>
-      <w:pPr>
-        <w:pStyle w:val="Normal"/>
-        <w:rPr/>
-      </w:pPr>
-      <w:r>
-        <w:rPr/>
-      </w:r>
-    </w:p>
-    <w:p>
-      <w:pPr>
-        <w:pStyle w:val="Normal"/>
-        <w:rPr/>
-      </w:pPr>
-      <w:r>
-        <w:rPr/>
-      </w:r>
-    </w:p>
-    <w:p>
-      <w:pPr>
-        <w:pStyle w:val="Normal"/>
-        <w:rPr/>
-      </w:pPr>
-      <w:r>
-        <w:rPr/>
-      </w:r>
-    </w:p>
-    <w:p>
-      <w:pPr>
-        <w:pStyle w:val="Normal"/>
-        <w:rPr/>
-      </w:pPr>
-      <w:r>
-        <w:rPr/>
-      </w:r>
-    </w:p>
-    <w:p>
-      <w:pPr>
-        <w:pStyle w:val="Normal"/>
-        <w:rPr/>
-      </w:pPr>
-      <w:r>
-        <w:rPr/>
-      </w:r>
-    </w:p>
-    <w:p>
-      <w:pPr>
-        <w:pStyle w:val="Normal"/>
-        <w:rPr/>
-      </w:pPr>
-      <w:r>
-        <w:rPr/>
-      </w:r>
-    </w:p>
-    <w:p>
-      <w:pPr>
-        <w:pStyle w:val="Normal"/>
-        <w:rPr/>
-      </w:pPr>
-      <w:r>
-        <w:rPr/>
-      </w:r>
-    </w:p>
-    <w:p>
-      <w:pPr>
-        <w:pStyle w:val="Normal"/>
-        <w:rPr/>
-      </w:pPr>
-      <w:r>
-        <w:rPr/>
-      </w:r>
-    </w:p>
-    <w:p>
-      <w:pPr>
-        <w:pStyle w:val="Normal"/>
-        <w:rPr/>
-      </w:pPr>
-      <w:r>
-        <w:rPr/>
-      </w:r>
-    </w:p>
-    <w:p>
-      <w:pPr>
-        <w:pStyle w:val="Normal"/>
-        <w:rPr/>
-      </w:pPr>
-      <w:r>
-        <w:rPr/>
-      </w:r>
-    </w:p>
-    <w:p>
-      <w:pPr>
-        <w:pStyle w:val="Normal"/>
-        <w:rPr/>
-      </w:pPr>
-      <w:r>
-        <w:rPr/>
-      </w:r>
-    </w:p>
-    <w:p>
-      <w:pPr>
-        <w:pStyle w:val="Normal"/>
-        <w:rPr/>
-      </w:pPr>
-      <w:r>
-        <w:rPr/>
-      </w:r>
-    </w:p>
-    <w:p>
-      <w:pPr>
-        <w:pStyle w:val="Normal"/>
-        <w:rPr/>
-      </w:pPr>
-      <w:r>
-        <w:rPr/>
-      </w:r>
-    </w:p>
-    <w:p>
-      <w:pPr>
-        <w:pStyle w:val="Normal"/>
-        <w:rPr/>
-      </w:pPr>
-      <w:r>
-        <w:rPr/>
-      </w:r>
-    </w:p>
-    <w:p>
-      <w:pPr>
-        <w:pStyle w:val="Normal"/>
-        <w:rPr/>
-      </w:pPr>
-      <w:r>
-        <w:rPr/>
-      </w:r>
-    </w:p>
-    <w:p>
-      <w:pPr>
-        <w:pStyle w:val="Normal"/>
-        <w:rPr/>
-      </w:pPr>
-      <w:r>
-        <w:rPr/>
-        <w:t>_</w:t>
-      </w:r>
-      <w:r>
-        <w:rPr/>
-        <w:t>signature</w:t>
-      </w:r>
-      <w:r>
-        <w:rPr/>
-        <w:t>_</w:t>
-      </w:r>
-    </w:p>
-    <w:p>
-      <w:pPr>
-        <w:pStyle w:val="Normal"/>
         <w:widowControl/>
         <w:bidi w:val="0"/>
-        <w:spacing w:lineRule="auto" w:line="276" w:before="0" w:after="200"/>
-        <w:rPr/>
+        <w:spacing w:before="0" w:after="200" w:line="276" w:lineRule="auto"/>
       </w:pPr>
-      <w:r>
-        <w:rPr/>
-      </w:r>
     </w:p>
     <w:sectPr>
-      <w:headerReference w:type="default" r:id="rId2"/>
-      <w:footerReference w:type="default" r:id="rId3"/>
-      <w:type w:val="nextPage"/>
+      <w:headerReference r:id="rId3" w:type="default"/>
+      <w:footerReference r:id="rId4" w:type="default"/>
       <w:pgSz w:w="11906" w:h="16838"/>
-      <w:pgMar w:left="1440" w:right="1440" w:header="720" w:top="3398" w:footer="720" w:bottom="2160" w:gutter="0"/>
+      <w:pgMar w:top="3398" w:right="1440" w:bottom="2160" w:left="1440" w:header="720" w:footer="720" w:gutter="0"/>
       <w:pgNumType w:fmt="decimal"/>
-      <w:formProt w:val="false"/>
-      <w:textDirection w:val="lrTb"/>
-      <w:docGrid w:type="default" w:linePitch="360" w:charSpace="0"/>
+      <w:formProt w:val="0"/>
+      <w:docGrid w:linePitch="360" w:charSpace="0"/>
     </w:sectPr>
   </w:body>
 </w:document>
 </file>
 
 <file path=word/footer1.xml><?xml version="1.0" encoding="utf-8"?>
-<w:ftr xmlns:o="urn:schemas-microsoft-com:office:office" xmlns:r="http://schemas.openxmlformats.org/officeDocument/2006/relationships" xmlns:v="urn:schemas-microsoft-com:vml" xmlns:w="http://schemas.openxmlformats.org/wordprocessingml/2006/main" xmlns:w10="urn:schemas-microsoft-com:office:word" xmlns:wp="http://schemas.openxmlformats.org/drawingml/2006/wordprocessingDrawing" xmlns:wps="http://schemas.microsoft.com/office/word/2010/wordprocessingShape" xmlns:wpg="http://schemas.microsoft.com/office/word/2010/wordprocessingGroup" xmlns:mc="http://schemas.openxmlformats.org/markup-compatibility/2006" xmlns:wp14="http://schemas.microsoft.com/office/word/2010/wordprocessingDrawing" xmlns:w14="http://schemas.microsoft.com/office/word/2010/wordml" mc:Ignorable="w14 wp14">
+<w:ftr xmlns:wpc="http://schemas.microsoft.com/office/word/2010/wordprocessingCanvas" xmlns:mc="http://schemas.openxmlformats.org/markup-compatibility/2006" xmlns:o="urn:schemas-microsoft-com:office:office" xmlns:r="http://schemas.openxmlformats.org/officeDocument/2006/relationships" xmlns:m="http://schemas.openxmlformats.org/officeDocument/2006/math" xmlns:v="urn:schemas-microsoft-com:vml" xmlns:wp14="http://schemas.microsoft.com/office/word/2010/wordprocessingDrawing" xmlns:wp="http://schemas.openxmlformats.org/drawingml/2006/wordprocessingDrawing" xmlns:w10="urn:schemas-microsoft-com:office:word" xmlns:w="http://schemas.openxmlformats.org/wordprocessingml/2006/main" xmlns:w14="http://schemas.microsoft.com/office/word/2010/wordml" xmlns:w15="http://schemas.microsoft.com/office/word/2012/wordml" xmlns:wpg="http://schemas.microsoft.com/office/word/2010/wordprocessingGroup" xmlns:wpi="http://schemas.microsoft.com/office/word/2010/wordprocessingInk" xmlns:wne="http://schemas.microsoft.com/office/word/2006/wordml" xmlns:wps="http://schemas.microsoft.com/office/word/2010/wordprocessingShape" xmlns:wpsCustomData="http://www.wps.cn/officeDocument/2013/wpsCustomData" mc:Ignorable="w14 w15 wp14">
   <w:p>
     <w:pPr>
-      <w:pStyle w:val="Footer"/>
+      <w:pStyle w:val="12"/>
       <w:rPr>
         <w:rFonts w:eastAsia="Calibri"/>
-        <w:b/>
         <w:b/>
       </w:rPr>
     </w:pPr>
@@ -351,20 +238,13 @@
         <w:rFonts w:eastAsia="Calibri"/>
         <w:b/>
       </w:rPr>
-      <w:t xml:space="preserve"> </w:t>
-    </w:r>
-    <w:r>
-      <w:rPr>
-        <w:rFonts w:eastAsia="Calibri"/>
-        <w:b/>
-      </w:rPr>
-      <w:t xml:space="preserve">                                                                                                                                                                                            </w:t>
+      <w:t xml:space="preserve">                                                                                                                                                                                             </w:t>
     </w:r>
     <w:r>
       <mc:AlternateContent>
         <mc:Choice Requires="wps">
           <w:drawing>
-            <wp:anchor behindDoc="1" distT="0" distB="0" distL="114935" distR="114935" simplePos="0" locked="0" layoutInCell="1" allowOverlap="1" relativeHeight="6">
+            <wp:anchor distT="0" distB="0" distL="114935" distR="114935" simplePos="0" relativeHeight="1024" behindDoc="1" locked="0" layoutInCell="1" allowOverlap="1">
               <wp:simplePos x="0" y="0"/>
               <wp:positionH relativeFrom="column">
                 <wp:posOffset>-158115</wp:posOffset>
@@ -376,6 +256,7 @@
               <wp:effectExtent l="0" t="0" r="0" b="0"/>
               <wp:wrapNone/>
               <wp:docPr id="10" name="Frame1"/>
+              <wp:cNvGraphicFramePr/>
               <a:graphic xmlns:a="http://schemas.openxmlformats.org/drawingml/2006/main">
                 <a:graphicData uri="http://schemas.microsoft.com/office/word/2010/wordprocessingShape">
                   <wps:wsp>
@@ -385,7 +266,9 @@
                         <a:off x="0" y="0"/>
                         <a:ext cx="6155690" cy="1431925"/>
                       </a:xfrm>
-                      <a:prstGeom prst="rect"/>
+                      <a:prstGeom prst="rect">
+                        <a:avLst/>
+                      </a:prstGeom>
                       <a:solidFill>
                         <a:srgbClr val="FFFFFF"/>
                       </a:solidFill>
@@ -399,9 +282,8 @@
                       <w:txbxContent>
                         <w:p>
                           <w:pPr>
-                            <w:pStyle w:val="Footer"/>
-                            <w:rPr>
-                              <w:b/>
+                            <w:pStyle w:val="12"/>
+                            <w:rPr>
                               <w:b/>
                               <w:color w:val="800000"/>
                             </w:rPr>
@@ -416,9 +298,8 @@
                         </w:p>
                         <w:p>
                           <w:pPr>
-                            <w:pStyle w:val="Footer"/>
-                            <w:rPr>
-                              <w:b/>
+                            <w:pStyle w:val="12"/>
+                            <w:rPr>
                               <w:b/>
                               <w:color w:val="800000"/>
                             </w:rPr>
@@ -433,10 +314,8 @@
                         </w:p>
                         <w:p>
                           <w:pPr>
-                            <w:pStyle w:val="Normal"/>
-                            <w:spacing w:lineRule="auto" w:line="240" w:before="0" w:after="0"/>
-                            <w:rPr>
-                              <w:b/>
+                            <w:spacing w:before="0" w:after="0" w:line="240" w:lineRule="auto"/>
+                            <w:rPr>
                               <w:b/>
                               <w:color w:val="800000"/>
                             </w:rPr>
@@ -451,10 +330,8 @@
                         </w:p>
                         <w:p>
                           <w:pPr>
-                            <w:pStyle w:val="Normal"/>
-                            <w:spacing w:lineRule="auto" w:line="240" w:before="0" w:after="0"/>
-                            <w:rPr>
-                              <w:b/>
+                            <w:spacing w:before="0" w:after="0" w:line="240" w:lineRule="auto"/>
+                            <w:rPr>
                               <w:b/>
                               <w:color w:val="800000"/>
                             </w:rPr>
@@ -469,10 +346,8 @@
                         </w:p>
                         <w:p>
                           <w:pPr>
-                            <w:pStyle w:val="Normal"/>
-                            <w:spacing w:lineRule="auto" w:line="240" w:before="0" w:after="0"/>
-                            <w:rPr>
-                              <w:b/>
+                            <w:spacing w:before="0" w:after="0" w:line="240" w:lineRule="auto"/>
+                            <w:rPr>
                               <w:b/>
                               <w:color w:val="800000"/>
                             </w:rPr>
@@ -487,10 +362,8 @@
                         </w:p>
                         <w:p>
                           <w:pPr>
-                            <w:pStyle w:val="Normal"/>
-                            <w:spacing w:lineRule="auto" w:line="240" w:before="0" w:after="0"/>
-                            <w:rPr>
-                              <w:b/>
+                            <w:spacing w:before="0" w:after="0" w:line="240" w:lineRule="auto"/>
+                            <w:rPr>
                               <w:b/>
                               <w:color w:val="800000"/>
                             </w:rPr>
@@ -505,53 +378,37 @@
                         </w:p>
                         <w:p>
                           <w:pPr>
-                            <w:pStyle w:val="Footer"/>
-                            <w:rPr>
-                              <w:b/>
+                            <w:pStyle w:val="12"/>
+                            <w:rPr>
                               <w:b/>
                               <w:color w:val="000000"/>
                             </w:rPr>
                           </w:pPr>
                           <w:r>
-                            <w:rPr/>
                             <w:t>This is only an opinion and not the final diagnosis. Clinical correlation is must. This report is not valid for   medico-legal purpose</w:t>
                           </w:r>
                         </w:p>
                         <w:p>
                           <w:pPr>
-                            <w:pStyle w:val="Footer"/>
-                            <w:rPr>
-                              <w:b/>
+                            <w:pStyle w:val="12"/>
+                            <w:rPr>
                               <w:b/>
                               <w:color w:val="000000"/>
                             </w:rPr>
                           </w:pPr>
-                          <w:r>
-                            <w:rPr>
-                              <w:b/>
-                              <w:color w:val="000000"/>
-                            </w:rPr>
-                          </w:r>
                         </w:p>
                         <w:p>
                           <w:pPr>
-                            <w:pStyle w:val="Footer"/>
-                            <w:rPr>
-                              <w:b/>
+                            <w:pStyle w:val="12"/>
+                            <w:rPr>
                               <w:b/>
                               <w:color w:val="000000"/>
                             </w:rPr>
                           </w:pPr>
-                          <w:r>
-                            <w:rPr>
-                              <w:b/>
-                              <w:color w:val="000000"/>
-                            </w:rPr>
-                          </w:r>
                         </w:p>
                         <w:p>
                           <w:pPr>
-                            <w:pStyle w:val="Footer"/>
+                            <w:pStyle w:val="12"/>
                             <w:rPr>
                               <w:color w:val="000000"/>
                             </w:rPr>
@@ -573,30 +430,20 @@
                         </w:p>
                         <w:p>
                           <w:pPr>
-                            <w:pStyle w:val="Normal"/>
-                            <w:spacing w:lineRule="auto" w:line="240" w:before="0" w:after="0"/>
+                            <w:spacing w:before="0" w:after="0" w:line="240" w:lineRule="auto"/>
                             <w:jc w:val="both"/>
                             <w:rPr>
                               <w:b/>
-                              <w:b/>
                               <w:color w:val="000000"/>
                             </w:rPr>
                           </w:pPr>
-                          <w:r>
-                            <w:rPr>
-                              <w:b/>
-                              <w:color w:val="000000"/>
-                            </w:rPr>
-                          </w:r>
                         </w:p>
                         <w:p>
                           <w:pPr>
-                            <w:pStyle w:val="Normal"/>
                             <w:spacing w:before="0" w:after="200"/>
                             <w:jc w:val="both"/>
                             <w:rPr>
                               <w:rFonts w:eastAsia="Calibri"/>
-                              <w:b/>
                               <w:b/>
                             </w:rPr>
                           </w:pPr>
@@ -610,7 +457,7 @@
                         </w:p>
                       </w:txbxContent>
                     </wps:txbx>
-                    <wps:bodyPr anchor="t" lIns="91440" tIns="45720" rIns="91440" bIns="45720">
+                    <wps:bodyPr lIns="91440" tIns="45720" rIns="91440" bIns="45720" anchor="t">
                       <a:noAutofit/>
                     </wps:bodyPr>
                   </wps:wsp>
@@ -621,14 +468,17 @@
         </mc:Choice>
         <mc:Fallback>
           <w:pict>
-            <v:rect fillcolor="#FFFFFF" strokecolor="#FFFFFF" strokeweight="0pt" style="position:absolute;rotation:0;width:484.7pt;height:112.75pt;mso-wrap-distance-left:9.05pt;mso-wrap-distance-right:9.05pt;mso-wrap-distance-top:0pt;mso-wrap-distance-bottom:0pt;margin-top:-16.35pt;mso-position-vertical-relative:text;margin-left:-12.45pt;mso-position-horizontal-relative:text">
+            <v:shape id="Frame1" o:spid="_x0000_s1026" o:spt="202" type="#_x0000_t202" style="position:absolute;left:0pt;margin-left:-12.45pt;margin-top:-16.35pt;height:112.75pt;width:484.7pt;z-index:-503315456;mso-width-relative:page;mso-height-relative:page;" fillcolor="#FFFFFF" filled="t" stroked="t" coordsize="21600,21600" o:gfxdata="UEsDBAoAAAAAAIdO4kAAAAAAAAAAAAAAAAAEAAAAZHJzL1BLAwQUAAAACACHTuJAC+uNxNkAAAAL&#10;AQAADwAAAGRycy9kb3ducmV2LnhtbE2PwU7DMAyG70i8Q2QkLmhLFgqspemEJhDnDS7cstZrKxqn&#10;bbJ14+kxp3Gz5U+/vz9fnVwnjjiG1pOBxVyBQCp91VJt4PPjbbYEEaKlynae0MAZA6yK66vcZpWf&#10;aIPHbawFh1DIrIEmxj6TMpQNOhvmvkfi296PzkZex1pWo5043HVSK/UonW2JPzS2x3WD5ff24Az4&#10;6fXsPA5K3339uPf1y7DZ68GY25uFegYR8RQvMPzpszoU7LTzB6qC6AzMdJIyysO9fgLBRJokDyB2&#10;jKZ6CbLI5f8OxS9QSwMEFAAAAAgAh07iQCIKoui7AQAApQMAAA4AAABkcnMvZTJvRG9jLnhtbK1T&#10;y27bMBC8F8g/ELzXslzLjQXLQdPARYGiLZD2AyiKtAiQXIJkLPnvu6QUx2lvQXWguA/N7syudnej&#10;0eQkfFBgG1oulpQIy6FT9tjQ378O728pCZHZjmmwoqFnEejd/ubdbnC1WEEPuhOeIIgN9eAa2sfo&#10;6qIIvBeGhQU4YTEowRsW0fTHovNsQHSji9VyuSkG8J3zwEUI6H2YgnSf8aUUPP6QMohIdEOxt5hP&#10;n882ncV+x+qjZ65XfG6DvaELw5TFoheoBxYZefLqHyijuIcAMi44mAKkVFxkDsimXP7F5rFnTmQu&#10;KE5wF5nC/4Pl308/PVEdzg7lsczgjA4eX2WSZnChxoxHhzlxvIcR0579AZ2J8Si9SW/kQjCOKOeL&#10;sGKMhKNzU1bVZoshjrFy/aHcrqqEU7x87nyIXwQYki4N9Ti5LCg7fQtxSn1OSdUCaNUdlNbZ8Mf2&#10;s/bkxHDKh/zM6K/StCVDQ7cV1n4bBLarLXadZJnop1sc23HWqoXujFLprxZHtC3X67Ry2VhXH1do&#10;+OtIex1hlveAizmxtvDpKYJUmXkqMiHPtXEXsnbz3qZlu7Zz1svftf8DUEsDBAoAAAAAAIdO4kAA&#10;AAAAAAAAAAAAAAAGAAAAX3JlbHMvUEsDBBQAAAAIAIdO4kCKFGY80QAAAJQBAAALAAAAX3JlbHMv&#10;LnJlbHOlkMFqwzAMhu+DvYPRfXGawxijTi+j0GvpHsDYimMaW0Yy2fr28w6DZfS2o36h7xP//vCZ&#10;FrUiS6RsYNf1oDA78jEHA++X49MLKKk2e7tQRgM3FDiMjw/7My62tiOZYxHVKFkMzLWWV63FzZis&#10;dFQwt81EnGxtIwddrLvagHro+2fNvxkwbpjq5A3wyQ+gLrfSzH/YKTomoal2jpKmaYruHlUHtmWO&#10;7sg24Ru5RrMcsBrwLBoHalnXfgR9X7/7p97TRz7jutV+h4zrj1dvuhy/AFBLAwQUAAAACACHTuJA&#10;fublIPcAAADhAQAAEwAAAFtDb250ZW50X1R5cGVzXS54bWyVkUFOwzAQRfdI3MHyFiVOu0AIJemC&#10;tEtAqBxgZE8Si2RseUxob4+TthtEkVjaM/+/J7vcHMZBTBjYOqrkKi+kQNLOWOoq+b7fZQ9ScAQy&#10;MDjCSh6R5aa+vSn3R48sUpq4kn2M/lEp1j2OwLnzSGnSujBCTMfQKQ/6AzpU66K4V9pRRIpZnDtk&#10;XTbYwucQxfaQrk8mAQeW4um0OLMqCd4PVkNMpmoi84OSnQl5Si473FvPd0lDql8J8+Q64Jx7SU8T&#10;rEHxCiE+w5g0lAmsjPuigFP+d8lsOXLm2tZqzJvATYq94XSxutaOa9c4/d/y7ZK6dKvlg+pvUEsB&#10;AhQAFAAAAAgAh07iQH7m5SD3AAAA4QEAABMAAAAAAAAAAQAgAAAALQQAAFtDb250ZW50X1R5cGVz&#10;XS54bWxQSwECFAAKAAAAAACHTuJAAAAAAAAAAAAAAAAABgAAAAAAAAAAABAAAAAPAwAAX3JlbHMv&#10;UEsBAhQAFAAAAAgAh07iQIoUZjzRAAAAlAEAAAsAAAAAAAAAAQAgAAAAMwMAAF9yZWxzLy5yZWxz&#10;UEsBAhQACgAAAAAAh07iQAAAAAAAAAAAAAAAAAQAAAAAAAAAAAAQAAAAAAAAAGRycy9QSwECFAAU&#10;AAAACACHTuJAC+uNxNkAAAALAQAADwAAAAAAAAABACAAAAAiAAAAZHJzL2Rvd25yZXYueG1sUEsB&#10;AhQAFAAAAAgAh07iQCIKoui7AQAApQMAAA4AAAAAAAAAAQAgAAAAKAEAAGRycy9lMm9Eb2MueG1s&#10;UEsFBgAAAAAGAAYAWQEAAFUFAAAAAA==&#10;">
+              <v:fill on="t" focussize="0,0"/>
+              <v:stroke color="#FFFFFF" joinstyle="round"/>
+              <v:imagedata o:title=""/>
+              <o:lock v:ext="edit" aspectratio="f"/>
               <v:textbox>
                 <w:txbxContent>
                   <w:p>
                     <w:pPr>
-                      <w:pStyle w:val="Footer"/>
-                      <w:rPr>
-                        <w:b/>
+                      <w:pStyle w:val="12"/>
+                      <w:rPr>
                         <w:b/>
                         <w:color w:val="800000"/>
                       </w:rPr>
@@ -643,9 +493,8 @@
                   </w:p>
                   <w:p>
                     <w:pPr>
-                      <w:pStyle w:val="Footer"/>
-                      <w:rPr>
-                        <w:b/>
+                      <w:pStyle w:val="12"/>
+                      <w:rPr>
                         <w:b/>
                         <w:color w:val="800000"/>
                       </w:rPr>
@@ -660,10 +509,8 @@
                   </w:p>
                   <w:p>
                     <w:pPr>
-                      <w:pStyle w:val="Normal"/>
-                      <w:spacing w:lineRule="auto" w:line="240" w:before="0" w:after="0"/>
-                      <w:rPr>
-                        <w:b/>
+                      <w:spacing w:before="0" w:after="0" w:line="240" w:lineRule="auto"/>
+                      <w:rPr>
                         <w:b/>
                         <w:color w:val="800000"/>
                       </w:rPr>
@@ -678,10 +525,8 @@
                   </w:p>
                   <w:p>
                     <w:pPr>
-                      <w:pStyle w:val="Normal"/>
-                      <w:spacing w:lineRule="auto" w:line="240" w:before="0" w:after="0"/>
-                      <w:rPr>
-                        <w:b/>
+                      <w:spacing w:before="0" w:after="0" w:line="240" w:lineRule="auto"/>
+                      <w:rPr>
                         <w:b/>
                         <w:color w:val="800000"/>
                       </w:rPr>
@@ -696,10 +541,8 @@
                   </w:p>
                   <w:p>
                     <w:pPr>
-                      <w:pStyle w:val="Normal"/>
-                      <w:spacing w:lineRule="auto" w:line="240" w:before="0" w:after="0"/>
-                      <w:rPr>
-                        <w:b/>
+                      <w:spacing w:before="0" w:after="0" w:line="240" w:lineRule="auto"/>
+                      <w:rPr>
                         <w:b/>
                         <w:color w:val="800000"/>
                       </w:rPr>
@@ -714,10 +557,8 @@
                   </w:p>
                   <w:p>
                     <w:pPr>
-                      <w:pStyle w:val="Normal"/>
-                      <w:spacing w:lineRule="auto" w:line="240" w:before="0" w:after="0"/>
-                      <w:rPr>
-                        <w:b/>
+                      <w:spacing w:before="0" w:after="0" w:line="240" w:lineRule="auto"/>
+                      <w:rPr>
                         <w:b/>
                         <w:color w:val="800000"/>
                       </w:rPr>
@@ -732,53 +573,37 @@
                   </w:p>
                   <w:p>
                     <w:pPr>
-                      <w:pStyle w:val="Footer"/>
-                      <w:rPr>
-                        <w:b/>
+                      <w:pStyle w:val="12"/>
+                      <w:rPr>
                         <w:b/>
                         <w:color w:val="000000"/>
                       </w:rPr>
                     </w:pPr>
                     <w:r>
-                      <w:rPr/>
                       <w:t>This is only an opinion and not the final diagnosis. Clinical correlation is must. This report is not valid for   medico-legal purpose</w:t>
                     </w:r>
                   </w:p>
                   <w:p>
                     <w:pPr>
-                      <w:pStyle w:val="Footer"/>
-                      <w:rPr>
-                        <w:b/>
+                      <w:pStyle w:val="12"/>
+                      <w:rPr>
                         <w:b/>
                         <w:color w:val="000000"/>
                       </w:rPr>
                     </w:pPr>
-                    <w:r>
-                      <w:rPr>
-                        <w:b/>
-                        <w:color w:val="000000"/>
-                      </w:rPr>
-                    </w:r>
                   </w:p>
                   <w:p>
                     <w:pPr>
-                      <w:pStyle w:val="Footer"/>
-                      <w:rPr>
-                        <w:b/>
+                      <w:pStyle w:val="12"/>
+                      <w:rPr>
                         <w:b/>
                         <w:color w:val="000000"/>
                       </w:rPr>
                     </w:pPr>
-                    <w:r>
-                      <w:rPr>
-                        <w:b/>
-                        <w:color w:val="000000"/>
-                      </w:rPr>
-                    </w:r>
                   </w:p>
                   <w:p>
                     <w:pPr>
-                      <w:pStyle w:val="Footer"/>
+                      <w:pStyle w:val="12"/>
                       <w:rPr>
                         <w:color w:val="000000"/>
                       </w:rPr>
@@ -800,30 +625,20 @@
                   </w:p>
                   <w:p>
                     <w:pPr>
-                      <w:pStyle w:val="Normal"/>
-                      <w:spacing w:lineRule="auto" w:line="240" w:before="0" w:after="0"/>
+                      <w:spacing w:before="0" w:after="0" w:line="240" w:lineRule="auto"/>
                       <w:jc w:val="both"/>
                       <w:rPr>
                         <w:b/>
-                        <w:b/>
                         <w:color w:val="000000"/>
                       </w:rPr>
                     </w:pPr>
-                    <w:r>
-                      <w:rPr>
-                        <w:b/>
-                        <w:color w:val="000000"/>
-                      </w:rPr>
-                    </w:r>
                   </w:p>
                   <w:p>
                     <w:pPr>
-                      <w:pStyle w:val="Normal"/>
                       <w:spacing w:before="0" w:after="200"/>
                       <w:jc w:val="both"/>
                       <w:rPr>
                         <w:rFonts w:eastAsia="Calibri"/>
-                        <w:b/>
                         <w:b/>
                       </w:rPr>
                     </w:pPr>
@@ -837,7 +652,7 @@
                   </w:p>
                 </w:txbxContent>
               </v:textbox>
-            </v:rect>
+            </v:shape>
           </w:pict>
         </mc:Fallback>
       </mc:AlternateContent>
@@ -845,9 +660,8 @@
   </w:p>
   <w:p>
     <w:pPr>
-      <w:pStyle w:val="Footer"/>
+      <w:pStyle w:val="12"/>
       <w:rPr>
-        <w:b/>
         <w:b/>
       </w:rPr>
     </w:pPr>
@@ -860,9 +674,8 @@
   </w:p>
   <w:p>
     <w:pPr>
-      <w:pStyle w:val="Footer"/>
+      <w:pStyle w:val="12"/>
       <w:rPr>
-        <w:b/>
         <w:b/>
       </w:rPr>
     </w:pPr>
@@ -873,252 +686,68 @@
       <w:t xml:space="preserve">                                                                                                                                                                                                                              </w:t>
     </w:r>
     <w:r>
-      <w:rPr/>
       <w:t>.</w:t>
     </w:r>
   </w:p>
   <w:p>
     <w:pPr>
-      <w:pStyle w:val="Footer"/>
+      <w:pStyle w:val="12"/>
       <w:rPr>
-        <w:b/>
         <w:b/>
       </w:rPr>
     </w:pPr>
-    <w:r>
-      <w:rPr>
-        <w:b/>
-      </w:rPr>
-      <mc:AlternateContent>
-        <mc:Choice Requires="wps">
-          <w:drawing>
-            <wp:anchor behindDoc="1" distT="0" distB="0" distL="114935" distR="114935" simplePos="0" locked="0" layoutInCell="1" allowOverlap="1" relativeHeight="7">
-              <wp:simplePos x="0" y="0"/>
-              <wp:positionH relativeFrom="column">
-                <wp:posOffset>-1153795</wp:posOffset>
-              </wp:positionH>
-              <wp:positionV relativeFrom="paragraph">
-                <wp:posOffset>175895</wp:posOffset>
-              </wp:positionV>
-              <wp:extent cx="7828915" cy="1905"/>
-              <wp:effectExtent l="0" t="0" r="0" b="0"/>
-              <wp:wrapNone/>
-              <wp:docPr id="11" name="_x005F_x0000_s2066"/>
-              <a:graphic xmlns:a="http://schemas.openxmlformats.org/drawingml/2006/main">
-                <a:graphicData uri="http://schemas.microsoft.com/office/word/2010/wordprocessingShape">
-                  <wps:cxnSp>
-                    <wps:nvCxnSpPr>
-                      <wps:cNvPr id="2" name="Line 1"/>
-                      <wps:cNvCxnSpPr/>
-                      <wps:nvPr/>
-                    </wps:nvCxnSpPr>
-                    <wps:spPr>
-                      <a:xfrm>
-                        <a:off x="0" y="0"/>
-                        <a:ext cx="7828200" cy="1440"/>
-                      </a:xfrm>
-                      <a:prstGeom prst="straightConnector1">
-                        <a:avLst/>
-                      </a:prstGeom>
-                      <a:ln w="38160">
-                        <a:solidFill>
-                          <a:srgbClr val="000000"/>
-                        </a:solidFill>
-                        <a:miter/>
-                      </a:ln>
-                    </wps:spPr>
-                    <wps:bodyPr/>
-                  </wps:cxnSp>
-                </a:graphicData>
-              </a:graphic>
-            </wp:anchor>
-          </w:drawing>
-        </mc:Choice>
-        <mc:Fallback>
-          <w:pict>
-            <v:shape id="shape_0" ID="_x005F_x0000_s2066" stroked="t" style="position:absolute;margin-left:-71.95pt;margin-top:13.85pt;width:616.35pt;height:0.05pt" type="shapetype_32">
-              <v:stroke color="black" weight="38160" joinstyle="miter" endcap="flat"/>
-              <v:fill o:detectmouseclick="t" on="false"/>
-            </v:shape>
-          </w:pict>
-        </mc:Fallback>
-      </mc:AlternateContent>
-    </w:r>
   </w:p>
 </w:ftr>
 </file>
 
 <file path=word/header1.xml><?xml version="1.0" encoding="utf-8"?>
-<w:hdr xmlns:o="urn:schemas-microsoft-com:office:office" xmlns:r="http://schemas.openxmlformats.org/officeDocument/2006/relationships" xmlns:v="urn:schemas-microsoft-com:vml" xmlns:w="http://schemas.openxmlformats.org/wordprocessingml/2006/main" xmlns:w10="urn:schemas-microsoft-com:office:word" xmlns:wp="http://schemas.openxmlformats.org/drawingml/2006/wordprocessingDrawing" xmlns:wps="http://schemas.microsoft.com/office/word/2010/wordprocessingShape" xmlns:wpg="http://schemas.microsoft.com/office/word/2010/wordprocessingGroup" xmlns:mc="http://schemas.openxmlformats.org/markup-compatibility/2006" xmlns:wp14="http://schemas.microsoft.com/office/word/2010/wordprocessingDrawing" xmlns:w14="http://schemas.microsoft.com/office/word/2010/wordml" mc:Ignorable="w14 wp14">
+<w:hdr xmlns:wpc="http://schemas.microsoft.com/office/word/2010/wordprocessingCanvas" xmlns:mc="http://schemas.openxmlformats.org/markup-compatibility/2006" xmlns:o="urn:schemas-microsoft-com:office:office" xmlns:r="http://schemas.openxmlformats.org/officeDocument/2006/relationships" xmlns:m="http://schemas.openxmlformats.org/officeDocument/2006/math" xmlns:v="urn:schemas-microsoft-com:vml" xmlns:wp14="http://schemas.microsoft.com/office/word/2010/wordprocessingDrawing" xmlns:wp="http://schemas.openxmlformats.org/drawingml/2006/wordprocessingDrawing" xmlns:w10="urn:schemas-microsoft-com:office:word" xmlns:w="http://schemas.openxmlformats.org/wordprocessingml/2006/main" xmlns:w14="http://schemas.microsoft.com/office/word/2010/wordml" xmlns:w15="http://schemas.microsoft.com/office/word/2012/wordml" xmlns:wpg="http://schemas.microsoft.com/office/word/2010/wordprocessingGroup" xmlns:wpi="http://schemas.microsoft.com/office/word/2010/wordprocessingInk" xmlns:wne="http://schemas.microsoft.com/office/word/2006/wordml" xmlns:wps="http://schemas.microsoft.com/office/word/2010/wordprocessingShape" xmlns:wpsCustomData="http://www.wps.cn/officeDocument/2013/wpsCustomData" mc:Ignorable="w14 w15 wp14">
   <w:p>
     <w:pPr>
-      <w:pStyle w:val="Header"/>
+      <w:pStyle w:val="13"/>
       <w:tabs>
-        <w:tab w:val="left" w:pos="1901" w:leader="none"/>
-        <w:tab w:val="center" w:pos="4680" w:leader="none"/>
-        <w:tab w:val="right" w:pos="9360" w:leader="none"/>
+        <w:tab w:val="left" w:pos="1901"/>
       </w:tabs>
-      <w:rPr/>
+      <w:rPr>
+        <w:color w:val="800000"/>
+      </w:rPr>
     </w:pPr>
     <w:r>
       <w:rPr>
         <w:color w:val="800000"/>
       </w:rPr>
       <w:pict>
-        <v:shapetype id="shapetype_136" coordsize="21600,21600" o:spt="136" adj="10800" path="m@9,l@10,em@11,21600l@12,21600e">
-          <v:stroke joinstyle="miter"/>
-          <v:formulas>
-            <v:f eqn="val #0"/>
-            <v:f eqn="sum @0 0 10800"/>
-            <v:f eqn="sum @0 0 0"/>
-            <v:f eqn="sum width 0 @0"/>
-            <v:f eqn="prod @2 2 1"/>
-            <v:f eqn="prod @3 2 1"/>
-            <v:f eqn="if @1 @5 @4"/>
-            <v:f eqn="sum 0 @6 0"/>
-            <v:f eqn="sum width 0 @6"/>
-            <v:f eqn="if @1 0 @8"/>
-            <v:f eqn="if @1 @7 width"/>
-            <v:f eqn="if @1 @8 0"/>
-            <v:f eqn="if @1 width @7"/>
-          </v:formulas>
-          <v:handles>
-            <v:h position="@0,21600"/>
-          </v:handles>
-        </v:shapetype>
-        <v:shape id="PowerPlusWaterMarkObject3419715" o:spid="shape_0" fillcolor="silver" stroked="f" style="position:absolute;margin-left:25.85pt;margin-top:212.95pt;width:399.65pt;height:144.45pt;rotation:315;mso-position-horizontal:center;mso-position-horizontal-relative:margin;mso-position-vertical:center;mso-position-vertical-relative:margin" type="shapetype_136">
-          <v:path textpathok="t"/>
-          <v:textpath on="t" fitshape="t" string="RACGH" trim="t" style="font-family:&quot;Calibri&quot;;font-size:12pt"/>
-          <w10:wrap type="none"/>
-          <v:fill o:detectmouseclick="t" type="solid" color2="#3f3f3f" opacity="0.5"/>
-          <v:stroke color="#3465a4" joinstyle="round" endcap="flat"/>
+        <v:shape id="PowerPlusWaterMarkObject3419715" o:spid="_x0000_s2049" o:spt="136" type="#_x0000_t136" style="position:absolute;left:0pt;height:144.45pt;width:399.65pt;mso-position-horizontal:center;mso-position-horizontal-relative:margin;mso-position-vertical:center;mso-position-vertical-relative:margin;rotation:20643840f;z-index:251658240;mso-width-relative:page;mso-height-relative:page;" fillcolor="#C0C0C0" filled="t" stroked="f" coordsize="21600,21600">
+          <v:path/>
+          <v:fill on="t" opacity="32768f" focussize="0,0"/>
+          <v:stroke on="f" color="#3465A4" joinstyle="round"/>
+          <v:imagedata o:title=""/>
+          <o:lock v:ext="edit"/>
+          <v:textpath on="f" fitpath="t" trim="t" xscale="f" string="" style="font-size:36pt;v-text-align:center;"/>
         </v:shape>
       </w:pict>
-      <mc:AlternateContent>
-        <mc:Choice Requires="wps">
-          <w:drawing>
-            <wp:anchor behindDoc="1" distT="0" distB="0" distL="114935" distR="114935" simplePos="0" locked="0" layoutInCell="1" allowOverlap="1" relativeHeight="3">
-              <wp:simplePos x="0" y="0"/>
-              <wp:positionH relativeFrom="column">
-                <wp:posOffset>-901700</wp:posOffset>
-              </wp:positionH>
-              <wp:positionV relativeFrom="paragraph">
-                <wp:posOffset>1108075</wp:posOffset>
-              </wp:positionV>
-              <wp:extent cx="7828915" cy="1905"/>
-              <wp:effectExtent l="0" t="0" r="0" b="0"/>
-              <wp:wrapNone/>
-              <wp:docPr id="2" name="_x005F_x0000_s2058"/>
-              <a:graphic xmlns:a="http://schemas.openxmlformats.org/drawingml/2006/main">
-                <a:graphicData uri="http://schemas.microsoft.com/office/word/2010/wordprocessingShape">
-                  <wps:cxnSp>
-                    <wps:nvCxnSpPr>
-                      <wps:cNvPr id="0" name="Line 1"/>
-                      <wps:cNvCxnSpPr/>
-                      <wps:nvPr/>
-                    </wps:nvCxnSpPr>
-                    <wps:spPr>
-                      <a:xfrm>
-                        <a:off x="0" y="0"/>
-                        <a:ext cx="7828200" cy="1800"/>
-                      </a:xfrm>
-                      <a:prstGeom prst="straightConnector1">
-                        <a:avLst/>
-                      </a:prstGeom>
-                      <a:ln w="28440">
-                        <a:solidFill>
-                          <a:srgbClr val="000000"/>
-                        </a:solidFill>
-                        <a:miter/>
-                      </a:ln>
-                    </wps:spPr>
-                    <wps:bodyPr/>
-                  </wps:cxnSp>
-                </a:graphicData>
-              </a:graphic>
-            </wp:anchor>
-          </w:drawing>
-        </mc:Choice>
-        <mc:Fallback>
-          <w:pict>
-            <v:shapetype id="shapetype_32" coordsize="21600,21600" o:spt="32" path="m,l21600,21600nfe">
-              <v:stroke joinstyle="miter"/>
-              <v:path gradientshapeok="t" o:connecttype="rect" textboxrect="0,0,21600,21600"/>
-            </v:shapetype>
-            <v:shape id="shape_0" ID="_x005F_x0000_s2058" stroked="t" style="position:absolute;margin-left:-71.95pt;margin-top:87.25pt;width:616.35pt;height:0.1pt" type="shapetype_32">
-              <v:stroke color="black" weight="28440" joinstyle="miter" endcap="flat"/>
-              <v:fill o:detectmouseclick="t" on="false"/>
-            </v:shape>
-          </w:pict>
-        </mc:Fallback>
-      </mc:AlternateContent>
-      <mc:AlternateContent>
-        <mc:Choice Requires="wps">
-          <w:drawing>
-            <wp:anchor behindDoc="1" distT="0" distB="0" distL="114935" distR="114935" simplePos="0" locked="0" layoutInCell="1" allowOverlap="1" relativeHeight="4">
-              <wp:simplePos x="0" y="0"/>
-              <wp:positionH relativeFrom="column">
-                <wp:posOffset>-901700</wp:posOffset>
-              </wp:positionH>
-              <wp:positionV relativeFrom="paragraph">
-                <wp:posOffset>1677670</wp:posOffset>
-              </wp:positionV>
-              <wp:extent cx="7828915" cy="1905"/>
-              <wp:effectExtent l="0" t="0" r="0" b="0"/>
-              <wp:wrapNone/>
-              <wp:docPr id="3" name="_x005F_x0000_s2060"/>
-              <a:graphic xmlns:a="http://schemas.openxmlformats.org/drawingml/2006/main">
-                <a:graphicData uri="http://schemas.microsoft.com/office/word/2010/wordprocessingShape">
-                  <wps:cxnSp>
-                    <wps:nvCxnSpPr>
-                      <wps:cNvPr id="1" name="Line 1"/>
-                      <wps:cNvCxnSpPr/>
-                      <wps:nvPr/>
-                    </wps:nvCxnSpPr>
-                    <wps:spPr>
-                      <a:xfrm>
-                        <a:off x="0" y="0"/>
-                        <a:ext cx="7828200" cy="1800"/>
-                      </a:xfrm>
-                      <a:prstGeom prst="straightConnector1">
-                        <a:avLst/>
-                      </a:prstGeom>
-                      <a:ln w="28440">
-                        <a:solidFill>
-                          <a:srgbClr val="000000"/>
-                        </a:solidFill>
-                        <a:miter/>
-                      </a:ln>
-                    </wps:spPr>
-                    <wps:bodyPr/>
-                  </wps:cxnSp>
-                </a:graphicData>
-              </a:graphic>
-            </wp:anchor>
-          </w:drawing>
-        </mc:Choice>
-        <mc:Fallback>
-          <w:pict>
-            <v:shape id="shape_0" ID="_x005F_x0000_s2060" stroked="t" style="position:absolute;margin-left:-71.95pt;margin-top:132.1pt;width:616.35pt;height:0.1pt" type="shapetype_32">
-              <v:stroke color="black" weight="28440" joinstyle="miter" endcap="flat"/>
-              <v:fill o:detectmouseclick="t" on="false"/>
-            </v:shape>
-          </w:pict>
-        </mc:Fallback>
-      </mc:AlternateContent>
-      <w:t>H</w:t>
     </w:r>
+  </w:p>
+  <w:p>
+    <w:pPr>
+      <w:pStyle w:val="13"/>
+      <w:tabs>
+        <w:tab w:val="left" w:pos="1901"/>
+      </w:tabs>
+    </w:pPr>
     <w:r>
       <w:rPr>
         <w:color w:val="800000"/>
       </w:rPr>
       <w:tab/>
     </w:r>
+    <w:bookmarkStart w:id="0" w:name="_GoBack"/>
+    <w:bookmarkEnd w:id="0"/>
     <w:r>
       <mc:AlternateContent>
         <mc:Choice Requires="wps">
           <w:drawing>
-            <wp:anchor behindDoc="1" distT="0" distB="0" distL="114935" distR="114935" simplePos="0" locked="0" layoutInCell="1" allowOverlap="1" relativeHeight="5">
+            <wp:anchor distT="0" distB="0" distL="114935" distR="114935" simplePos="0" relativeHeight="1024" behindDoc="1" locked="0" layoutInCell="1" allowOverlap="1">
               <wp:simplePos x="0" y="0"/>
               <wp:positionH relativeFrom="column">
                 <wp:posOffset>-876300</wp:posOffset>
@@ -1130,6 +759,7 @@
               <wp:effectExtent l="0" t="0" r="0" b="0"/>
               <wp:wrapNone/>
               <wp:docPr id="4" name="Frame2"/>
+              <wp:cNvGraphicFramePr/>
               <a:graphic xmlns:a="http://schemas.openxmlformats.org/drawingml/2006/main">
                 <a:graphicData uri="http://schemas.microsoft.com/office/word/2010/wordprocessingShape">
                   <wps:wsp>
@@ -1139,7 +769,9 @@
                         <a:off x="0" y="0"/>
                         <a:ext cx="7444105" cy="522605"/>
                       </a:xfrm>
-                      <a:prstGeom prst="rect"/>
+                      <a:prstGeom prst="rect">
+                        <a:avLst/>
+                      </a:prstGeom>
                       <a:solidFill>
                         <a:srgbClr val="FFFFFF"/>
                       </a:solidFill>
@@ -1153,10 +785,8 @@
                       <w:txbxContent>
                         <w:p>
                           <w:pPr>
-                            <w:pStyle w:val="Normal"/>
                             <w:spacing w:before="0" w:after="200"/>
                             <w:jc w:val="center"/>
-                            <w:rPr/>
                           </w:pPr>
                           <w:r>
                             <w:rPr>
@@ -1418,7 +1048,7 @@
                         </w:p>
                       </w:txbxContent>
                     </wps:txbx>
-                    <wps:bodyPr anchor="t" lIns="91440" tIns="45720" rIns="91440" bIns="45720">
+                    <wps:bodyPr lIns="91440" tIns="45720" rIns="91440" bIns="45720" anchor="t">
                       <a:noAutofit/>
                     </wps:bodyPr>
                   </wps:wsp>
@@ -1429,15 +1059,17 @@
         </mc:Choice>
         <mc:Fallback>
           <w:pict>
-            <v:rect fillcolor="#FFFFFF" strokecolor="#000000" strokeweight="0pt" style="position:absolute;rotation:0;width:586.15pt;height:41.15pt;mso-wrap-distance-left:9.05pt;mso-wrap-distance-right:9.05pt;mso-wrap-distance-top:0pt;mso-wrap-distance-bottom:0pt;margin-top:88.95pt;mso-position-vertical-relative:text;margin-left:-69pt;mso-position-horizontal-relative:text">
+            <v:shape id="Frame2" o:spid="_x0000_s1026" o:spt="202" type="#_x0000_t202" style="position:absolute;left:0pt;margin-left:-69pt;margin-top:88.95pt;height:41.15pt;width:586.15pt;z-index:-503315456;mso-width-relative:page;mso-height-relative:page;" fillcolor="#FFFFFF" filled="t" stroked="t" coordsize="21600,21600" o:gfxdata="UEsDBAoAAAAAAIdO4kAAAAAAAAAAAAAAAAAEAAAAZHJzL1BLAwQUAAAACACHTuJAYySZQdsAAAAN&#10;AQAADwAAAGRycy9kb3ducmV2LnhtbE2PMU/DMBSEdyT+g/WQWFBrJ6mSNMTpgASCjRYEqxu/JhH2&#10;c4jdtPx73AnG053uvqs3Z2vYjJMfHElIlgIYUuv0QJ2E97fHRQnMB0VaGUco4Qc9bJrrq1pV2p1o&#10;i/MudCyWkK+UhD6EseLctz1a5ZduRIrewU1WhSinjutJnWK5NTwVIudWDRQXejXiQ4/t1+5oJZSr&#10;5/nTv2SvH21+MOtwV8xP35OUtzeJuAcW8Bz+wnDBj+jQRKa9O5L2zEhYJFkZz4ToFMUa2CUislUG&#10;bC8hzUUKvKn5/xfNL1BLAwQUAAAACACHTuJA8CrqCsIBAACjAwAADgAAAGRycy9lMm9Eb2MueG1s&#10;rVNRb9sgEH6ftP+AeF/sWHa7WnGqbVWmSdNWqesPwBhiJOAQ0Nj59ztwmqbr21QegOPO39333Xlz&#10;OxtNDsIHBbaj61VJibAcBmX3HX38s/v0mZIQmR2YBis6ehSB3m4/fthMrhUVjKAH4QmC2NBOrqNj&#10;jK4tisBHYVhYgRMWnRK8YRFNvy8GzyZEN7qoyvKqmMAPzgMXIeDr3eKk24wvpeDxt5RBRKI7irXF&#10;vPu892kvthvW7j1zo+KnMth/VGGYspj0DHXHIiNPXr2BMop7CCDjioMpQErFReaAbNblP2weRuZE&#10;5oLiBHeWKbwfLP91uPdEDR2tKbHMYIt2Ho8qKTO50GLAg8OQOH+FGTv8/B7wMRGepTfpRCoE/ajx&#10;8ayrmCPh+Hhd1/W6bCjh6Guq6grvCF+8fO18iN8FGJIuHfXYtywnO/wMcQl9DknJAmg17JTW2fD7&#10;/pv25MCwx7u8TuivwrQlU0dvmqrJyK984RKizOstBJarLVadVFnYp1uc+/kkVQ/DEZXSPyw26GZd&#10;12ngslE31xUa/tLTX3qY5SPgWC6sLXx5iiBVZp6SLMin3DgJWbvT1KZRu7Rz1Mu/tf0LUEsDBAoA&#10;AAAAAIdO4kAAAAAAAAAAAAAAAAAGAAAAX3JlbHMvUEsDBBQAAAAIAIdO4kCKFGY80QAAAJQBAAAL&#10;AAAAX3JlbHMvLnJlbHOlkMFqwzAMhu+DvYPRfXGawxijTi+j0GvpHsDYimMaW0Yy2fr28w6DZfS2&#10;o36h7xP//vCZFrUiS6RsYNf1oDA78jEHA++X49MLKKk2e7tQRgM3FDiMjw/7My62tiOZYxHVKFkM&#10;zLWWV63FzZisdFQwt81EnGxtIwddrLvagHro+2fNvxkwbpjq5A3wyQ+gLrfSzH/YKTomoal2jpKm&#10;aYruHlUHtmWO7sg24Ru5RrMcsBrwLBoHalnXfgR9X7/7p97TRz7jutV+h4zrj1dvuhy/AFBLAwQU&#10;AAAACACHTuJAfublIPcAAADhAQAAEwAAAFtDb250ZW50X1R5cGVzXS54bWyVkUFOwzAQRfdI3MHy&#10;FiVOu0AIJemCtEtAqBxgZE8Si2RseUxob4+TthtEkVjaM/+/J7vcHMZBTBjYOqrkKi+kQNLOWOoq&#10;+b7fZQ9ScAQyMDjCSh6R5aa+vSn3R48sUpq4kn2M/lEp1j2OwLnzSGnSujBCTMfQKQ/6AzpU66K4&#10;V9pRRIpZnDtkXTbYwucQxfaQrk8mAQeW4um0OLMqCd4PVkNMpmoi84OSnQl5Si473FvPd0lDql8J&#10;8+Q64Jx7SU8TrEHxCiE+w5g0lAmsjPuigFP+d8lsOXLm2tZqzJvATYq94XSxutaOa9c4/d/y7ZK6&#10;dKvlg+pvUEsBAhQAFAAAAAgAh07iQH7m5SD3AAAA4QEAABMAAAAAAAAAAQAgAAAANgQAAFtDb250&#10;ZW50X1R5cGVzXS54bWxQSwECFAAKAAAAAACHTuJAAAAAAAAAAAAAAAAABgAAAAAAAAAAABAAAAAY&#10;AwAAX3JlbHMvUEsBAhQAFAAAAAgAh07iQIoUZjzRAAAAlAEAAAsAAAAAAAAAAQAgAAAAPAMAAF9y&#10;ZWxzLy5yZWxzUEsBAhQACgAAAAAAh07iQAAAAAAAAAAAAAAAAAQAAAAAAAAAAAAQAAAAAAAAAGRy&#10;cy9QSwECFAAUAAAACACHTuJAYySZQdsAAAANAQAADwAAAAAAAAABACAAAAAiAAAAZHJzL2Rvd25y&#10;ZXYueG1sUEsBAhQAFAAAAAgAh07iQPAq6grCAQAAowMAAA4AAAAAAAAAAQAgAAAAKgEAAGRycy9l&#10;Mm9Eb2MueG1sUEsFBgAAAAAGAAYAWQEAAF4FAAAAAA==&#10;">
+              <v:fill on="t" focussize="0,0"/>
+              <v:stroke color="#000000" joinstyle="round"/>
+              <v:imagedata o:title=""/>
+              <o:lock v:ext="edit" aspectratio="f"/>
               <v:textbox>
                 <w:txbxContent>
                   <w:p>
                     <w:pPr>
-                      <w:pStyle w:val="Normal"/>
                       <w:spacing w:before="0" w:after="200"/>
                       <w:jc w:val="center"/>
-                      <w:rPr/>
                     </w:pPr>
                     <w:r>
                       <w:rPr>
@@ -1699,7 +1331,7 @@
                   </w:p>
                 </w:txbxContent>
               </v:textbox>
-            </v:rect>
+            </v:shape>
           </w:pict>
         </mc:Fallback>
       </mc:AlternateContent>
@@ -1708,7 +1340,7 @@
       <mc:AlternateContent>
         <mc:Choice Requires="wps">
           <w:drawing>
-            <wp:anchor behindDoc="1" distT="0" distB="0" distL="114935" distR="97790" simplePos="0" locked="0" layoutInCell="1" allowOverlap="1" relativeHeight="8">
+            <wp:anchor distT="0" distB="0" distL="114935" distR="97790" simplePos="0" relativeHeight="1024" behindDoc="1" locked="0" layoutInCell="1" allowOverlap="1">
               <wp:simplePos x="0" y="0"/>
               <wp:positionH relativeFrom="column">
                 <wp:posOffset>1046480</wp:posOffset>
@@ -1720,6 +1352,7 @@
               <wp:effectExtent l="0" t="0" r="17145" b="17145"/>
               <wp:wrapNone/>
               <wp:docPr id="5" name="Frame3"/>
+              <wp:cNvGraphicFramePr/>
               <a:graphic xmlns:a="http://schemas.openxmlformats.org/drawingml/2006/main">
                 <a:graphicData uri="http://schemas.microsoft.com/office/word/2010/wordprocessingShape">
                   <wps:wsp>
@@ -1729,7 +1362,9 @@
                         <a:off x="0" y="0"/>
                         <a:ext cx="3500755" cy="1470025"/>
                       </a:xfrm>
-                      <a:prstGeom prst="rect"/>
+                      <a:prstGeom prst="rect">
+                        <a:avLst/>
+                      </a:prstGeom>
                       <a:solidFill>
                         <a:srgbClr val="800000"/>
                       </a:solidFill>
@@ -1748,7 +1383,6 @@
                       <w:txbxContent>
                         <w:p>
                           <w:pPr>
-                            <w:pStyle w:val="Normal"/>
                             <w:jc w:val="center"/>
                             <w:rPr>
                               <w:sz w:val="48"/>
@@ -1765,7 +1399,6 @@
                         </w:p>
                         <w:p>
                           <w:pPr>
-                            <w:pStyle w:val="Normal"/>
                             <w:jc w:val="center"/>
                             <w:rPr>
                               <w:sz w:val="48"/>
@@ -1782,7 +1415,6 @@
                         </w:p>
                         <w:p>
                           <w:pPr>
-                            <w:pStyle w:val="Normal"/>
                             <w:jc w:val="center"/>
                             <w:rPr>
                               <w:sz w:val="48"/>
@@ -1799,39 +1431,25 @@
                         </w:p>
                         <w:p>
                           <w:pPr>
-                            <w:pStyle w:val="Normal"/>
                             <w:jc w:val="center"/>
                             <w:rPr>
                               <w:sz w:val="48"/>
                               <w:szCs w:val="48"/>
                             </w:rPr>
                           </w:pPr>
-                          <w:r>
-                            <w:rPr>
-                              <w:sz w:val="48"/>
-                              <w:szCs w:val="48"/>
-                            </w:rPr>
-                          </w:r>
                         </w:p>
                         <w:p>
                           <w:pPr>
-                            <w:pStyle w:val="Normal"/>
                             <w:spacing w:before="0" w:after="200"/>
                             <w:rPr>
                               <w:sz w:val="48"/>
                               <w:szCs w:val="48"/>
                             </w:rPr>
                           </w:pPr>
-                          <w:r>
-                            <w:rPr>
-                              <w:sz w:val="48"/>
-                              <w:szCs w:val="48"/>
-                            </w:rPr>
-                          </w:r>
                         </w:p>
                       </w:txbxContent>
                     </wps:txbx>
-                    <wps:bodyPr anchor="t" lIns="91440" tIns="45720" rIns="91440" bIns="45720">
+                    <wps:bodyPr lIns="91440" tIns="45720" rIns="91440" bIns="45720" anchor="t">
                       <a:noAutofit/>
                     </wps:bodyPr>
                   </wps:wsp>
@@ -1842,13 +1460,16 @@
         </mc:Choice>
         <mc:Fallback>
           <w:pict>
-            <v:rect fillcolor="#800000" strokecolor="#F2F2F2" strokeweight="3pt" style="position:absolute;rotation:0;width:275.65pt;height:115.75pt;mso-wrap-distance-left:9.05pt;mso-wrap-distance-right:9.05pt;mso-wrap-distance-top:0pt;mso-wrap-distance-bottom:0pt;margin-top:-29.25pt;mso-position-vertical-relative:text;margin-left:82.4pt;mso-position-horizontal-relative:text">
-              <v:shadow on="t" color="#7F7F7F" offset="1.35pt,1.35pt"/>
+            <v:shape id="Frame3" o:spid="_x0000_s1026" o:spt="202" type="#_x0000_t202" style="position:absolute;left:0pt;margin-left:82.4pt;margin-top:-29.25pt;height:115.75pt;width:275.65pt;z-index:-503315456;mso-width-relative:page;mso-height-relative:page;" fillcolor="#800000" filled="t" stroked="t" coordsize="21600,21600" o:gfxdata="UEsDBAoAAAAAAIdO4kAAAAAAAAAAAAAAAAAEAAAAZHJzL1BLAwQUAAAACACHTuJAZ7vsRdgAAAAL&#10;AQAADwAAAGRycy9kb3ducmV2LnhtbE2PT0/CQBTE7yZ+h80j8QbbKm1J6ZaDiSf1ABj1+Ggf7Yb9&#10;03S3gN/e50mOk5nM/KbaXK0RZxqD9k5BukhAkGt8q12n4GP/Ml+BCBFdi8Y7UvBDATb1/V2FZesv&#10;bkvnXewEl7hQooI+xqGUMjQ9WQwLP5Bj7+hHi5Hl2Ml2xAuXWyMfkySXFrXjhR4Heu6pOe0mq2D5&#10;hRq3++y70e8Uj+bt9fQ5FUo9zNJkDSLSNf6H4Q+f0aFmpoOfXBuEYZ0vGT0qmGerDAQnijRPQRzY&#10;Kp4SkHUlbz/Uv1BLAwQUAAAACACHTuJAdHl2Hu8BAAAPBAAADgAAAGRycy9lMm9Eb2MueG1srVPb&#10;itswEH0v9B+E3htfYjdZE2dpu6QUSlvI9gMUSY4FskZISuz8fUdKNps20IdSG2SNZnTmzJnx6nEa&#10;NDlK5xWYlhaznBJpOAhl9i39+bx5t6TEB2YE02BkS0/S08f12zer0TayhB60kI4giPHNaFvah2Cb&#10;LPO8lwPzM7DSoLMDN7CApttnwrER0QedlXn+PhvBCeuAS+/x9OnspOuE33WSh+9d52UguqXILaTV&#10;pXUX12y9Ys3eMdsrfqHB/oHFwJTBpFeoJxYYOTh1BzUo7sBDF2Ychgy6TnGZasBqivyParY9szLV&#10;guJ4e5XJ/z9Y/u34wxElWlpTYtiALdo4/MyjMqP1DQZsLYaE6SNM2OGXc4+HseCpc0P8YikE/ajx&#10;6aqrnALheDiv83xRYwKOvqJa5HlZR5zs9bp1PnyWMJC4aanDxiU92fGrD+fQl5CYzYNWYqO0Tobb&#10;7z5pR44Mm7zM43NB/y1MGzIil2WB7r9jbMr43mMgX23iVZkmC5lFAw5Bum0vRiJU5F5WxRxlEArH&#10;rMRaI507motNfC8prghJkhvwLHbgrHTchWk3XdqyA3HCrugvBofhoaiqONzJqOpFiYa79exuPczw&#10;HpDbWWADHw4BOpVEjknOyMgkGjh1idPlD4ljfWunqNf/eP0LUEsDBAoAAAAAAIdO4kAAAAAAAAAA&#10;AAAAAAAGAAAAX3JlbHMvUEsDBBQAAAAIAIdO4kCKFGY80QAAAJQBAAALAAAAX3JlbHMvLnJlbHOl&#10;kMFqwzAMhu+DvYPRfXGawxijTi+j0GvpHsDYimMaW0Yy2fr28w6DZfS2o36h7xP//vCZFrUiS6Rs&#10;YNf1oDA78jEHA++X49MLKKk2e7tQRgM3FDiMjw/7My62tiOZYxHVKFkMzLWWV63FzZisdFQwt81E&#10;nGxtIwddrLvagHro+2fNvxkwbpjq5A3wyQ+gLrfSzH/YKTomoal2jpKmaYruHlUHtmWO7sg24Ru5&#10;RrMcsBrwLBoHalnXfgR9X7/7p97TRz7jutV+h4zrj1dvuhy/AFBLAwQUAAAACACHTuJAfublIPcA&#10;AADhAQAAEwAAAFtDb250ZW50X1R5cGVzXS54bWyVkUFOwzAQRfdI3MHyFiVOu0AIJemCtEtAqBxg&#10;ZE8Si2RseUxob4+TthtEkVjaM/+/J7vcHMZBTBjYOqrkKi+kQNLOWOoq+b7fZQ9ScAQyMDjCSh6R&#10;5aa+vSn3R48sUpq4kn2M/lEp1j2OwLnzSGnSujBCTMfQKQ/6AzpU66K4V9pRRIpZnDtkXTbYwucQ&#10;xfaQrk8mAQeW4um0OLMqCd4PVkNMpmoi84OSnQl5Si473FvPd0lDql8J8+Q64Jx7SU8TrEHxCiE+&#10;w5g0lAmsjPuigFP+d8lsOXLm2tZqzJvATYq94XSxutaOa9c4/d/y7ZK6dKvlg+pvUEsBAhQAFAAA&#10;AAgAh07iQH7m5SD3AAAA4QEAABMAAAAAAAAAAQAgAAAAYAQAAFtDb250ZW50X1R5cGVzXS54bWxQ&#10;SwECFAAKAAAAAACHTuJAAAAAAAAAAAAAAAAABgAAAAAAAAAAABAAAABCAwAAX3JlbHMvUEsBAhQA&#10;FAAAAAgAh07iQIoUZjzRAAAAlAEAAAsAAAAAAAAAAQAgAAAAZgMAAF9yZWxzLy5yZWxzUEsBAhQA&#10;CgAAAAAAh07iQAAAAAAAAAAAAAAAAAQAAAAAAAAAAAAQAAAAAAAAAGRycy9QSwECFAAUAAAACACH&#10;TuJAZ7vsRdgAAAALAQAADwAAAAAAAAABACAAAAAiAAAAZHJzL2Rvd25yZXYueG1sUEsBAhQAFAAA&#10;AAgAh07iQHR5dh7vAQAADwQAAA4AAAAAAAAAAQAgAAAAJwEAAGRycy9lMm9Eb2MueG1sUEsFBgAA&#10;AAAGAAYAWQEAAIgFAAAAAA==&#10;">
+              <v:fill on="t" focussize="0,0"/>
+              <v:stroke weight="3pt" color="#F2F2F2" joinstyle="round"/>
+              <v:imagedata o:title=""/>
+              <o:lock v:ext="edit" aspectratio="f"/>
+              <v:shadow on="t" color="#7F7F7F" offset="1.34346456692913pt,1.34346456692913pt" origin="0f,32768f" matrix="65536f,0f,0f,65536f"/>
               <v:textbox>
                 <w:txbxContent>
                   <w:p>
                     <w:pPr>
-                      <w:pStyle w:val="Normal"/>
                       <w:jc w:val="center"/>
                       <w:rPr>
                         <w:sz w:val="48"/>
@@ -1865,7 +1486,6 @@
                   </w:p>
                   <w:p>
                     <w:pPr>
-                      <w:pStyle w:val="Normal"/>
                       <w:jc w:val="center"/>
                       <w:rPr>
                         <w:sz w:val="48"/>
@@ -1882,7 +1502,6 @@
                   </w:p>
                   <w:p>
                     <w:pPr>
-                      <w:pStyle w:val="Normal"/>
                       <w:jc w:val="center"/>
                       <w:rPr>
                         <w:sz w:val="48"/>
@@ -1899,39 +1518,25 @@
                   </w:p>
                   <w:p>
                     <w:pPr>
-                      <w:pStyle w:val="Normal"/>
                       <w:jc w:val="center"/>
                       <w:rPr>
                         <w:sz w:val="48"/>
                         <w:szCs w:val="48"/>
                       </w:rPr>
                     </w:pPr>
-                    <w:r>
-                      <w:rPr>
-                        <w:sz w:val="48"/>
-                        <w:szCs w:val="48"/>
-                      </w:rPr>
-                    </w:r>
                   </w:p>
                   <w:p>
                     <w:pPr>
-                      <w:pStyle w:val="Normal"/>
                       <w:spacing w:before="0" w:after="200"/>
                       <w:rPr>
                         <w:sz w:val="48"/>
                         <w:szCs w:val="48"/>
                       </w:rPr>
                     </w:pPr>
-                    <w:r>
-                      <w:rPr>
-                        <w:sz w:val="48"/>
-                        <w:szCs w:val="48"/>
-                      </w:rPr>
-                    </w:r>
                   </w:p>
                 </w:txbxContent>
               </v:textbox>
-            </v:rect>
+            </v:shape>
           </w:pict>
         </mc:Fallback>
       </mc:AlternateContent>
@@ -1940,7 +1545,7 @@
       <mc:AlternateContent>
         <mc:Choice Requires="wps">
           <w:drawing>
-            <wp:anchor behindDoc="1" distT="0" distB="0" distL="114935" distR="97790" simplePos="0" locked="0" layoutInCell="1" allowOverlap="1" relativeHeight="9">
+            <wp:anchor distT="0" distB="0" distL="114935" distR="97790" simplePos="0" relativeHeight="1024" behindDoc="1" locked="0" layoutInCell="1" allowOverlap="1">
               <wp:simplePos x="0" y="0"/>
               <wp:positionH relativeFrom="column">
                 <wp:posOffset>4511040</wp:posOffset>
@@ -1952,6 +1557,7 @@
               <wp:effectExtent l="0" t="0" r="17145" b="17145"/>
               <wp:wrapNone/>
               <wp:docPr id="6" name="Frame5"/>
+              <wp:cNvGraphicFramePr/>
               <a:graphic xmlns:a="http://schemas.openxmlformats.org/drawingml/2006/main">
                 <a:graphicData uri="http://schemas.microsoft.com/office/word/2010/wordprocessingShape">
                   <wps:wsp>
@@ -1961,7 +1567,9 @@
                         <a:off x="0" y="0"/>
                         <a:ext cx="2110740" cy="1470025"/>
                       </a:xfrm>
-                      <a:prstGeom prst="rect"/>
+                      <a:prstGeom prst="rect">
+                        <a:avLst/>
+                      </a:prstGeom>
                       <a:solidFill>
                         <a:srgbClr val="000000"/>
                       </a:solidFill>
@@ -1980,12 +1588,10 @@
                       <w:txbxContent>
                         <w:p>
                           <w:pPr>
-                            <w:pStyle w:val="Normal"/>
-                            <w:shd w:fill="FFFFFF" w:val="clear"/>
-                            <w:spacing w:lineRule="auto" w:line="240"/>
+                            <w:shd w:val="clear" w:fill="FFFFFF"/>
+                            <w:spacing w:line="240" w:lineRule="auto"/>
                             <w:jc w:val="center"/>
                             <w:rPr>
-                              <w:b/>
                               <w:b/>
                               <w:color w:val="000000"/>
                               <w:sz w:val="24"/>
@@ -2004,12 +1610,10 @@
                         </w:p>
                         <w:p>
                           <w:pPr>
-                            <w:pStyle w:val="Normal"/>
-                            <w:shd w:fill="FFFFFF" w:val="clear"/>
-                            <w:spacing w:lineRule="auto" w:line="240"/>
+                            <w:shd w:val="clear" w:fill="FFFFFF"/>
+                            <w:spacing w:line="240" w:lineRule="auto"/>
                             <w:jc w:val="center"/>
                             <w:rPr>
-                              <w:b/>
                               <w:b/>
                               <w:color w:val="000000"/>
                               <w:sz w:val="24"/>
@@ -2028,12 +1632,10 @@
                         </w:p>
                         <w:p>
                           <w:pPr>
-                            <w:pStyle w:val="Normal"/>
-                            <w:shd w:fill="FFFFFF" w:val="clear"/>
-                            <w:spacing w:lineRule="auto" w:line="240"/>
+                            <w:shd w:val="clear" w:fill="FFFFFF"/>
+                            <w:spacing w:line="240" w:lineRule="auto"/>
                             <w:jc w:val="center"/>
                             <w:rPr>
-                              <w:b/>
                               <w:b/>
                               <w:color w:val="000000"/>
                               <w:sz w:val="24"/>
@@ -2049,28 +1651,18 @@
                         </w:p>
                         <w:p>
                           <w:pPr>
-                            <w:pStyle w:val="Normal"/>
                             <w:spacing w:before="0" w:after="200"/>
                             <w:rPr>
-                              <w:b/>
                               <w:b/>
                               <w:color w:val="FFFFFF"/>
                               <w:sz w:val="24"/>
                               <w:szCs w:val="24"/>
                             </w:rPr>
                           </w:pPr>
-                          <w:r>
-                            <w:rPr>
-                              <w:b/>
-                              <w:color w:val="FFFFFF"/>
-                              <w:sz w:val="24"/>
-                              <w:szCs w:val="24"/>
-                            </w:rPr>
-                          </w:r>
                         </w:p>
                       </w:txbxContent>
                     </wps:txbx>
-                    <wps:bodyPr anchor="t" lIns="91440" tIns="45720" rIns="91440" bIns="45720">
+                    <wps:bodyPr lIns="91440" tIns="45720" rIns="91440" bIns="45720" anchor="t">
                       <a:noAutofit/>
                     </wps:bodyPr>
                   </wps:wsp>
@@ -2081,18 +1673,20 @@
         </mc:Choice>
         <mc:Fallback>
           <w:pict>
-            <v:rect fillcolor="#000000" strokecolor="#F2F2F2" strokeweight="3pt" style="position:absolute;rotation:0;width:166.2pt;height:115.75pt;mso-wrap-distance-left:9.05pt;mso-wrap-distance-right:9.05pt;mso-wrap-distance-top:0pt;mso-wrap-distance-bottom:0pt;margin-top:-29.25pt;mso-position-vertical-relative:text;margin-left:355.2pt;mso-position-horizontal-relative:text">
-              <v:shadow on="t" color="#7F7F7F" offset="1.35pt,1.35pt"/>
+            <v:shape id="Frame5" o:spid="_x0000_s1026" o:spt="202" type="#_x0000_t202" style="position:absolute;left:0pt;margin-left:355.2pt;margin-top:-29.25pt;height:115.75pt;width:166.2pt;z-index:-503315456;mso-width-relative:page;mso-height-relative:page;" fillcolor="#000000" filled="t" stroked="t" coordsize="21600,21600" o:gfxdata="UEsDBAoAAAAAAIdO4kAAAAAAAAAAAAAAAAAEAAAAZHJzL1BLAwQUAAAACACHTuJAOfFcftcAAAAM&#10;AQAADwAAAGRycy9kb3ducmV2LnhtbE2PwW7CMAyG75N4h8hIu0FSBgO6phwmcZ7GEOe0MW1F41RN&#10;Cu3bz5y2my1/+v392WF0rbhjHxpPGpKlAoFUettQpeH8c1zsQIRoyJrWE2qYMMAhn71kJrX+Qd94&#10;P8VKcAiF1GioY+xSKUNZozNh6Tskvl1970zkta+k7c2Dw10rV0q9S2ca4g+16fCzxvJ2GpyG8WLV&#10;11R0ZxpuPrlO494dp73Wr/NEfYCIOMY/GJ76rA45OxV+IBtEq2GbqDWjGhab3QbEk1DrFbcpeNq+&#10;KZB5Jv+XyH8BUEsDBBQAAAAIAIdO4kBZ0KE19AEAAA8EAAAOAAAAZHJzL2Uyb0RvYy54bWytU9tu&#10;2zAMfR+wfxD0vvhSt+mMOMW2IsOAYR2Q7QNkSY4FyKIgKbHz96OUS931ragNyKJIHR4e0quHadDk&#10;IJ1XYBpaLHJKpOEglNk19O+fzad7SnxgRjANRjb0KD19WH/8sBptLUvoQQvpCIIYX4+2oX0Its4y&#10;z3s5ML8AKw06O3ADC2i6XSYcGxF90FmZ53fZCE5YB1x6j6ePJyddJ/yukzw8dZ2XgeiGIreQVpfW&#10;Nq7ZesXqnWO2V/xMg72BxcCUwaRXqEcWGNk79QpqUNyBhy4sOAwZdJ3iMtWA1RT5f9Vse2ZlqgXF&#10;8fYqk38/WP7r8NsRJRp6R4lhA7Zo4/BzG5UZra8xYGsxJExfYcIOX849HsaCp84N8YulEPSjxser&#10;rnIKhONhWRT5skIXR19RLfO8TPjZ83XrfPguYSBx01CHjUt6ssNPH5AKhl5CYjYPWomN0joZbtd+&#10;044cWGxyeiJLvPIiTBsyNvTmvsjzBP3C6ecYmzK+rzEQUZuYUabJQmap8n2QbtuLkQgVuZdVcYO1&#10;CoVjVmKt+JzyzVMsN/E9p4ALQiI9A89iB05Kx12Y2unclhbEEbuifxgchs9FFdUNyahulyUabu5p&#10;5x5meA/I7SSwgS/7AJ1KIsckJ2RkEg2cusTp/IfEsZ7bKer5P17/A1BLAwQKAAAAAACHTuJAAAAA&#10;AAAAAAAAAAAABgAAAF9yZWxzL1BLAwQUAAAACACHTuJAihRmPNEAAACUAQAACwAAAF9yZWxzLy5y&#10;ZWxzpZDBasMwDIbvg72D0X1xmsMYo04vo9Br6R7A2IpjGltGMtn69vMOg2X0tqN+oe8T//7wmRa1&#10;IkukbGDX9aAwO/IxBwPvl+PTCyipNnu7UEYDNxQ4jI8P+zMutrYjmWMR1ShZDMy1lletxc2YrHRU&#10;MLfNRJxsbSMHXay72oB66Ptnzb8ZMG6Y6uQN8MkPoC630sx/2Ck6JqGpdo6SpmmK7h5VB7Zlju7I&#10;NuEbuUazHLAa8CwaB2pZ134EfV+/+6fe00c+47rVfoeM649Xb7ocvwBQSwMEFAAAAAgAh07iQH7m&#10;5SD3AAAA4QEAABMAAABbQ29udGVudF9UeXBlc10ueG1slZFBTsMwEEX3SNzB8hYlTrtACCXpgrRL&#10;QKgcYGRPEotkbHlMaG+Pk7YbRJFY2jP/vye73BzGQUwY2Dqq5CovpEDSzljqKvm+32UPUnAEMjA4&#10;wkoekeWmvr0p90ePLFKauJJ9jP5RKdY9jsC580hp0rowQkzH0CkP+gM6VOuiuFfaUUSKWZw7ZF02&#10;2MLnEMX2kK5PJgEHluLptDizKgneD1ZDTKZqIvODkp0JeUouO9xbz3dJQ6pfCfPkOuCce0lPE6xB&#10;8QohPsOYNJQJrIz7ooBT/nfJbDly5trWasybwE2KveF0sbrWjmvXOP3f8u2SunSr5YPqb1BLAQIU&#10;ABQAAAAIAIdO4kB+5uUg9wAAAOEBAAATAAAAAAAAAAEAIAAAAGQEAABbQ29udGVudF9UeXBlc10u&#10;eG1sUEsBAhQACgAAAAAAh07iQAAAAAAAAAAAAAAAAAYAAAAAAAAAAAAQAAAARgMAAF9yZWxzL1BL&#10;AQIUABQAAAAIAIdO4kCKFGY80QAAAJQBAAALAAAAAAAAAAEAIAAAAGoDAABfcmVscy8ucmVsc1BL&#10;AQIUAAoAAAAAAIdO4kAAAAAAAAAAAAAAAAAEAAAAAAAAAAAAEAAAAAAAAABkcnMvUEsBAhQAFAAA&#10;AAgAh07iQDnxXH7XAAAADAEAAA8AAAAAAAAAAQAgAAAAIgAAAGRycy9kb3ducmV2LnhtbFBLAQIU&#10;ABQAAAAIAIdO4kBZ0KE19AEAAA8EAAAOAAAAAAAAAAEAIAAAACYBAABkcnMvZTJvRG9jLnhtbFBL&#10;BQYAAAAABgAGAFkBAACMBQAAAAA=&#10;">
+              <v:fill on="t" focussize="0,0"/>
+              <v:stroke weight="3pt" color="#F2F2F2" joinstyle="round"/>
+              <v:imagedata o:title=""/>
+              <o:lock v:ext="edit" aspectratio="f"/>
+              <v:shadow on="t" color="#7F7F7F" offset="1.34346456692913pt,1.34346456692913pt" origin="0f,32768f" matrix="65536f,0f,0f,65536f"/>
               <v:textbox>
                 <w:txbxContent>
                   <w:p>
                     <w:pPr>
-                      <w:pStyle w:val="Normal"/>
-                      <w:shd w:fill="FFFFFF" w:val="clear"/>
-                      <w:spacing w:lineRule="auto" w:line="240"/>
+                      <w:shd w:val="clear" w:fill="FFFFFF"/>
+                      <w:spacing w:line="240" w:lineRule="auto"/>
                       <w:jc w:val="center"/>
                       <w:rPr>
-                        <w:b/>
                         <w:b/>
                         <w:color w:val="000000"/>
                         <w:sz w:val="24"/>
@@ -2111,12 +1705,10 @@
                   </w:p>
                   <w:p>
                     <w:pPr>
-                      <w:pStyle w:val="Normal"/>
-                      <w:shd w:fill="FFFFFF" w:val="clear"/>
-                      <w:spacing w:lineRule="auto" w:line="240"/>
+                      <w:shd w:val="clear" w:fill="FFFFFF"/>
+                      <w:spacing w:line="240" w:lineRule="auto"/>
                       <w:jc w:val="center"/>
                       <w:rPr>
-                        <w:b/>
                         <w:b/>
                         <w:color w:val="000000"/>
                         <w:sz w:val="24"/>
@@ -2135,12 +1727,10 @@
                   </w:p>
                   <w:p>
                     <w:pPr>
-                      <w:pStyle w:val="Normal"/>
-                      <w:shd w:fill="FFFFFF" w:val="clear"/>
-                      <w:spacing w:lineRule="auto" w:line="240"/>
+                      <w:shd w:val="clear" w:fill="FFFFFF"/>
+                      <w:spacing w:line="240" w:lineRule="auto"/>
                       <w:jc w:val="center"/>
                       <w:rPr>
-                        <w:b/>
                         <w:b/>
                         <w:color w:val="000000"/>
                         <w:sz w:val="24"/>
@@ -2156,28 +1746,18 @@
                   </w:p>
                   <w:p>
                     <w:pPr>
-                      <w:pStyle w:val="Normal"/>
                       <w:spacing w:before="0" w:after="200"/>
                       <w:rPr>
-                        <w:b/>
                         <w:b/>
                         <w:color w:val="FFFFFF"/>
                         <w:sz w:val="24"/>
                         <w:szCs w:val="24"/>
                       </w:rPr>
                     </w:pPr>
-                    <w:r>
-                      <w:rPr>
-                        <w:b/>
-                        <w:color w:val="FFFFFF"/>
-                        <w:sz w:val="24"/>
-                        <w:szCs w:val="24"/>
-                      </w:rPr>
-                    </w:r>
                   </w:p>
                 </w:txbxContent>
               </v:textbox>
-            </v:rect>
+            </v:shape>
           </w:pict>
         </mc:Fallback>
       </mc:AlternateContent>
@@ -2186,7 +1766,7 @@
       <mc:AlternateContent>
         <mc:Choice Requires="wps">
           <w:drawing>
-            <wp:anchor behindDoc="1" distT="0" distB="0" distL="114935" distR="97790" simplePos="0" locked="0" layoutInCell="1" allowOverlap="1" relativeHeight="10">
+            <wp:anchor distT="0" distB="0" distL="114935" distR="97790" simplePos="0" relativeHeight="1024" behindDoc="1" locked="0" layoutInCell="1" allowOverlap="1">
               <wp:simplePos x="0" y="0"/>
               <wp:positionH relativeFrom="column">
                 <wp:posOffset>-908685</wp:posOffset>
@@ -2198,6 +1778,7 @@
               <wp:effectExtent l="0" t="0" r="17145" b="17145"/>
               <wp:wrapNone/>
               <wp:docPr id="7" name="Frame4"/>
+              <wp:cNvGraphicFramePr/>
               <a:graphic xmlns:a="http://schemas.openxmlformats.org/drawingml/2006/main">
                 <a:graphicData uri="http://schemas.microsoft.com/office/word/2010/wordprocessingShape">
                   <wps:wsp>
@@ -2207,7 +1788,9 @@
                         <a:off x="0" y="0"/>
                         <a:ext cx="2025650" cy="1470025"/>
                       </a:xfrm>
-                      <a:prstGeom prst="rect"/>
+                      <a:prstGeom prst="rect">
+                        <a:avLst/>
+                      </a:prstGeom>
                       <a:solidFill>
                         <a:srgbClr val="000000"/>
                       </a:solidFill>
@@ -2226,19 +1809,16 @@
                       <w:txbxContent>
                         <w:p>
                           <w:pPr>
-                            <w:pStyle w:val="Normal"/>
                             <w:widowControl/>
                             <w:bidi w:val="0"/>
-                            <w:spacing w:lineRule="auto" w:line="276" w:before="0" w:after="200"/>
-                            <w:rPr/>
+                            <w:spacing w:before="0" w:after="200" w:line="276" w:lineRule="auto"/>
                           </w:pPr>
                           <w:r>
-                            <w:rPr/>
                             <w:drawing>
                               <wp:inline distT="0" distB="0" distL="0" distR="0">
                                 <wp:extent cx="1127125" cy="1096645"/>
                                 <wp:effectExtent l="0" t="0" r="0" b="0"/>
-                                <wp:docPr id="8" name="Picture 1" descr="" title=""/>
+                                <wp:docPr id="8" name="Picture 1"/>
                                 <wp:cNvGraphicFramePr>
                                   <a:graphicFrameLocks xmlns:a="http://schemas.openxmlformats.org/drawingml/2006/main" noChangeAspect="1"/>
                                 </wp:cNvGraphicFramePr>
@@ -2246,7 +1826,7 @@
                                   <a:graphicData uri="http://schemas.openxmlformats.org/drawingml/2006/picture">
                                     <pic:pic xmlns:pic="http://schemas.openxmlformats.org/drawingml/2006/picture">
                                       <pic:nvPicPr>
-                                        <pic:cNvPr id="8" name="Picture 1" descr="" title=""/>
+                                        <pic:cNvPr id="8" name="Picture 1"/>
                                         <pic:cNvPicPr>
                                           <a:picLocks noChangeAspect="1" noChangeArrowheads="1"/>
                                         </pic:cNvPicPr>
@@ -2258,7 +1838,7 @@
                                           <a:fillRect/>
                                         </a:stretch>
                                       </pic:blipFill>
-                                      <pic:spPr bwMode="auto">
+                                      <pic:spPr>
                                         <a:xfrm>
                                           <a:off x="0" y="0"/>
                                           <a:ext cx="1127125" cy="1096645"/>
@@ -2276,7 +1856,7 @@
                         </w:p>
                       </w:txbxContent>
                     </wps:txbx>
-                    <wps:bodyPr anchor="t" lIns="91440" tIns="45720" rIns="91440" bIns="45720">
+                    <wps:bodyPr lIns="91440" tIns="45720" rIns="91440" bIns="45720" anchor="t">
                       <a:noAutofit/>
                     </wps:bodyPr>
                   </wps:wsp>
@@ -2287,25 +1867,26 @@
         </mc:Choice>
         <mc:Fallback>
           <w:pict>
-            <v:rect fillcolor="#000000" strokecolor="#F2F2F2" strokeweight="3pt" style="position:absolute;rotation:0;width:159.5pt;height:115.75pt;mso-wrap-distance-left:9.05pt;mso-wrap-distance-right:9.05pt;mso-wrap-distance-top:0pt;mso-wrap-distance-bottom:0pt;margin-top:-29.25pt;mso-position-vertical-relative:text;margin-left:-71.55pt;mso-position-horizontal-relative:text">
-              <v:shadow on="t" color="#7F7F7F" offset="1.35pt,1.35pt"/>
+            <v:shape id="Frame4" o:spid="_x0000_s1026" o:spt="202" type="#_x0000_t202" style="position:absolute;left:0pt;margin-left:-71.55pt;margin-top:-29.25pt;height:115.75pt;width:159.5pt;z-index:-503315456;mso-width-relative:page;mso-height-relative:page;" fillcolor="#000000" filled="t" stroked="t" coordsize="21600,21600" o:gfxdata="UEsDBAoAAAAAAIdO4kAAAAAAAAAAAAAAAAAEAAAAZHJzL1BLAwQUAAAACACHTuJACb+2MdYAAAAM&#10;AQAADwAAAGRycy9kb3ducmV2LnhtbE2PwW6DMAyG75P2DpEr7dYmWcdWKKGHST1P66qeA3EBlTiI&#10;hBbefuG03X7Ln35/zg+T7dgdB986UiA3AhhS5UxLtYLzz3G9A+aDJqM7R6hgRg+H4vkp15lxD/rG&#10;+ynULJaQz7SCJoQ+49xXDVrtN65HirurG6wOcRxqbgb9iOW2469CvHOrW4oXGt3jZ4PV7TRaBdPF&#10;iK+57M803py8zlNqj3Oq1MtKij2wgFP4g2HRj+pQRKfSjWQ86xSs5dtWRjamZJcAW5CPJAVWLmEr&#10;gBc5//9E8QtQSwMEFAAAAAgAh07iQNiwZyPxAQAADwQAAA4AAABkcnMvZTJvRG9jLnhtbK1T247b&#10;IBB9r9R/QLw3vqyz2VpxVm1XqSpV3UppP4AAjpEwg4DEzt93wEnW232raiTMMOMzZ86M149jr8lJ&#10;Oq/ANLRY5JRIw0Eoc2jo71/bDw+U+MCMYBqMbOhZevq4ef9uPdhaltCBFtIRBDG+HmxDuxBsnWWe&#10;d7JnfgFWGnS24HoW0HSHTDg2IHqvszLP77MBnLAOuPQeb58mJ90k/LaVPDy3rZeB6IYit5B2l/Z9&#10;3LPNmtUHx2yn+IUG+wcWPVMGk96gnlhg5OjUG6hecQce2rDg0GfQtorLVANWU+R/VbPrmJWpFhTH&#10;25tM/v/B8h+nn44o0dAVJYb12KKtw1cVlRmsrzFgZzEkjJ9hxA5f7z1exoLH1vXxjaUQ9KPG55uu&#10;cgyE42WZl8v7Jbo4+opqlaMdcbKXz63z4auEnsRDQx02LunJTt99mEKvITGbB63EVmmdDHfYf9GO&#10;nFhscnou6K/CtCFDQ+8eijxP0K+cfo6xLeN6i4F8tYkZZZosZJYqPwbpdp0YiFCRe1kVd1irUDhm&#10;JdaKz5RvnmK1jeuSAq4ISZIZeBY7MCkdT2Hcj5e27EGcsSv6m8Fh+FhUVRzuZFTLVYmGm3v2cw8z&#10;vAPkNgls4NMxQKuSyDHJhIxMooFTlzhd/pA41nM7Rb38x5s/UEsDBAoAAAAAAIdO4kAAAAAAAAAA&#10;AAAAAAAGAAAAX3JlbHMvUEsDBBQAAAAIAIdO4kCKFGY80QAAAJQBAAALAAAAX3JlbHMvLnJlbHOl&#10;kMFqwzAMhu+DvYPRfXGawxijTi+j0GvpHsDYimMaW0Yy2fr28w6DZfS2o36h7xP//vCZFrUiS6Rs&#10;YNf1oDA78jEHA++X49MLKKk2e7tQRgM3FDiMjw/7My62tiOZYxHVKFkMzLWWV63FzZisdFQwt81E&#10;nGxtIwddrLvagHro+2fNvxkwbpjq5A3wyQ+gLrfSzH/YKTomoal2jpKmaYruHlUHtmWO7sg24Ru5&#10;RrMcsBrwLBoHalnXfgR9X7/7p97TRz7jutV+h4zrj1dvuhy/AFBLAwQUAAAACACHTuJAfublIPcA&#10;AADhAQAAEwAAAFtDb250ZW50X1R5cGVzXS54bWyVkUFOwzAQRfdI3MHyFiVOu0AIJemCtEtAqBxg&#10;ZE8Si2RseUxob4+TthtEkVjaM/+/J7vcHMZBTBjYOqrkKi+kQNLOWOoq+b7fZQ9ScAQyMDjCSh6R&#10;5aa+vSn3R48sUpq4kn2M/lEp1j2OwLnzSGnSujBCTMfQKQ/6AzpU66K4V9pRRIpZnDtkXTbYwucQ&#10;xfaQrk8mAQeW4um0OLMqCd4PVkNMpmoi84OSnQl5Si473FvPd0lDql8J8+Q64Jx7SU8TrEHxCiE+&#10;w5g0lAmsjPuigFP+d8lsOXLm2tZqzJvATYq94XSxutaOa9c4/d/y7ZK6dKvlg+pvUEsBAhQAFAAA&#10;AAgAh07iQH7m5SD3AAAA4QEAABMAAAAAAAAAAQAgAAAAYAQAAFtDb250ZW50X1R5cGVzXS54bWxQ&#10;SwECFAAKAAAAAACHTuJAAAAAAAAAAAAAAAAABgAAAAAAAAAAABAAAABCAwAAX3JlbHMvUEsBAhQA&#10;FAAAAAgAh07iQIoUZjzRAAAAlAEAAAsAAAAAAAAAAQAgAAAAZgMAAF9yZWxzLy5yZWxzUEsBAhQA&#10;CgAAAAAAh07iQAAAAAAAAAAAAAAAAAQAAAAAAAAAAAAQAAAAAAAAAGRycy9QSwECFAAUAAAACACH&#10;TuJACb+2MdYAAAAMAQAADwAAAAAAAAABACAAAAAiAAAAZHJzL2Rvd25yZXYueG1sUEsBAhQAFAAA&#10;AAgAh07iQNiwZyPxAQAADwQAAA4AAAAAAAAAAQAgAAAAJQEAAGRycy9lMm9Eb2MueG1sUEsFBgAA&#10;AAAGAAYAWQEAAIgFAAAAAA==&#10;">
+              <v:fill on="t" focussize="0,0"/>
+              <v:stroke weight="3pt" color="#F2F2F2" joinstyle="round"/>
+              <v:imagedata o:title=""/>
+              <o:lock v:ext="edit" aspectratio="f"/>
+              <v:shadow on="t" color="#7F7F7F" offset="1.34346456692913pt,1.34346456692913pt" origin="0f,32768f" matrix="65536f,0f,0f,65536f"/>
               <v:textbox>
                 <w:txbxContent>
                   <w:p>
                     <w:pPr>
-                      <w:pStyle w:val="Normal"/>
                       <w:widowControl/>
                       <w:bidi w:val="0"/>
-                      <w:spacing w:lineRule="auto" w:line="276" w:before="0" w:after="200"/>
-                      <w:rPr/>
+                      <w:spacing w:before="0" w:after="200" w:line="276" w:lineRule="auto"/>
                     </w:pPr>
                     <w:r>
-                      <w:rPr/>
                       <w:drawing>
                         <wp:inline distT="0" distB="0" distL="0" distR="0">
                           <wp:extent cx="1127125" cy="1096645"/>
                           <wp:effectExtent l="0" t="0" r="0" b="0"/>
-                          <wp:docPr id="9" name="Picture 1" descr="" title=""/>
+                          <wp:docPr id="8" name="Picture 1"/>
                           <wp:cNvGraphicFramePr>
                             <a:graphicFrameLocks xmlns:a="http://schemas.openxmlformats.org/drawingml/2006/main" noChangeAspect="1"/>
                           </wp:cNvGraphicFramePr>
@@ -2313,7 +1894,7 @@
                             <a:graphicData uri="http://schemas.openxmlformats.org/drawingml/2006/picture">
                               <pic:pic xmlns:pic="http://schemas.openxmlformats.org/drawingml/2006/picture">
                                 <pic:nvPicPr>
-                                  <pic:cNvPr id="9" name="Picture 1" descr="" title=""/>
+                                  <pic:cNvPr id="8" name="Picture 1"/>
                                   <pic:cNvPicPr>
                                     <a:picLocks noChangeAspect="1" noChangeArrowheads="1"/>
                                   </pic:cNvPicPr>
@@ -2325,7 +1906,7 @@
                                     <a:fillRect/>
                                   </a:stretch>
                                 </pic:blipFill>
-                                <pic:spPr bwMode="auto">
+                                <pic:spPr>
                                   <a:xfrm>
                                     <a:off x="0" y="0"/>
                                     <a:ext cx="1127125" cy="1096645"/>
@@ -2343,7 +1924,7 @@
                   </w:p>
                 </w:txbxContent>
               </v:textbox>
-            </v:rect>
+            </v:shape>
           </w:pict>
         </mc:Fallback>
       </mc:AlternateContent>
@@ -2353,162 +1934,409 @@
 </file>
 
 <file path=word/numbering.xml><?xml version="1.0" encoding="utf-8"?>
-<w:numbering xmlns:w="http://schemas.openxmlformats.org/wordprocessingml/2006/main" xmlns:o="urn:schemas-microsoft-com:office:office" xmlns:r="http://schemas.openxmlformats.org/officeDocument/2006/relationships" xmlns:v="urn:schemas-microsoft-com:vml">
-  <w:abstractNum w:abstractNumId="1">
-    <w:lvl w:ilvl="0">
+<w:numbering xmlns:wpc="http://schemas.microsoft.com/office/word/2010/wordprocessingCanvas" xmlns:mc="http://schemas.openxmlformats.org/markup-compatibility/2006" xmlns:o="urn:schemas-microsoft-com:office:office" xmlns:r="http://schemas.openxmlformats.org/officeDocument/2006/relationships" xmlns:m="http://schemas.openxmlformats.org/officeDocument/2006/math" xmlns:v="urn:schemas-microsoft-com:vml" xmlns:wp14="http://schemas.microsoft.com/office/word/2010/wordprocessingDrawing" xmlns:wp="http://schemas.openxmlformats.org/drawingml/2006/wordprocessingDrawing" xmlns:w10="urn:schemas-microsoft-com:office:word" xmlns:w="http://schemas.openxmlformats.org/wordprocessingml/2006/main" xmlns:w14="http://schemas.microsoft.com/office/word/2010/wordml" xmlns:wpg="http://schemas.microsoft.com/office/word/2010/wordprocessingGroup" xmlns:wpi="http://schemas.microsoft.com/office/word/2010/wordprocessingInk" xmlns:wne="http://schemas.microsoft.com/office/word/2006/wordml" xmlns:wps="http://schemas.microsoft.com/office/word/2010/wordprocessingShape" mc:Ignorable="w14 wp14">
+  <w:abstractNum w:abstractNumId="1757307390">
+    <w:nsid w:val="68BE61FE"/>
+    <w:multiLevelType w:val="multilevel"/>
+    <w:tmpl w:val="68BE61FE"/>
+    <w:lvl w:ilvl="0" w:tentative="1">
       <w:start w:val="1"/>
-      <w:pStyle w:val="Heading1"/>
       <w:numFmt w:val="none"/>
+      <w:pStyle w:val="2"/>
       <w:suff w:val="nothing"/>
       <w:lvlText w:val=""/>
-      <w:lvlJc w:val="start"/>
+      <w:lvlJc w:val="left"/>
       <w:pPr>
         <w:tabs>
-          <w:tab w:val="num" w:pos="0"/>
+          <w:tab w:val="left" w:pos="0"/>
         </w:tabs>
-        <w:ind w:start="0" w:hanging="0"/>
+        <w:ind w:firstLine="0"/>
       </w:pPr>
     </w:lvl>
-    <w:lvl w:ilvl="1">
+    <w:lvl w:ilvl="1" w:tentative="1">
       <w:start w:val="1"/>
-      <w:pStyle w:val="Heading2"/>
       <w:numFmt w:val="none"/>
+      <w:pStyle w:val="3"/>
       <w:suff w:val="nothing"/>
       <w:lvlText w:val=""/>
-      <w:lvlJc w:val="start"/>
+      <w:lvlJc w:val="left"/>
       <w:pPr>
         <w:tabs>
-          <w:tab w:val="num" w:pos="0"/>
+          <w:tab w:val="left" w:pos="0"/>
         </w:tabs>
-        <w:ind w:start="0" w:hanging="0"/>
+        <w:ind w:firstLine="0"/>
       </w:pPr>
     </w:lvl>
-    <w:lvl w:ilvl="2">
+    <w:lvl w:ilvl="2" w:tentative="1">
       <w:start w:val="1"/>
-      <w:pStyle w:val="Heading3"/>
       <w:numFmt w:val="none"/>
+      <w:pStyle w:val="4"/>
       <w:suff w:val="nothing"/>
       <w:lvlText w:val=""/>
-      <w:lvlJc w:val="start"/>
+      <w:lvlJc w:val="left"/>
       <w:pPr>
         <w:tabs>
-          <w:tab w:val="num" w:pos="0"/>
+          <w:tab w:val="left" w:pos="0"/>
         </w:tabs>
-        <w:ind w:start="0" w:hanging="0"/>
+        <w:ind w:firstLine="0"/>
       </w:pPr>
     </w:lvl>
-    <w:lvl w:ilvl="3">
+    <w:lvl w:ilvl="3" w:tentative="1">
       <w:start w:val="1"/>
-      <w:pStyle w:val="Heading4"/>
       <w:numFmt w:val="none"/>
+      <w:pStyle w:val="5"/>
       <w:suff w:val="nothing"/>
       <w:lvlText w:val=""/>
-      <w:lvlJc w:val="start"/>
+      <w:lvlJc w:val="left"/>
       <w:pPr>
         <w:tabs>
-          <w:tab w:val="num" w:pos="0"/>
+          <w:tab w:val="left" w:pos="0"/>
         </w:tabs>
-        <w:ind w:start="0" w:hanging="0"/>
+        <w:ind w:firstLine="0"/>
       </w:pPr>
     </w:lvl>
-    <w:lvl w:ilvl="4">
+    <w:lvl w:ilvl="4" w:tentative="1">
       <w:start w:val="1"/>
-      <w:pStyle w:val="Heading5"/>
       <w:numFmt w:val="none"/>
+      <w:pStyle w:val="6"/>
       <w:suff w:val="nothing"/>
       <w:lvlText w:val=""/>
-      <w:lvlJc w:val="start"/>
+      <w:lvlJc w:val="left"/>
       <w:pPr>
         <w:tabs>
-          <w:tab w:val="num" w:pos="0"/>
+          <w:tab w:val="left" w:pos="0"/>
         </w:tabs>
-        <w:ind w:start="0" w:hanging="0"/>
+        <w:ind w:firstLine="0"/>
       </w:pPr>
     </w:lvl>
-    <w:lvl w:ilvl="5">
+    <w:lvl w:ilvl="5" w:tentative="1">
       <w:start w:val="1"/>
-      <w:pStyle w:val="Heading6"/>
       <w:numFmt w:val="none"/>
+      <w:pStyle w:val="7"/>
       <w:suff w:val="nothing"/>
       <w:lvlText w:val=""/>
-      <w:lvlJc w:val="start"/>
+      <w:lvlJc w:val="left"/>
       <w:pPr>
         <w:tabs>
-          <w:tab w:val="num" w:pos="0"/>
+          <w:tab w:val="left" w:pos="0"/>
         </w:tabs>
-        <w:ind w:start="0" w:hanging="0"/>
+        <w:ind w:firstLine="0"/>
       </w:pPr>
     </w:lvl>
-    <w:lvl w:ilvl="6">
+    <w:lvl w:ilvl="6" w:tentative="1">
       <w:start w:val="1"/>
       <w:numFmt w:val="none"/>
       <w:suff w:val="nothing"/>
       <w:lvlText w:val=""/>
-      <w:lvlJc w:val="start"/>
+      <w:lvlJc w:val="left"/>
       <w:pPr>
         <w:tabs>
-          <w:tab w:val="num" w:pos="0"/>
+          <w:tab w:val="left" w:pos="0"/>
         </w:tabs>
-        <w:ind w:start="0" w:hanging="0"/>
+        <w:ind w:firstLine="0"/>
       </w:pPr>
     </w:lvl>
-    <w:lvl w:ilvl="7">
+    <w:lvl w:ilvl="7" w:tentative="1">
       <w:start w:val="1"/>
       <w:numFmt w:val="none"/>
       <w:suff w:val="nothing"/>
       <w:lvlText w:val=""/>
-      <w:lvlJc w:val="start"/>
+      <w:lvlJc w:val="left"/>
       <w:pPr>
         <w:tabs>
-          <w:tab w:val="num" w:pos="0"/>
+          <w:tab w:val="left" w:pos="0"/>
         </w:tabs>
-        <w:ind w:start="0" w:hanging="0"/>
+        <w:ind w:firstLine="0"/>
       </w:pPr>
     </w:lvl>
-    <w:lvl w:ilvl="8">
+    <w:lvl w:ilvl="8" w:tentative="1">
       <w:start w:val="1"/>
       <w:numFmt w:val="none"/>
       <w:suff w:val="nothing"/>
       <w:lvlText w:val=""/>
-      <w:lvlJc w:val="start"/>
+      <w:lvlJc w:val="left"/>
       <w:pPr>
         <w:tabs>
-          <w:tab w:val="num" w:pos="0"/>
+          <w:tab w:val="left" w:pos="0"/>
         </w:tabs>
-        <w:ind w:start="0" w:hanging="0"/>
+        <w:ind w:firstLine="0"/>
       </w:pPr>
     </w:lvl>
   </w:abstractNum>
   <w:num w:numId="1">
-    <w:abstractNumId w:val="1"/>
+    <w:abstractNumId w:val="1757307390"/>
   </w:num>
 </w:numbering>
 </file>
 
 <file path=word/styles.xml><?xml version="1.0" encoding="utf-8"?>
-<w:styles xmlns:w="http://schemas.openxmlformats.org/wordprocessingml/2006/main" xmlns:w14="http://schemas.microsoft.com/office/word/2010/wordml" xmlns:mc="http://schemas.openxmlformats.org/markup-compatibility/2006" mc:Ignorable="w14">
+<w:styles xmlns:mc="http://schemas.openxmlformats.org/markup-compatibility/2006" xmlns:o="urn:schemas-microsoft-com:office:office" xmlns:r="http://schemas.openxmlformats.org/officeDocument/2006/relationships" xmlns:m="http://schemas.openxmlformats.org/officeDocument/2006/math" xmlns:v="urn:schemas-microsoft-com:vml" xmlns:w="http://schemas.openxmlformats.org/wordprocessingml/2006/main" xmlns:w14="http://schemas.microsoft.com/office/word/2010/wordml" xmlns:w10="urn:schemas-microsoft-com:office:word" xmlns:sl="http://schemas.openxmlformats.org/schemaLibrary/2006/main" mc:Ignorable="w14">
   <w:docDefaults>
     <w:rPrDefault>
       <w:rPr>
         <w:rFonts w:ascii="Liberation Serif" w:hAnsi="Liberation Serif" w:eastAsia="Noto Serif CJK SC" w:cs="Lohit Devanagari"/>
-        <w:sz w:val="24"/>
-        <w:szCs w:val="24"/>
-        <w:lang w:val="en-IN" w:eastAsia="zh-CN" w:bidi="hi-IN"/>
       </w:rPr>
     </w:rPrDefault>
-    <w:pPrDefault>
-      <w:pPr>
-        <w:suppressAutoHyphens w:val="true"/>
-      </w:pPr>
-    </w:pPrDefault>
   </w:docDefaults>
-  <w:style w:type="paragraph" w:styleId="Normal">
+  <w:latentStyles w:count="260" w:defQFormat="0" w:defUnhideWhenUsed="1" w:defSemiHidden="1" w:defUIPriority="99" w:defLockedState="0">
+    <w:lsdException w:qFormat="1" w:unhideWhenUsed="0" w:uiPriority="0" w:semiHidden="0" w:name="Normal"/>
+    <w:lsdException w:qFormat="1" w:unhideWhenUsed="0" w:uiPriority="0" w:semiHidden="0" w:name="heading 1"/>
+    <w:lsdException w:qFormat="1" w:unhideWhenUsed="0" w:uiPriority="0" w:semiHidden="0" w:name="heading 2"/>
+    <w:lsdException w:qFormat="1" w:unhideWhenUsed="0" w:uiPriority="0" w:semiHidden="0" w:name="heading 3"/>
+    <w:lsdException w:qFormat="1" w:unhideWhenUsed="0" w:uiPriority="0" w:semiHidden="0" w:name="heading 4"/>
+    <w:lsdException w:qFormat="1" w:unhideWhenUsed="0" w:uiPriority="0" w:semiHidden="0" w:name="heading 5"/>
+    <w:lsdException w:qFormat="1" w:unhideWhenUsed="0" w:uiPriority="0" w:semiHidden="0" w:name="heading 6"/>
+    <w:lsdException w:qFormat="1" w:uiPriority="0" w:name="heading 7"/>
+    <w:lsdException w:qFormat="1" w:uiPriority="0" w:name="heading 8"/>
+    <w:lsdException w:qFormat="1" w:uiPriority="0" w:name="heading 9"/>
+    <w:lsdException w:unhideWhenUsed="0" w:uiPriority="0" w:semiHidden="0" w:name="index 1"/>
+    <w:lsdException w:unhideWhenUsed="0" w:uiPriority="0" w:semiHidden="0" w:name="index 2"/>
+    <w:lsdException w:unhideWhenUsed="0" w:uiPriority="0" w:semiHidden="0" w:name="index 3"/>
+    <w:lsdException w:unhideWhenUsed="0" w:uiPriority="0" w:semiHidden="0" w:name="index 4"/>
+    <w:lsdException w:unhideWhenUsed="0" w:uiPriority="0" w:semiHidden="0" w:name="index 5"/>
+    <w:lsdException w:unhideWhenUsed="0" w:uiPriority="0" w:semiHidden="0" w:name="index 6"/>
+    <w:lsdException w:unhideWhenUsed="0" w:uiPriority="0" w:semiHidden="0" w:name="index 7"/>
+    <w:lsdException w:unhideWhenUsed="0" w:uiPriority="0" w:semiHidden="0" w:name="index 8"/>
+    <w:lsdException w:unhideWhenUsed="0" w:uiPriority="0" w:semiHidden="0" w:name="index 9"/>
+    <w:lsdException w:unhideWhenUsed="0" w:uiPriority="0" w:semiHidden="0" w:name="toc 1"/>
+    <w:lsdException w:unhideWhenUsed="0" w:uiPriority="0" w:semiHidden="0" w:name="toc 2"/>
+    <w:lsdException w:unhideWhenUsed="0" w:uiPriority="0" w:semiHidden="0" w:name="toc 3"/>
+    <w:lsdException w:unhideWhenUsed="0" w:uiPriority="0" w:semiHidden="0" w:name="toc 4"/>
+    <w:lsdException w:unhideWhenUsed="0" w:uiPriority="0" w:semiHidden="0" w:name="toc 5"/>
+    <w:lsdException w:unhideWhenUsed="0" w:uiPriority="0" w:semiHidden="0" w:name="toc 6"/>
+    <w:lsdException w:unhideWhenUsed="0" w:uiPriority="0" w:semiHidden="0" w:name="toc 7"/>
+    <w:lsdException w:unhideWhenUsed="0" w:uiPriority="0" w:semiHidden="0" w:name="toc 8"/>
+    <w:lsdException w:unhideWhenUsed="0" w:uiPriority="0" w:semiHidden="0" w:name="toc 9"/>
+    <w:lsdException w:unhideWhenUsed="0" w:uiPriority="0" w:semiHidden="0" w:name="Normal Indent"/>
+    <w:lsdException w:unhideWhenUsed="0" w:uiPriority="0" w:semiHidden="0" w:name="footnote text"/>
+    <w:lsdException w:unhideWhenUsed="0" w:uiPriority="0" w:semiHidden="0" w:name="annotation text"/>
+    <w:lsdException w:unhideWhenUsed="0" w:uiPriority="0" w:semiHidden="0" w:name="header"/>
+    <w:lsdException w:unhideWhenUsed="0" w:uiPriority="0" w:semiHidden="0" w:name="footer"/>
+    <w:lsdException w:unhideWhenUsed="0" w:uiPriority="0" w:semiHidden="0" w:name="index heading"/>
+    <w:lsdException w:qFormat="1" w:unhideWhenUsed="0" w:uiPriority="0" w:semiHidden="0" w:name="caption"/>
+    <w:lsdException w:unhideWhenUsed="0" w:uiPriority="0" w:semiHidden="0" w:name="table of figures"/>
+    <w:lsdException w:unhideWhenUsed="0" w:uiPriority="0" w:semiHidden="0" w:name="envelope address"/>
+    <w:lsdException w:unhideWhenUsed="0" w:uiPriority="0" w:semiHidden="0" w:name="envelope return"/>
+    <w:lsdException w:unhideWhenUsed="0" w:uiPriority="0" w:semiHidden="0" w:name="footnote reference"/>
+    <w:lsdException w:unhideWhenUsed="0" w:uiPriority="0" w:semiHidden="0" w:name="annotation reference"/>
+    <w:lsdException w:unhideWhenUsed="0" w:uiPriority="0" w:semiHidden="0" w:name="line number"/>
+    <w:lsdException w:unhideWhenUsed="0" w:uiPriority="0" w:semiHidden="0" w:name="page number"/>
+    <w:lsdException w:unhideWhenUsed="0" w:uiPriority="0" w:semiHidden="0" w:name="endnote reference"/>
+    <w:lsdException w:unhideWhenUsed="0" w:uiPriority="0" w:semiHidden="0" w:name="endnote text"/>
+    <w:lsdException w:unhideWhenUsed="0" w:uiPriority="0" w:semiHidden="0" w:name="table of authorities"/>
+    <w:lsdException w:unhideWhenUsed="0" w:uiPriority="0" w:semiHidden="0" w:name="macro"/>
+    <w:lsdException w:unhideWhenUsed="0" w:uiPriority="0" w:semiHidden="0" w:name="toa heading"/>
+    <w:lsdException w:unhideWhenUsed="0" w:uiPriority="0" w:semiHidden="0" w:name="List"/>
+    <w:lsdException w:unhideWhenUsed="0" w:uiPriority="0" w:semiHidden="0" w:name="List Bullet"/>
+    <w:lsdException w:unhideWhenUsed="0" w:uiPriority="0" w:semiHidden="0" w:name="List Number"/>
+    <w:lsdException w:unhideWhenUsed="0" w:uiPriority="0" w:semiHidden="0" w:name="List 2"/>
+    <w:lsdException w:unhideWhenUsed="0" w:uiPriority="0" w:semiHidden="0" w:name="List 3"/>
+    <w:lsdException w:unhideWhenUsed="0" w:uiPriority="0" w:semiHidden="0" w:name="List 4"/>
+    <w:lsdException w:unhideWhenUsed="0" w:uiPriority="0" w:semiHidden="0" w:name="List 5"/>
+    <w:lsdException w:unhideWhenUsed="0" w:uiPriority="0" w:semiHidden="0" w:name="List Bullet 2"/>
+    <w:lsdException w:unhideWhenUsed="0" w:uiPriority="0" w:semiHidden="0" w:name="List Bullet 3"/>
+    <w:lsdException w:unhideWhenUsed="0" w:uiPriority="0" w:semiHidden="0" w:name="List Bullet 4"/>
+    <w:lsdException w:unhideWhenUsed="0" w:uiPriority="0" w:semiHidden="0" w:name="List Bullet 5"/>
+    <w:lsdException w:unhideWhenUsed="0" w:uiPriority="0" w:semiHidden="0" w:name="List Number 2"/>
+    <w:lsdException w:unhideWhenUsed="0" w:uiPriority="0" w:semiHidden="0" w:name="List Number 3"/>
+    <w:lsdException w:unhideWhenUsed="0" w:uiPriority="0" w:semiHidden="0" w:name="List Number 4"/>
+    <w:lsdException w:unhideWhenUsed="0" w:uiPriority="0" w:semiHidden="0" w:name="List Number 5"/>
+    <w:lsdException w:qFormat="1" w:unhideWhenUsed="0" w:uiPriority="0" w:semiHidden="0" w:name="Title"/>
+    <w:lsdException w:unhideWhenUsed="0" w:uiPriority="0" w:semiHidden="0" w:name="Closing"/>
+    <w:lsdException w:unhideWhenUsed="0" w:uiPriority="0" w:semiHidden="0" w:name="Signature"/>
+    <w:lsdException w:qFormat="1" w:unhideWhenUsed="0" w:uiPriority="0" w:semiHidden="0" w:name="Default Paragraph Font"/>
+    <w:lsdException w:unhideWhenUsed="0" w:uiPriority="0" w:semiHidden="0" w:name="Body Text"/>
+    <w:lsdException w:unhideWhenUsed="0" w:uiPriority="0" w:semiHidden="0" w:name="Body Text Indent"/>
+    <w:lsdException w:unhideWhenUsed="0" w:uiPriority="0" w:semiHidden="0" w:name="List Continue"/>
+    <w:lsdException w:unhideWhenUsed="0" w:uiPriority="0" w:semiHidden="0" w:name="List Continue 2"/>
+    <w:lsdException w:unhideWhenUsed="0" w:uiPriority="0" w:semiHidden="0" w:name="List Continue 3"/>
+    <w:lsdException w:unhideWhenUsed="0" w:uiPriority="0" w:semiHidden="0" w:name="List Continue 4"/>
+    <w:lsdException w:unhideWhenUsed="0" w:uiPriority="0" w:semiHidden="0" w:name="List Continue 5"/>
+    <w:lsdException w:unhideWhenUsed="0" w:uiPriority="0" w:semiHidden="0" w:name="Message Header"/>
+    <w:lsdException w:qFormat="1" w:unhideWhenUsed="0" w:uiPriority="0" w:semiHidden="0" w:name="Subtitle"/>
+    <w:lsdException w:unhideWhenUsed="0" w:uiPriority="0" w:semiHidden="0" w:name="Salutation"/>
+    <w:lsdException w:unhideWhenUsed="0" w:uiPriority="0" w:semiHidden="0" w:name="Date"/>
+    <w:lsdException w:unhideWhenUsed="0" w:uiPriority="0" w:semiHidden="0" w:name="Body Text First Indent"/>
+    <w:lsdException w:unhideWhenUsed="0" w:uiPriority="0" w:semiHidden="0" w:name="Body Text First Indent 2"/>
+    <w:lsdException w:unhideWhenUsed="0" w:uiPriority="0" w:semiHidden="0" w:name="Note Heading"/>
+    <w:lsdException w:qFormat="1" w:unhideWhenUsed="0" w:uiPriority="0" w:semiHidden="0" w:name="Body Text 2"/>
+    <w:lsdException w:unhideWhenUsed="0" w:uiPriority="0" w:semiHidden="0" w:name="Body Text 3"/>
+    <w:lsdException w:unhideWhenUsed="0" w:uiPriority="0" w:semiHidden="0" w:name="Body Text Indent 2"/>
+    <w:lsdException w:unhideWhenUsed="0" w:uiPriority="0" w:semiHidden="0" w:name="Body Text Indent 3"/>
+    <w:lsdException w:unhideWhenUsed="0" w:uiPriority="0" w:semiHidden="0" w:name="Block Text"/>
+    <w:lsdException w:unhideWhenUsed="0" w:uiPriority="0" w:semiHidden="0" w:name="Hyperlink"/>
+    <w:lsdException w:unhideWhenUsed="0" w:uiPriority="0" w:semiHidden="0" w:name="FollowedHyperlink"/>
+    <w:lsdException w:qFormat="1" w:unhideWhenUsed="0" w:uiPriority="0" w:semiHidden="0" w:name="Strong"/>
+    <w:lsdException w:qFormat="1" w:unhideWhenUsed="0" w:uiPriority="0" w:semiHidden="0" w:name="Emphasis"/>
+    <w:lsdException w:unhideWhenUsed="0" w:uiPriority="0" w:semiHidden="0" w:name="Document Map"/>
+    <w:lsdException w:unhideWhenUsed="0" w:uiPriority="0" w:semiHidden="0" w:name="Plain Text"/>
+    <w:lsdException w:unhideWhenUsed="0" w:uiPriority="0" w:semiHidden="0" w:name="E-mail Signature"/>
+    <w:lsdException w:qFormat="1" w:unhideWhenUsed="0" w:uiPriority="0" w:semiHidden="0" w:name="Normal (Web)"/>
+    <w:lsdException w:unhideWhenUsed="0" w:uiPriority="0" w:semiHidden="0" w:name="HTML Acronym"/>
+    <w:lsdException w:unhideWhenUsed="0" w:uiPriority="0" w:semiHidden="0" w:name="HTML Address"/>
+    <w:lsdException w:unhideWhenUsed="0" w:uiPriority="0" w:semiHidden="0" w:name="HTML Cite"/>
+    <w:lsdException w:unhideWhenUsed="0" w:uiPriority="0" w:semiHidden="0" w:name="HTML Code"/>
+    <w:lsdException w:unhideWhenUsed="0" w:uiPriority="0" w:semiHidden="0" w:name="HTML Definition"/>
+    <w:lsdException w:unhideWhenUsed="0" w:uiPriority="0" w:semiHidden="0" w:name="HTML Keyboard"/>
+    <w:lsdException w:unhideWhenUsed="0" w:uiPriority="0" w:semiHidden="0" w:name="HTML Preformatted"/>
+    <w:lsdException w:unhideWhenUsed="0" w:uiPriority="0" w:semiHidden="0" w:name="HTML Sample"/>
+    <w:lsdException w:unhideWhenUsed="0" w:uiPriority="0" w:semiHidden="0" w:name="HTML Typewriter"/>
+    <w:lsdException w:unhideWhenUsed="0" w:uiPriority="0" w:semiHidden="0" w:name="HTML Variable"/>
+    <w:lsdException w:unhideWhenUsed="0" w:uiPriority="0" w:name="Normal Table"/>
+    <w:lsdException w:unhideWhenUsed="0" w:uiPriority="0" w:semiHidden="0" w:name="annotation subject"/>
+    <w:lsdException w:unhideWhenUsed="0" w:uiPriority="0" w:semiHidden="0" w:name="Table Simple 1"/>
+    <w:lsdException w:unhideWhenUsed="0" w:uiPriority="0" w:semiHidden="0" w:name="Table Simple 2"/>
+    <w:lsdException w:unhideWhenUsed="0" w:uiPriority="0" w:semiHidden="0" w:name="Table Simple 3"/>
+    <w:lsdException w:unhideWhenUsed="0" w:uiPriority="0" w:semiHidden="0" w:name="Table Classic 1"/>
+    <w:lsdException w:unhideWhenUsed="0" w:uiPriority="0" w:semiHidden="0" w:name="Table Classic 2"/>
+    <w:lsdException w:unhideWhenUsed="0" w:uiPriority="0" w:semiHidden="0" w:name="Table Classic 3"/>
+    <w:lsdException w:unhideWhenUsed="0" w:uiPriority="0" w:semiHidden="0" w:name="Table Classic 4"/>
+    <w:lsdException w:unhideWhenUsed="0" w:uiPriority="0" w:semiHidden="0" w:name="Table Colorful 1"/>
+    <w:lsdException w:unhideWhenUsed="0" w:uiPriority="0" w:semiHidden="0" w:name="Table Colorful 2"/>
+    <w:lsdException w:unhideWhenUsed="0" w:uiPriority="0" w:semiHidden="0" w:name="Table Colorful 3"/>
+    <w:lsdException w:unhideWhenUsed="0" w:uiPriority="0" w:semiHidden="0" w:name="Table Columns 1"/>
+    <w:lsdException w:unhideWhenUsed="0" w:uiPriority="0" w:semiHidden="0" w:name="Table Columns 2"/>
+    <w:lsdException w:unhideWhenUsed="0" w:uiPriority="0" w:semiHidden="0" w:name="Table Columns 3"/>
+    <w:lsdException w:unhideWhenUsed="0" w:uiPriority="0" w:semiHidden="0" w:name="Table Columns 4"/>
+    <w:lsdException w:unhideWhenUsed="0" w:uiPriority="0" w:semiHidden="0" w:name="Table Columns 5"/>
+    <w:lsdException w:unhideWhenUsed="0" w:uiPriority="0" w:semiHidden="0" w:name="Table Grid 1"/>
+    <w:lsdException w:unhideWhenUsed="0" w:uiPriority="0" w:semiHidden="0" w:name="Table Grid 2"/>
+    <w:lsdException w:unhideWhenUsed="0" w:uiPriority="0" w:semiHidden="0" w:name="Table Grid 3"/>
+    <w:lsdException w:unhideWhenUsed="0" w:uiPriority="0" w:semiHidden="0" w:name="Table Grid 4"/>
+    <w:lsdException w:unhideWhenUsed="0" w:uiPriority="0" w:semiHidden="0" w:name="Table Grid 5"/>
+    <w:lsdException w:unhideWhenUsed="0" w:uiPriority="0" w:semiHidden="0" w:name="Table Grid 6"/>
+    <w:lsdException w:unhideWhenUsed="0" w:uiPriority="0" w:semiHidden="0" w:name="Table Grid 7"/>
+    <w:lsdException w:unhideWhenUsed="0" w:uiPriority="0" w:semiHidden="0" w:name="Table Grid 8"/>
+    <w:lsdException w:unhideWhenUsed="0" w:uiPriority="0" w:semiHidden="0" w:name="Table List 1"/>
+    <w:lsdException w:unhideWhenUsed="0" w:uiPriority="0" w:semiHidden="0" w:name="Table List 2"/>
+    <w:lsdException w:unhideWhenUsed="0" w:uiPriority="0" w:semiHidden="0" w:name="Table List 3"/>
+    <w:lsdException w:unhideWhenUsed="0" w:uiPriority="0" w:semiHidden="0" w:name="Table List 4"/>
+    <w:lsdException w:unhideWhenUsed="0" w:uiPriority="0" w:semiHidden="0" w:name="Table List 5"/>
+    <w:lsdException w:unhideWhenUsed="0" w:uiPriority="0" w:semiHidden="0" w:name="Table List 6"/>
+    <w:lsdException w:unhideWhenUsed="0" w:uiPriority="0" w:semiHidden="0" w:name="Table List 7"/>
+    <w:lsdException w:unhideWhenUsed="0" w:uiPriority="0" w:semiHidden="0" w:name="Table List 8"/>
+    <w:lsdException w:unhideWhenUsed="0" w:uiPriority="0" w:semiHidden="0" w:name="Table 3D effects 1"/>
+    <w:lsdException w:unhideWhenUsed="0" w:uiPriority="0" w:semiHidden="0" w:name="Table 3D effects 2"/>
+    <w:lsdException w:unhideWhenUsed="0" w:uiPriority="0" w:semiHidden="0" w:name="Table 3D effects 3"/>
+    <w:lsdException w:unhideWhenUsed="0" w:uiPriority="0" w:semiHidden="0" w:name="Table Contemporary"/>
+    <w:lsdException w:unhideWhenUsed="0" w:uiPriority="0" w:semiHidden="0" w:name="Table Elegant"/>
+    <w:lsdException w:unhideWhenUsed="0" w:uiPriority="0" w:semiHidden="0" w:name="Table Professional"/>
+    <w:lsdException w:unhideWhenUsed="0" w:uiPriority="0" w:semiHidden="0" w:name="Table Subtle 1"/>
+    <w:lsdException w:unhideWhenUsed="0" w:uiPriority="0" w:semiHidden="0" w:name="Table Subtle 2"/>
+    <w:lsdException w:unhideWhenUsed="0" w:uiPriority="0" w:semiHidden="0" w:name="Table Web 1"/>
+    <w:lsdException w:unhideWhenUsed="0" w:uiPriority="0" w:semiHidden="0" w:name="Table Web 2"/>
+    <w:lsdException w:unhideWhenUsed="0" w:uiPriority="0" w:semiHidden="0" w:name="Table Web 3"/>
+    <w:lsdException w:qFormat="1" w:unhideWhenUsed="0" w:uiPriority="0" w:semiHidden="0" w:name="Balloon Text"/>
+    <w:lsdException w:unhideWhenUsed="0" w:uiPriority="0" w:semiHidden="0" w:name="Table Grid"/>
+    <w:lsdException w:unhideWhenUsed="0" w:uiPriority="0" w:semiHidden="0" w:name="Table Theme"/>
+    <w:lsdException w:unhideWhenUsed="0" w:uiPriority="60" w:semiHidden="0" w:name="Light Shading"/>
+    <w:lsdException w:unhideWhenUsed="0" w:uiPriority="61" w:semiHidden="0" w:name="Light List"/>
+    <w:lsdException w:unhideWhenUsed="0" w:uiPriority="62" w:semiHidden="0" w:name="Light Grid"/>
+    <w:lsdException w:unhideWhenUsed="0" w:uiPriority="63" w:semiHidden="0" w:name="Medium Shading 1"/>
+    <w:lsdException w:unhideWhenUsed="0" w:uiPriority="64" w:semiHidden="0" w:name="Medium Shading 2"/>
+    <w:lsdException w:unhideWhenUsed="0" w:uiPriority="65" w:semiHidden="0" w:name="Medium List 1"/>
+    <w:lsdException w:unhideWhenUsed="0" w:uiPriority="66" w:semiHidden="0" w:name="Medium List 2"/>
+    <w:lsdException w:unhideWhenUsed="0" w:uiPriority="67" w:semiHidden="0" w:name="Medium Grid 1"/>
+    <w:lsdException w:unhideWhenUsed="0" w:uiPriority="68" w:semiHidden="0" w:name="Medium Grid 2"/>
+    <w:lsdException w:unhideWhenUsed="0" w:uiPriority="69" w:semiHidden="0" w:name="Medium Grid 3"/>
+    <w:lsdException w:unhideWhenUsed="0" w:uiPriority="70" w:semiHidden="0" w:name="Dark List"/>
+    <w:lsdException w:unhideWhenUsed="0" w:uiPriority="71" w:semiHidden="0" w:name="Colorful Shading"/>
+    <w:lsdException w:unhideWhenUsed="0" w:uiPriority="72" w:semiHidden="0" w:name="Colorful List"/>
+    <w:lsdException w:unhideWhenUsed="0" w:uiPriority="73" w:semiHidden="0" w:name="Colorful Grid"/>
+    <w:lsdException w:unhideWhenUsed="0" w:uiPriority="60" w:semiHidden="0" w:name="Light Shading Accent 1"/>
+    <w:lsdException w:unhideWhenUsed="0" w:uiPriority="61" w:semiHidden="0" w:name="Light List Accent 1"/>
+    <w:lsdException w:unhideWhenUsed="0" w:uiPriority="62" w:semiHidden="0" w:name="Light Grid Accent 1"/>
+    <w:lsdException w:unhideWhenUsed="0" w:uiPriority="63" w:semiHidden="0" w:name="Medium Shading 1 Accent 1"/>
+    <w:lsdException w:unhideWhenUsed="0" w:uiPriority="64" w:semiHidden="0" w:name="Medium Shading 2 Accent 1"/>
+    <w:lsdException w:unhideWhenUsed="0" w:uiPriority="65" w:semiHidden="0" w:name="Medium List 1 Accent 1"/>
+    <w:lsdException w:unhideWhenUsed="0" w:uiPriority="66" w:semiHidden="0" w:name="Medium List 2 Accent 1"/>
+    <w:lsdException w:unhideWhenUsed="0" w:uiPriority="67" w:semiHidden="0" w:name="Medium Grid 1 Accent 1"/>
+    <w:lsdException w:unhideWhenUsed="0" w:uiPriority="68" w:semiHidden="0" w:name="Medium Grid 2 Accent 1"/>
+    <w:lsdException w:unhideWhenUsed="0" w:uiPriority="69" w:semiHidden="0" w:name="Medium Grid 3 Accent 1"/>
+    <w:lsdException w:unhideWhenUsed="0" w:uiPriority="70" w:semiHidden="0" w:name="Dark List Accent 1"/>
+    <w:lsdException w:unhideWhenUsed="0" w:uiPriority="71" w:semiHidden="0" w:name="Colorful Shading Accent 1"/>
+    <w:lsdException w:unhideWhenUsed="0" w:uiPriority="72" w:semiHidden="0" w:name="Colorful List Accent 1"/>
+    <w:lsdException w:unhideWhenUsed="0" w:uiPriority="73" w:semiHidden="0" w:name="Colorful Grid Accent 1"/>
+    <w:lsdException w:unhideWhenUsed="0" w:uiPriority="60" w:semiHidden="0" w:name="Light Shading Accent 2"/>
+    <w:lsdException w:unhideWhenUsed="0" w:uiPriority="61" w:semiHidden="0" w:name="Light List Accent 2"/>
+    <w:lsdException w:unhideWhenUsed="0" w:uiPriority="62" w:semiHidden="0" w:name="Light Grid Accent 2"/>
+    <w:lsdException w:unhideWhenUsed="0" w:uiPriority="63" w:semiHidden="0" w:name="Medium Shading 1 Accent 2"/>
+    <w:lsdException w:unhideWhenUsed="0" w:uiPriority="64" w:semiHidden="0" w:name="Medium Shading 2 Accent 2"/>
+    <w:lsdException w:unhideWhenUsed="0" w:uiPriority="65" w:semiHidden="0" w:name="Medium List 1 Accent 2"/>
+    <w:lsdException w:unhideWhenUsed="0" w:uiPriority="66" w:semiHidden="0" w:name="Medium List 2 Accent 2"/>
+    <w:lsdException w:unhideWhenUsed="0" w:uiPriority="67" w:semiHidden="0" w:name="Medium Grid 1 Accent 2"/>
+    <w:lsdException w:unhideWhenUsed="0" w:uiPriority="68" w:semiHidden="0" w:name="Medium Grid 2 Accent 2"/>
+    <w:lsdException w:unhideWhenUsed="0" w:uiPriority="69" w:semiHidden="0" w:name="Medium Grid 3 Accent 2"/>
+    <w:lsdException w:unhideWhenUsed="0" w:uiPriority="70" w:semiHidden="0" w:name="Dark List Accent 2"/>
+    <w:lsdException w:unhideWhenUsed="0" w:uiPriority="71" w:semiHidden="0" w:name="Colorful Shading Accent 2"/>
+    <w:lsdException w:unhideWhenUsed="0" w:uiPriority="72" w:semiHidden="0" w:name="Colorful List Accent 2"/>
+    <w:lsdException w:unhideWhenUsed="0" w:uiPriority="73" w:semiHidden="0" w:name="Colorful Grid Accent 2"/>
+    <w:lsdException w:unhideWhenUsed="0" w:uiPriority="60" w:semiHidden="0" w:name="Light Shading Accent 3"/>
+    <w:lsdException w:unhideWhenUsed="0" w:uiPriority="61" w:semiHidden="0" w:name="Light List Accent 3"/>
+    <w:lsdException w:unhideWhenUsed="0" w:uiPriority="62" w:semiHidden="0" w:name="Light Grid Accent 3"/>
+    <w:lsdException w:unhideWhenUsed="0" w:uiPriority="63" w:semiHidden="0" w:name="Medium Shading 1 Accent 3"/>
+    <w:lsdException w:unhideWhenUsed="0" w:uiPriority="64" w:semiHidden="0" w:name="Medium Shading 2 Accent 3"/>
+    <w:lsdException w:unhideWhenUsed="0" w:uiPriority="65" w:semiHidden="0" w:name="Medium List 1 Accent 3"/>
+    <w:lsdException w:unhideWhenUsed="0" w:uiPriority="66" w:semiHidden="0" w:name="Medium List 2 Accent 3"/>
+    <w:lsdException w:unhideWhenUsed="0" w:uiPriority="67" w:semiHidden="0" w:name="Medium Grid 1 Accent 3"/>
+    <w:lsdException w:unhideWhenUsed="0" w:uiPriority="68" w:semiHidden="0" w:name="Medium Grid 2 Accent 3"/>
+    <w:lsdException w:unhideWhenUsed="0" w:uiPriority="69" w:semiHidden="0" w:name="Medium Grid 3 Accent 3"/>
+    <w:lsdException w:unhideWhenUsed="0" w:uiPriority="70" w:semiHidden="0" w:name="Dark List Accent 3"/>
+    <w:lsdException w:unhideWhenUsed="0" w:uiPriority="71" w:semiHidden="0" w:name="Colorful Shading Accent 3"/>
+    <w:lsdException w:unhideWhenUsed="0" w:uiPriority="72" w:semiHidden="0" w:name="Colorful List Accent 3"/>
+    <w:lsdException w:unhideWhenUsed="0" w:uiPriority="73" w:semiHidden="0" w:name="Colorful Grid Accent 3"/>
+    <w:lsdException w:unhideWhenUsed="0" w:uiPriority="60" w:semiHidden="0" w:name="Light Shading Accent 4"/>
+    <w:lsdException w:unhideWhenUsed="0" w:uiPriority="61" w:semiHidden="0" w:name="Light List Accent 4"/>
+    <w:lsdException w:unhideWhenUsed="0" w:uiPriority="62" w:semiHidden="0" w:name="Light Grid Accent 4"/>
+    <w:lsdException w:unhideWhenUsed="0" w:uiPriority="63" w:semiHidden="0" w:name="Medium Shading 1 Accent 4"/>
+    <w:lsdException w:unhideWhenUsed="0" w:uiPriority="64" w:semiHidden="0" w:name="Medium Shading 2 Accent 4"/>
+    <w:lsdException w:unhideWhenUsed="0" w:uiPriority="65" w:semiHidden="0" w:name="Medium List 1 Accent 4"/>
+    <w:lsdException w:unhideWhenUsed="0" w:uiPriority="66" w:semiHidden="0" w:name="Medium List 2 Accent 4"/>
+    <w:lsdException w:unhideWhenUsed="0" w:uiPriority="67" w:semiHidden="0" w:name="Medium Grid 1 Accent 4"/>
+    <w:lsdException w:unhideWhenUsed="0" w:uiPriority="68" w:semiHidden="0" w:name="Medium Grid 2 Accent 4"/>
+    <w:lsdException w:unhideWhenUsed="0" w:uiPriority="69" w:semiHidden="0" w:name="Medium Grid 3 Accent 4"/>
+    <w:lsdException w:unhideWhenUsed="0" w:uiPriority="70" w:semiHidden="0" w:name="Dark List Accent 4"/>
+    <w:lsdException w:unhideWhenUsed="0" w:uiPriority="71" w:semiHidden="0" w:name="Colorful Shading Accent 4"/>
+    <w:lsdException w:unhideWhenUsed="0" w:uiPriority="72" w:semiHidden="0" w:name="Colorful List Accent 4"/>
+    <w:lsdException w:unhideWhenUsed="0" w:uiPriority="73" w:semiHidden="0" w:name="Colorful Grid Accent 4"/>
+    <w:lsdException w:unhideWhenUsed="0" w:uiPriority="60" w:semiHidden="0" w:name="Light Shading Accent 5"/>
+    <w:lsdException w:unhideWhenUsed="0" w:uiPriority="61" w:semiHidden="0" w:name="Light List Accent 5"/>
+    <w:lsdException w:unhideWhenUsed="0" w:uiPriority="62" w:semiHidden="0" w:name="Light Grid Accent 5"/>
+    <w:lsdException w:unhideWhenUsed="0" w:uiPriority="63" w:semiHidden="0" w:name="Medium Shading 1 Accent 5"/>
+    <w:lsdException w:unhideWhenUsed="0" w:uiPriority="64" w:semiHidden="0" w:name="Medium Shading 2 Accent 5"/>
+    <w:lsdException w:unhideWhenUsed="0" w:uiPriority="65" w:semiHidden="0" w:name="Medium List 1 Accent 5"/>
+    <w:lsdException w:unhideWhenUsed="0" w:uiPriority="66" w:semiHidden="0" w:name="Medium List 2 Accent 5"/>
+    <w:lsdException w:unhideWhenUsed="0" w:uiPriority="67" w:semiHidden="0" w:name="Medium Grid 1 Accent 5"/>
+    <w:lsdException w:unhideWhenUsed="0" w:uiPriority="68" w:semiHidden="0" w:name="Medium Grid 2 Accent 5"/>
+    <w:lsdException w:unhideWhenUsed="0" w:uiPriority="69" w:semiHidden="0" w:name="Medium Grid 3 Accent 5"/>
+    <w:lsdException w:unhideWhenUsed="0" w:uiPriority="70" w:semiHidden="0" w:name="Dark List Accent 5"/>
+    <w:lsdException w:unhideWhenUsed="0" w:uiPriority="71" w:semiHidden="0" w:name="Colorful Shading Accent 5"/>
+    <w:lsdException w:unhideWhenUsed="0" w:uiPriority="72" w:semiHidden="0" w:name="Colorful List Accent 5"/>
+    <w:lsdException w:unhideWhenUsed="0" w:uiPriority="73" w:semiHidden="0" w:name="Colorful Grid Accent 5"/>
+    <w:lsdException w:unhideWhenUsed="0" w:uiPriority="60" w:semiHidden="0" w:name="Light Shading Accent 6"/>
+    <w:lsdException w:unhideWhenUsed="0" w:uiPriority="61" w:semiHidden="0" w:name="Light List Accent 6"/>
+    <w:lsdException w:unhideWhenUsed="0" w:uiPriority="62" w:semiHidden="0" w:name="Light Grid Accent 6"/>
+    <w:lsdException w:unhideWhenUsed="0" w:uiPriority="63" w:semiHidden="0" w:name="Medium Shading 1 Accent 6"/>
+    <w:lsdException w:unhideWhenUsed="0" w:uiPriority="64" w:semiHidden="0" w:name="Medium Shading 2 Accent 6"/>
+    <w:lsdException w:unhideWhenUsed="0" w:uiPriority="65" w:semiHidden="0" w:name="Medium List 1 Accent 6"/>
+    <w:lsdException w:unhideWhenUsed="0" w:uiPriority="66" w:semiHidden="0" w:name="Medium List 2 Accent 6"/>
+    <w:lsdException w:unhideWhenUsed="0" w:uiPriority="67" w:semiHidden="0" w:name="Medium Grid 1 Accent 6"/>
+    <w:lsdException w:unhideWhenUsed="0" w:uiPriority="68" w:semiHidden="0" w:name="Medium Grid 2 Accent 6"/>
+    <w:lsdException w:unhideWhenUsed="0" w:uiPriority="69" w:semiHidden="0" w:name="Medium Grid 3 Accent 6"/>
+    <w:lsdException w:unhideWhenUsed="0" w:uiPriority="70" w:semiHidden="0" w:name="Dark List Accent 6"/>
+    <w:lsdException w:unhideWhenUsed="0" w:uiPriority="71" w:semiHidden="0" w:name="Colorful Shading Accent 6"/>
+    <w:lsdException w:unhideWhenUsed="0" w:uiPriority="72" w:semiHidden="0" w:name="Colorful List Accent 6"/>
+    <w:lsdException w:unhideWhenUsed="0" w:uiPriority="73" w:semiHidden="0" w:name="Colorful Grid Accent 6"/>
+  </w:latentStyles>
+  <w:style w:type="paragraph" w:default="1" w:styleId="1">
     <w:name w:val="Normal"/>
     <w:qFormat/>
+    <w:uiPriority w:val="0"/>
     <w:pPr>
       <w:widowControl/>
+      <w:suppressAutoHyphens/>
       <w:bidi w:val="0"/>
-      <w:spacing w:lineRule="auto" w:line="276" w:before="0" w:after="200"/>
+      <w:spacing w:before="0" w:after="200" w:line="276" w:lineRule="auto"/>
     </w:pPr>
     <w:rPr>
       <w:rFonts w:ascii="Calibri" w:hAnsi="Calibri" w:eastAsia="SimSun" w:cs="Calibri"/>
@@ -2518,18 +2346,22 @@
       <w:lang w:val="en-US" w:eastAsia="en-US" w:bidi="ar-SA"/>
     </w:rPr>
   </w:style>
-  <w:style w:type="paragraph" w:styleId="Heading1">
-    <w:name w:val="Heading 1"/>
-    <w:basedOn w:val="Normal"/>
-    <w:next w:val="Normal"/>
-    <w:qFormat/>
+  <w:style w:type="paragraph" w:styleId="2">
+    <w:name w:val="heading 1"/>
+    <w:basedOn w:val="1"/>
+    <w:next w:val="1"/>
+    <w:qFormat/>
+    <w:uiPriority w:val="0"/>
     <w:pPr>
-      <w:keepNext w:val="true"/>
+      <w:keepNext/>
       <w:numPr>
         <w:ilvl w:val="0"/>
         <w:numId w:val="1"/>
       </w:numPr>
-      <w:spacing w:lineRule="auto" w:line="240" w:before="0" w:after="0"/>
+      <w:tabs>
+        <w:tab w:val="left" w:pos="0"/>
+      </w:tabs>
+      <w:spacing w:before="0" w:after="0" w:line="240" w:lineRule="auto"/>
       <w:outlineLvl w:val="0"/>
     </w:pPr>
     <w:rPr>
@@ -2541,17 +2373,21 @@
       <w:u w:val="single"/>
     </w:rPr>
   </w:style>
-  <w:style w:type="paragraph" w:styleId="Heading2">
-    <w:name w:val="Heading 2"/>
-    <w:basedOn w:val="Normal"/>
-    <w:next w:val="Normal"/>
-    <w:qFormat/>
+  <w:style w:type="paragraph" w:styleId="3">
+    <w:name w:val="heading 2"/>
+    <w:basedOn w:val="1"/>
+    <w:next w:val="1"/>
+    <w:qFormat/>
+    <w:uiPriority w:val="0"/>
     <w:pPr>
-      <w:keepNext w:val="true"/>
+      <w:keepNext/>
       <w:numPr>
         <w:ilvl w:val="1"/>
         <w:numId w:val="1"/>
       </w:numPr>
+      <w:tabs>
+        <w:tab w:val="left" w:pos="0"/>
+      </w:tabs>
       <w:outlineLvl w:val="1"/>
     </w:pPr>
     <w:rPr>
@@ -2560,18 +2396,22 @@
       <w:bCs/>
     </w:rPr>
   </w:style>
-  <w:style w:type="paragraph" w:styleId="Heading3">
-    <w:name w:val="Heading 3"/>
-    <w:basedOn w:val="Normal"/>
-    <w:next w:val="Normal"/>
-    <w:qFormat/>
+  <w:style w:type="paragraph" w:styleId="4">
+    <w:name w:val="heading 3"/>
+    <w:basedOn w:val="1"/>
+    <w:next w:val="1"/>
+    <w:qFormat/>
+    <w:uiPriority w:val="0"/>
     <w:pPr>
-      <w:keepNext w:val="true"/>
+      <w:keepNext/>
       <w:numPr>
         <w:ilvl w:val="2"/>
         <w:numId w:val="1"/>
       </w:numPr>
-      <w:spacing w:lineRule="auto" w:line="360"/>
+      <w:tabs>
+        <w:tab w:val="left" w:pos="0"/>
+      </w:tabs>
+      <w:spacing w:line="360" w:lineRule="auto"/>
       <w:jc w:val="both"/>
       <w:outlineLvl w:val="2"/>
     </w:pPr>
@@ -2583,17 +2423,21 @@
       <w:lang w:eastAsia="zh-CN"/>
     </w:rPr>
   </w:style>
-  <w:style w:type="paragraph" w:styleId="Heading4">
-    <w:name w:val="Heading 4"/>
-    <w:basedOn w:val="Normal"/>
-    <w:next w:val="Normal"/>
-    <w:qFormat/>
+  <w:style w:type="paragraph" w:styleId="5">
+    <w:name w:val="heading 4"/>
+    <w:basedOn w:val="1"/>
+    <w:next w:val="1"/>
+    <w:qFormat/>
+    <w:uiPriority w:val="0"/>
     <w:pPr>
-      <w:keepNext w:val="true"/>
+      <w:keepNext/>
       <w:numPr>
         <w:ilvl w:val="3"/>
         <w:numId w:val="1"/>
       </w:numPr>
+      <w:tabs>
+        <w:tab w:val="left" w:pos="0"/>
+      </w:tabs>
       <w:outlineLvl w:val="3"/>
     </w:pPr>
     <w:rPr>
@@ -2604,16 +2448,20 @@
       <w:szCs w:val="24"/>
     </w:rPr>
   </w:style>
-  <w:style w:type="paragraph" w:styleId="Heading5">
-    <w:name w:val="Heading 5"/>
-    <w:basedOn w:val="Normal"/>
-    <w:next w:val="Normal"/>
-    <w:qFormat/>
+  <w:style w:type="paragraph" w:styleId="6">
+    <w:name w:val="heading 5"/>
+    <w:basedOn w:val="1"/>
+    <w:next w:val="1"/>
+    <w:qFormat/>
+    <w:uiPriority w:val="0"/>
     <w:pPr>
       <w:numPr>
         <w:ilvl w:val="4"/>
         <w:numId w:val="1"/>
       </w:numPr>
+      <w:tabs>
+        <w:tab w:val="left" w:pos="0"/>
+      </w:tabs>
       <w:spacing w:before="240" w:after="60"/>
       <w:outlineLvl w:val="4"/>
     </w:pPr>
@@ -2627,16 +2475,20 @@
       <w:szCs w:val="26"/>
     </w:rPr>
   </w:style>
-  <w:style w:type="paragraph" w:styleId="Heading6">
-    <w:name w:val="Heading 6"/>
-    <w:basedOn w:val="Normal"/>
-    <w:next w:val="Normal"/>
-    <w:qFormat/>
+  <w:style w:type="paragraph" w:styleId="7">
+    <w:name w:val="heading 6"/>
+    <w:basedOn w:val="1"/>
+    <w:next w:val="1"/>
+    <w:qFormat/>
+    <w:uiPriority w:val="0"/>
     <w:pPr>
       <w:numPr>
         <w:ilvl w:val="5"/>
         <w:numId w:val="1"/>
       </w:numPr>
+      <w:tabs>
+        <w:tab w:val="left" w:pos="0"/>
+      </w:tabs>
       <w:spacing w:before="240" w:after="60"/>
       <w:outlineLvl w:val="5"/>
     </w:pPr>
@@ -2647,14 +2499,154 @@
       <w:szCs w:val="22"/>
     </w:rPr>
   </w:style>
-  <w:style w:type="character" w:styleId="DefaultParagraphFont">
+  <w:style w:type="character" w:default="1" w:styleId="16">
     <w:name w:val="Default Paragraph Font"/>
     <w:qFormat/>
-    <w:rPr/>
-  </w:style>
-  <w:style w:type="character" w:styleId="Heading1Char">
+    <w:uiPriority w:val="0"/>
+  </w:style>
+  <w:style w:type="table" w:default="1" w:styleId="19">
+    <w:name w:val="Normal Table"/>
+    <w:semiHidden/>
+    <w:uiPriority w:val="0"/>
+    <w:tblPr>
+      <w:tblLayout w:type="fixed"/>
+      <w:tblCellMar>
+        <w:top w:w="0" w:type="dxa"/>
+        <w:left w:w="108" w:type="dxa"/>
+        <w:bottom w:w="0" w:type="dxa"/>
+        <w:right w:w="108" w:type="dxa"/>
+      </w:tblCellMar>
+    </w:tblPr>
+  </w:style>
+  <w:style w:type="paragraph" w:styleId="8">
+    <w:name w:val="Balloon Text"/>
+    <w:basedOn w:val="1"/>
+    <w:qFormat/>
+    <w:uiPriority w:val="0"/>
+    <w:pPr>
+      <w:spacing w:before="0" w:after="0" w:line="240" w:lineRule="auto"/>
+    </w:pPr>
+    <w:rPr>
+      <w:rFonts w:ascii="Tahoma;Gubbi" w:hAnsi="Tahoma;Gubbi" w:cs="Tahoma;Gubbi"/>
+      <w:sz w:val="16"/>
+      <w:szCs w:val="16"/>
+    </w:rPr>
+  </w:style>
+  <w:style w:type="paragraph" w:styleId="9">
+    <w:name w:val="Body Text"/>
+    <w:basedOn w:val="1"/>
+    <w:uiPriority w:val="0"/>
+    <w:pPr>
+      <w:spacing w:line="360" w:lineRule="auto"/>
+      <w:jc w:val="both"/>
+    </w:pPr>
+    <w:rPr>
+      <w:rFonts w:ascii="Times New Roman" w:hAnsi="Times New Roman" w:eastAsia="Times New Roman" w:cs="Times New Roman"/>
+      <w:sz w:val="24"/>
+      <w:szCs w:val="20"/>
+      <w:lang w:eastAsia="ar-SA"/>
+    </w:rPr>
+  </w:style>
+  <w:style w:type="paragraph" w:styleId="10">
+    <w:name w:val="Body Text 2"/>
+    <w:basedOn w:val="1"/>
+    <w:qFormat/>
+    <w:uiPriority w:val="0"/>
+    <w:pPr>
+      <w:shd w:val="clear" w:fill="C0C0C0"/>
+      <w:jc w:val="both"/>
+    </w:pPr>
+    <w:rPr>
+      <w:rFonts w:ascii="Verdana;Ubuntu" w:hAnsi="Verdana;Ubuntu" w:cs="Tahoma;Gubbi"/>
+      <w:b/>
+      <w:bCs/>
+    </w:rPr>
+  </w:style>
+  <w:style w:type="paragraph" w:styleId="11">
+    <w:name w:val="caption"/>
+    <w:basedOn w:val="1"/>
+    <w:next w:val="1"/>
+    <w:qFormat/>
+    <w:uiPriority w:val="0"/>
+    <w:pPr>
+      <w:suppressLineNumbers/>
+      <w:spacing w:before="120" w:after="120"/>
+    </w:pPr>
+    <w:rPr>
+      <w:rFonts w:cs="Tahoma;Gubbi"/>
+      <w:i/>
+      <w:iCs/>
+      <w:sz w:val="24"/>
+      <w:szCs w:val="24"/>
+    </w:rPr>
+  </w:style>
+  <w:style w:type="paragraph" w:styleId="12">
+    <w:name w:val="footer"/>
+    <w:basedOn w:val="1"/>
+    <w:uiPriority w:val="0"/>
+    <w:pPr>
+      <w:tabs>
+        <w:tab w:val="center" w:pos="4680"/>
+        <w:tab w:val="right" w:pos="9360"/>
+      </w:tabs>
+      <w:spacing w:before="0" w:after="0" w:line="240" w:lineRule="auto"/>
+    </w:pPr>
+  </w:style>
+  <w:style w:type="paragraph" w:styleId="13">
+    <w:name w:val="header"/>
+    <w:basedOn w:val="1"/>
+    <w:uiPriority w:val="0"/>
+    <w:pPr>
+      <w:tabs>
+        <w:tab w:val="center" w:pos="4680"/>
+        <w:tab w:val="right" w:pos="9360"/>
+      </w:tabs>
+      <w:spacing w:before="0" w:after="0" w:line="240" w:lineRule="auto"/>
+    </w:pPr>
+  </w:style>
+  <w:style w:type="paragraph" w:styleId="14">
+    <w:name w:val="List"/>
+    <w:basedOn w:val="9"/>
+    <w:uiPriority w:val="0"/>
+    <w:rPr>
+      <w:rFonts w:cs="Lohit Devanagari"/>
+    </w:rPr>
+  </w:style>
+  <w:style w:type="paragraph" w:styleId="15">
+    <w:name w:val="Normal (Web)"/>
+    <w:basedOn w:val="1"/>
+    <w:qFormat/>
+    <w:uiPriority w:val="0"/>
+    <w:pPr>
+      <w:spacing w:before="100" w:after="100" w:line="240" w:lineRule="auto"/>
+    </w:pPr>
+    <w:rPr>
+      <w:rFonts w:ascii="Times New Roman" w:hAnsi="Times New Roman" w:eastAsia="Times New Roman" w:cs="Times New Roman"/>
+      <w:sz w:val="24"/>
+      <w:szCs w:val="24"/>
+    </w:rPr>
+  </w:style>
+  <w:style w:type="character" w:styleId="17">
+    <w:name w:val="Emphasis"/>
+    <w:qFormat/>
+    <w:uiPriority w:val="0"/>
+    <w:rPr>
+      <w:i/>
+      <w:iCs/>
+    </w:rPr>
+  </w:style>
+  <w:style w:type="character" w:styleId="18">
+    <w:name w:val="Hyperlink"/>
+    <w:uiPriority w:val="0"/>
+    <w:rPr>
+      <w:color w:val="0000FF"/>
+      <w:u w:val="single"/>
+    </w:rPr>
+  </w:style>
+  <w:style w:type="character" w:customStyle="1" w:styleId="20">
     <w:name w:val="Heading 1 Char"/>
     <w:qFormat/>
+    <w:uiPriority w:val="0"/>
     <w:rPr>
       <w:rFonts w:eastAsia="Times New Roman"/>
       <w:b/>
@@ -2664,9 +2656,10 @@
       <w:u w:val="single"/>
     </w:rPr>
   </w:style>
-  <w:style w:type="character" w:styleId="Heading2Char">
+  <w:style w:type="character" w:customStyle="1" w:styleId="21">
     <w:name w:val="Heading 2 Char"/>
     <w:qFormat/>
+    <w:uiPriority w:val="0"/>
     <w:rPr>
       <w:rFonts w:ascii="Tahoma;Gubbi" w:hAnsi="Tahoma;Gubbi" w:cs="Tahoma;Gubbi"/>
       <w:b/>
@@ -2675,9 +2668,10 @@
       <w:szCs w:val="22"/>
     </w:rPr>
   </w:style>
-  <w:style w:type="character" w:styleId="Heading3Char">
+  <w:style w:type="character" w:customStyle="1" w:styleId="22">
     <w:name w:val="Heading 3 Char"/>
     <w:qFormat/>
+    <w:uiPriority w:val="0"/>
     <w:rPr>
       <w:kern w:val="2"/>
       <w:sz w:val="24"/>
@@ -2685,9 +2679,10 @@
       <w:lang w:eastAsia="zh-CN"/>
     </w:rPr>
   </w:style>
-  <w:style w:type="character" w:styleId="Heading4Char">
+  <w:style w:type="character" w:customStyle="1" w:styleId="23">
     <w:name w:val="Heading 4 Char"/>
     <w:qFormat/>
+    <w:uiPriority w:val="0"/>
     <w:rPr>
       <w:rFonts w:eastAsia="Times New Roman"/>
       <w:b/>
@@ -2696,9 +2691,10 @@
       <w:szCs w:val="24"/>
     </w:rPr>
   </w:style>
-  <w:style w:type="character" w:styleId="Heading5Char">
+  <w:style w:type="character" w:customStyle="1" w:styleId="24">
     <w:name w:val="Heading 5 Char"/>
     <w:qFormat/>
+    <w:uiPriority w:val="0"/>
     <w:rPr>
       <w:rFonts w:ascii="Calibri" w:hAnsi="Calibri" w:eastAsia="Times New Roman" w:cs="Calibri"/>
       <w:b/>
@@ -2709,9 +2705,10 @@
       <w:szCs w:val="26"/>
     </w:rPr>
   </w:style>
-  <w:style w:type="character" w:styleId="Heading6Char">
+  <w:style w:type="character" w:customStyle="1" w:styleId="25">
     <w:name w:val="Heading 6 Char"/>
     <w:qFormat/>
+    <w:uiPriority w:val="0"/>
     <w:rPr>
       <w:rFonts w:ascii="Calibri" w:hAnsi="Calibri" w:cs="Calibri"/>
       <w:b/>
@@ -2720,98 +2717,91 @@
       <w:szCs w:val="22"/>
     </w:rPr>
   </w:style>
-  <w:style w:type="character" w:styleId="BalloonTextChar">
+  <w:style w:type="character" w:customStyle="1" w:styleId="26">
     <w:name w:val="Balloon Text Char"/>
     <w:qFormat/>
+    <w:uiPriority w:val="0"/>
     <w:rPr>
       <w:rFonts w:ascii="Tahoma;Gubbi" w:hAnsi="Tahoma;Gubbi" w:cs="Tahoma;Gubbi"/>
       <w:sz w:val="16"/>
       <w:szCs w:val="16"/>
     </w:rPr>
   </w:style>
-  <w:style w:type="character" w:styleId="BodyTextChar">
+  <w:style w:type="character" w:customStyle="1" w:styleId="27">
     <w:name w:val="Body Text Char"/>
     <w:qFormat/>
+    <w:uiPriority w:val="0"/>
     <w:rPr>
       <w:rFonts w:eastAsia="Times New Roman"/>
       <w:sz w:val="24"/>
       <w:lang w:eastAsia="ar-SA"/>
     </w:rPr>
   </w:style>
-  <w:style w:type="character" w:styleId="BodyText2Char">
+  <w:style w:type="character" w:customStyle="1" w:styleId="28">
     <w:name w:val="Body Text 2 Char"/>
     <w:qFormat/>
+    <w:uiPriority w:val="0"/>
     <w:rPr>
       <w:rFonts w:ascii="Verdana;Ubuntu" w:hAnsi="Verdana;Ubuntu" w:cs="Tahoma;Gubbi"/>
       <w:b/>
       <w:bCs/>
       <w:sz w:val="22"/>
       <w:szCs w:val="22"/>
-      <w:shd w:fill="C0C0C0" w:val="clear"/>
-    </w:rPr>
-  </w:style>
-  <w:style w:type="character" w:styleId="CommentReference">
-    <w:name w:val="Comment Reference"/>
-    <w:qFormat/>
+      <w:shd w:val="clear" w:fill="C0C0C0"/>
+    </w:rPr>
+  </w:style>
+  <w:style w:type="character" w:customStyle="1" w:styleId="29">
+    <w:name w:val="Comment Reference1"/>
+    <w:qFormat/>
+    <w:uiPriority w:val="0"/>
     <w:rPr>
       <w:sz w:val="16"/>
       <w:szCs w:val="16"/>
     </w:rPr>
   </w:style>
-  <w:style w:type="character" w:styleId="CommentTextChar">
+  <w:style w:type="character" w:customStyle="1" w:styleId="30">
     <w:name w:val="Comment Text Char"/>
     <w:qFormat/>
+    <w:uiPriority w:val="0"/>
     <w:rPr>
       <w:rFonts w:ascii="Calibri" w:hAnsi="Calibri" w:cs="Calibri"/>
     </w:rPr>
   </w:style>
-  <w:style w:type="character" w:styleId="CommentSubjectChar">
+  <w:style w:type="character" w:customStyle="1" w:styleId="31">
     <w:name w:val="Comment Subject Char"/>
     <w:qFormat/>
+    <w:uiPriority w:val="0"/>
     <w:rPr>
       <w:rFonts w:ascii="Calibri" w:hAnsi="Calibri" w:cs="Calibri"/>
       <w:b/>
       <w:bCs/>
     </w:rPr>
   </w:style>
-  <w:style w:type="character" w:styleId="Emphasis">
-    <w:name w:val="Emphasis"/>
-    <w:qFormat/>
-    <w:rPr>
-      <w:i/>
-      <w:iCs/>
-    </w:rPr>
-  </w:style>
-  <w:style w:type="character" w:styleId="FooterChar">
+  <w:style w:type="character" w:customStyle="1" w:styleId="32">
     <w:name w:val="Footer Char"/>
-    <w:basedOn w:val="DefaultParagraphFont"/>
-    <w:qFormat/>
-    <w:rPr/>
-  </w:style>
-  <w:style w:type="character" w:styleId="HeaderChar">
+    <w:basedOn w:val="16"/>
+    <w:qFormat/>
+    <w:uiPriority w:val="0"/>
+  </w:style>
+  <w:style w:type="character" w:customStyle="1" w:styleId="33">
     <w:name w:val="Header Char"/>
-    <w:basedOn w:val="DefaultParagraphFont"/>
-    <w:qFormat/>
-    <w:rPr/>
-  </w:style>
-  <w:style w:type="character" w:styleId="InternetLink">
-    <w:name w:val="Hyperlink"/>
-    <w:rPr>
-      <w:color w:val="0000FF"/>
-      <w:u w:val="single"/>
-    </w:rPr>
-  </w:style>
-  <w:style w:type="character" w:styleId="StrongEmphasis">
+    <w:basedOn w:val="16"/>
+    <w:qFormat/>
+    <w:uiPriority w:val="0"/>
+  </w:style>
+  <w:style w:type="character" w:customStyle="1" w:styleId="34">
     <w:name w:val="Strong Emphasis"/>
     <w:qFormat/>
+    <w:uiPriority w:val="0"/>
     <w:rPr>
       <w:b/>
       <w:bCs/>
     </w:rPr>
   </w:style>
-  <w:style w:type="character" w:styleId="TitleChar">
+  <w:style w:type="character" w:customStyle="1" w:styleId="35">
     <w:name w:val="Title Char"/>
     <w:qFormat/>
+    <w:uiPriority w:val="0"/>
     <w:rPr>
       <w:rFonts w:eastAsia="Times New Roman"/>
       <w:b/>
@@ -2822,131 +2812,138 @@
       <w:u w:val="single"/>
     </w:rPr>
   </w:style>
-  <w:style w:type="character" w:styleId="WWStrongEmphasis">
+  <w:style w:type="character" w:customStyle="1" w:styleId="36">
     <w:name w:val="WW-Strong Emphasis"/>
     <w:qFormat/>
+    <w:uiPriority w:val="0"/>
     <w:rPr>
       <w:b/>
       <w:bCs/>
     </w:rPr>
   </w:style>
-  <w:style w:type="character" w:styleId="SubtleEmphasis">
+  <w:style w:type="character" w:customStyle="1" w:styleId="37">
     <w:name w:val="Subtle Emphasis"/>
     <w:qFormat/>
+    <w:uiPriority w:val="0"/>
     <w:rPr>
       <w:i/>
       <w:iCs/>
       <w:color w:val="808080"/>
     </w:rPr>
   </w:style>
-  <w:style w:type="character" w:styleId="NoSpacingChar">
+  <w:style w:type="character" w:customStyle="1" w:styleId="38">
     <w:name w:val="No Spacing Char"/>
     <w:qFormat/>
+    <w:uiPriority w:val="0"/>
     <w:rPr>
       <w:rFonts w:ascii="Calibri" w:hAnsi="Calibri" w:eastAsia="Times New Roman" w:cs="Calibri"/>
       <w:sz w:val="22"/>
       <w:szCs w:val="22"/>
     </w:rPr>
   </w:style>
-  <w:style w:type="character" w:styleId="Appleconvertedspace">
+  <w:style w:type="character" w:customStyle="1" w:styleId="39">
     <w:name w:val="apple-converted-space"/>
     <w:qFormat/>
-    <w:rPr/>
-  </w:style>
-  <w:style w:type="character" w:styleId="Figpopupsensitivearea">
+    <w:uiPriority w:val="0"/>
+  </w:style>
+  <w:style w:type="character" w:customStyle="1" w:styleId="40">
     <w:name w:val="figpopup-sensitive-area"/>
     <w:qFormat/>
-    <w:rPr/>
-  </w:style>
-  <w:style w:type="character" w:styleId="BalloonTextChar1">
+    <w:uiPriority w:val="0"/>
+  </w:style>
+  <w:style w:type="character" w:customStyle="1" w:styleId="41">
     <w:name w:val="Balloon Text Char1"/>
     <w:qFormat/>
+    <w:uiPriority w:val="0"/>
     <w:rPr>
       <w:rFonts w:ascii="Segoe UI;Gubbi" w:hAnsi="Segoe UI;Gubbi" w:cs="Segoe UI;Gubbi"/>
       <w:sz w:val="18"/>
       <w:szCs w:val="18"/>
     </w:rPr>
   </w:style>
-  <w:style w:type="character" w:styleId="FooterChar1">
+  <w:style w:type="character" w:customStyle="1" w:styleId="42">
     <w:name w:val="Footer Char1"/>
     <w:qFormat/>
+    <w:uiPriority w:val="0"/>
     <w:rPr>
       <w:rFonts w:ascii="Calibri" w:hAnsi="Calibri" w:cs="Calibri"/>
       <w:sz w:val="22"/>
       <w:szCs w:val="22"/>
     </w:rPr>
   </w:style>
-  <w:style w:type="character" w:styleId="HeaderChar1">
+  <w:style w:type="character" w:customStyle="1" w:styleId="43">
     <w:name w:val="Header Char1"/>
     <w:qFormat/>
+    <w:uiPriority w:val="0"/>
     <w:rPr>
       <w:rFonts w:ascii="Calibri" w:hAnsi="Calibri" w:cs="Calibri"/>
       <w:sz w:val="22"/>
       <w:szCs w:val="22"/>
     </w:rPr>
   </w:style>
-  <w:style w:type="character" w:styleId="Texttruncator">
+  <w:style w:type="character" w:customStyle="1" w:styleId="44">
     <w:name w:val="text-truncator"/>
     <w:qFormat/>
-    <w:rPr/>
-  </w:style>
-  <w:style w:type="character" w:styleId="Paperdetailabstracttogglelabel">
+    <w:uiPriority w:val="0"/>
+  </w:style>
+  <w:style w:type="character" w:customStyle="1" w:styleId="45">
     <w:name w:val="paper-detail__abstract__toggle__label"/>
     <w:qFormat/>
-    <w:rPr/>
-  </w:style>
-  <w:style w:type="character" w:styleId="Paperdetailabstracthighlightedkeyhighlight">
+    <w:uiPriority w:val="0"/>
+  </w:style>
+  <w:style w:type="character" w:customStyle="1" w:styleId="46">
     <w:name w:val="paper-detail__abstract__highlighted__key-highlight"/>
     <w:qFormat/>
-    <w:rPr/>
-  </w:style>
-  <w:style w:type="character" w:styleId="Previewboxtarget">
+    <w:uiPriority w:val="0"/>
+  </w:style>
+  <w:style w:type="character" w:customStyle="1" w:styleId="47">
     <w:name w:val="preview-box__target"/>
     <w:qFormat/>
-    <w:rPr/>
-  </w:style>
-  <w:style w:type="character" w:styleId="Dblock">
+    <w:uiPriority w:val="0"/>
+  </w:style>
+  <w:style w:type="character" w:customStyle="1" w:styleId="48">
     <w:name w:val="d-block"/>
     <w:qFormat/>
-    <w:rPr/>
-  </w:style>
-  <w:style w:type="character" w:styleId="Mb1">
+    <w:uiPriority w:val="0"/>
+  </w:style>
+  <w:style w:type="character" w:customStyle="1" w:styleId="49">
     <w:name w:val="mb-1"/>
     <w:qFormat/>
-    <w:rPr/>
-  </w:style>
-  <w:style w:type="character" w:styleId="Gd">
+    <w:uiPriority w:val="0"/>
+  </w:style>
+  <w:style w:type="character" w:customStyle="1" w:styleId="50">
     <w:name w:val="gd"/>
     <w:qFormat/>
-    <w:rPr/>
-  </w:style>
-  <w:style w:type="character" w:styleId="G3">
+    <w:uiPriority w:val="0"/>
+  </w:style>
+  <w:style w:type="character" w:customStyle="1" w:styleId="51">
     <w:name w:val="g3"/>
     <w:qFormat/>
-    <w:rPr/>
-  </w:style>
-  <w:style w:type="character" w:styleId="Hb">
+    <w:uiPriority w:val="0"/>
+  </w:style>
+  <w:style w:type="character" w:customStyle="1" w:styleId="52">
     <w:name w:val="hb"/>
     <w:qFormat/>
-    <w:rPr/>
-  </w:style>
-  <w:style w:type="character" w:styleId="G2">
+    <w:uiPriority w:val="0"/>
+  </w:style>
+  <w:style w:type="character" w:customStyle="1" w:styleId="53">
     <w:name w:val="g2"/>
     <w:qFormat/>
-    <w:rPr/>
-  </w:style>
-  <w:style w:type="character" w:styleId="Ams">
+    <w:uiPriority w:val="0"/>
+  </w:style>
+  <w:style w:type="character" w:customStyle="1" w:styleId="54">
     <w:name w:val="ams"/>
     <w:qFormat/>
-    <w:rPr/>
-  </w:style>
-  <w:style w:type="paragraph" w:styleId="Heading">
+    <w:uiPriority w:val="0"/>
+  </w:style>
+  <w:style w:type="paragraph" w:customStyle="1" w:styleId="55">
     <w:name w:val="Heading"/>
-    <w:basedOn w:val="Normal"/>
-    <w:next w:val="TextBody"/>
-    <w:qFormat/>
+    <w:basedOn w:val="1"/>
+    <w:next w:val="9"/>
+    <w:qFormat/>
+    <w:uiPriority w:val="0"/>
     <w:pPr>
-      <w:spacing w:lineRule="auto" w:line="240" w:before="0" w:after="0"/>
+      <w:spacing w:before="0" w:after="0" w:line="240" w:lineRule="auto"/>
       <w:jc w:val="center"/>
     </w:pPr>
     <w:rPr>
@@ -2959,48 +2956,11 @@
       <w:u w:val="single"/>
     </w:rPr>
   </w:style>
-  <w:style w:type="paragraph" w:styleId="TextBody">
-    <w:name w:val="Body Text"/>
-    <w:basedOn w:val="Normal"/>
-    <w:pPr>
-      <w:spacing w:lineRule="auto" w:line="360"/>
-      <w:jc w:val="both"/>
-    </w:pPr>
-    <w:rPr>
-      <w:rFonts w:ascii="Times New Roman" w:hAnsi="Times New Roman" w:eastAsia="Times New Roman" w:cs="Times New Roman"/>
-      <w:sz w:val="24"/>
-      <w:szCs w:val="20"/>
-      <w:lang w:eastAsia="ar-SA"/>
-    </w:rPr>
-  </w:style>
-  <w:style w:type="paragraph" w:styleId="List">
-    <w:name w:val="List"/>
-    <w:basedOn w:val="TextBody"/>
-    <w:pPr/>
-    <w:rPr>
-      <w:rFonts w:cs="Lohit Devanagari"/>
-    </w:rPr>
-  </w:style>
-  <w:style w:type="paragraph" w:styleId="Caption">
-    <w:name w:val="Caption"/>
-    <w:basedOn w:val="Normal"/>
-    <w:qFormat/>
-    <w:pPr>
-      <w:suppressLineNumbers/>
-      <w:spacing w:before="120" w:after="120"/>
-    </w:pPr>
-    <w:rPr>
-      <w:rFonts w:cs="Tahoma;Gubbi"/>
-      <w:i/>
-      <w:iCs/>
-      <w:sz w:val="24"/>
-      <w:szCs w:val="24"/>
-    </w:rPr>
-  </w:style>
-  <w:style w:type="paragraph" w:styleId="Index">
+  <w:style w:type="paragraph" w:customStyle="1" w:styleId="56">
     <w:name w:val="Index"/>
-    <w:basedOn w:val="Normal"/>
-    <w:qFormat/>
+    <w:basedOn w:val="1"/>
+    <w:qFormat/>
+    <w:uiPriority w:val="0"/>
     <w:pPr>
       <w:suppressLineNumbers/>
     </w:pPr>
@@ -3008,113 +2968,47 @@
       <w:rFonts w:cs="Lohit Devanagari"/>
     </w:rPr>
   </w:style>
-  <w:style w:type="paragraph" w:styleId="BalloonText">
-    <w:name w:val="Balloon Text"/>
-    <w:basedOn w:val="Normal"/>
-    <w:qFormat/>
-    <w:pPr>
-      <w:spacing w:lineRule="auto" w:line="240" w:before="0" w:after="0"/>
-    </w:pPr>
-    <w:rPr>
-      <w:rFonts w:ascii="Tahoma;Gubbi" w:hAnsi="Tahoma;Gubbi" w:cs="Tahoma;Gubbi"/>
-      <w:sz w:val="16"/>
-      <w:szCs w:val="16"/>
-    </w:rPr>
-  </w:style>
-  <w:style w:type="paragraph" w:styleId="BodyText2">
-    <w:name w:val="Body Text 2"/>
-    <w:basedOn w:val="Normal"/>
-    <w:qFormat/>
-    <w:pPr>
-      <w:shd w:fill="C0C0C0" w:val="clear"/>
-      <w:jc w:val="both"/>
-    </w:pPr>
-    <w:rPr>
-      <w:rFonts w:ascii="Verdana;Ubuntu" w:hAnsi="Verdana;Ubuntu" w:cs="Tahoma;Gubbi"/>
+  <w:style w:type="paragraph" w:customStyle="1" w:styleId="57">
+    <w:name w:val="Comment Text1"/>
+    <w:basedOn w:val="1"/>
+    <w:qFormat/>
+    <w:uiPriority w:val="0"/>
+    <w:rPr>
+      <w:sz w:val="20"/>
+      <w:szCs w:val="20"/>
+    </w:rPr>
+  </w:style>
+  <w:style w:type="paragraph" w:customStyle="1" w:styleId="58">
+    <w:name w:val="Comment Subject1"/>
+    <w:basedOn w:val="57"/>
+    <w:next w:val="57"/>
+    <w:qFormat/>
+    <w:uiPriority w:val="0"/>
+    <w:rPr>
       <w:b/>
       <w:bCs/>
     </w:rPr>
   </w:style>
-  <w:style w:type="paragraph" w:styleId="CommentText">
-    <w:name w:val="Comment Text"/>
-    <w:basedOn w:val="Normal"/>
-    <w:qFormat/>
-    <w:pPr/>
-    <w:rPr>
-      <w:sz w:val="20"/>
-      <w:szCs w:val="20"/>
-    </w:rPr>
-  </w:style>
-  <w:style w:type="paragraph" w:styleId="CommentSubject">
-    <w:name w:val="Comment Subject"/>
-    <w:basedOn w:val="CommentText"/>
-    <w:next w:val="CommentText"/>
-    <w:qFormat/>
-    <w:pPr/>
-    <w:rPr>
-      <w:b/>
-      <w:bCs/>
-    </w:rPr>
-  </w:style>
-  <w:style w:type="paragraph" w:styleId="HeaderandFooter">
+  <w:style w:type="paragraph" w:customStyle="1" w:styleId="59">
     <w:name w:val="Header and Footer"/>
-    <w:basedOn w:val="Normal"/>
-    <w:qFormat/>
+    <w:basedOn w:val="1"/>
+    <w:qFormat/>
+    <w:uiPriority w:val="0"/>
     <w:pPr>
       <w:suppressLineNumbers/>
       <w:tabs>
-        <w:tab w:val="clear" w:pos="720"/>
-        <w:tab w:val="center" w:pos="4819" w:leader="none"/>
-        <w:tab w:val="right" w:pos="9638" w:leader="none"/>
+        <w:tab w:val="center" w:pos="4819"/>
+        <w:tab w:val="right" w:pos="9638"/>
       </w:tabs>
     </w:pPr>
-    <w:rPr/>
-  </w:style>
-  <w:style w:type="paragraph" w:styleId="Footer">
-    <w:name w:val="Footer"/>
-    <w:basedOn w:val="Normal"/>
+  </w:style>
+  <w:style w:type="paragraph" w:customStyle="1" w:styleId="60">
+    <w:name w:val="Standard"/>
+    <w:qFormat/>
+    <w:uiPriority w:val="0"/>
     <w:pPr>
-      <w:tabs>
-        <w:tab w:val="clear" w:pos="720"/>
-        <w:tab w:val="center" w:pos="4680" w:leader="none"/>
-        <w:tab w:val="right" w:pos="9360" w:leader="none"/>
-      </w:tabs>
-      <w:spacing w:lineRule="auto" w:line="240" w:before="0" w:after="0"/>
-    </w:pPr>
-    <w:rPr/>
-  </w:style>
-  <w:style w:type="paragraph" w:styleId="Header">
-    <w:name w:val="Header"/>
-    <w:basedOn w:val="Normal"/>
-    <w:pPr>
-      <w:tabs>
-        <w:tab w:val="clear" w:pos="720"/>
-        <w:tab w:val="center" w:pos="4680" w:leader="none"/>
-        <w:tab w:val="right" w:pos="9360" w:leader="none"/>
-      </w:tabs>
-      <w:spacing w:lineRule="auto" w:line="240" w:before="0" w:after="0"/>
-    </w:pPr>
-    <w:rPr/>
-  </w:style>
-  <w:style w:type="paragraph" w:styleId="NormalWeb">
-    <w:name w:val="Normal (Web)"/>
-    <w:basedOn w:val="Normal"/>
-    <w:qFormat/>
-    <w:pPr>
-      <w:spacing w:lineRule="auto" w:line="240" w:before="100" w:after="100"/>
-    </w:pPr>
-    <w:rPr>
-      <w:rFonts w:ascii="Times New Roman" w:hAnsi="Times New Roman" w:eastAsia="Times New Roman" w:cs="Times New Roman"/>
-      <w:sz w:val="24"/>
-      <w:szCs w:val="24"/>
-    </w:rPr>
-  </w:style>
-  <w:style w:type="paragraph" w:styleId="Standard">
-    <w:name w:val="Standard"/>
-    <w:qFormat/>
-    <w:pPr>
-      <w:widowControl w:val="false"/>
-      <w:suppressAutoHyphens w:val="true"/>
+      <w:widowControl w:val="0"/>
+      <w:suppressAutoHyphens/>
       <w:bidi w:val="0"/>
       <w:textAlignment w:val="baseline"/>
     </w:pPr>
@@ -3127,30 +3021,31 @@
       <w:lang w:val="en-US" w:eastAsia="zh-CN" w:bidi="ar-SA"/>
     </w:rPr>
   </w:style>
-  <w:style w:type="paragraph" w:styleId="TableContents">
+  <w:style w:type="paragraph" w:customStyle="1" w:styleId="61">
     <w:name w:val="Table Contents"/>
-    <w:basedOn w:val="Standard"/>
-    <w:qFormat/>
+    <w:basedOn w:val="60"/>
+    <w:qFormat/>
+    <w:uiPriority w:val="0"/>
     <w:pPr>
       <w:suppressLineNumbers/>
     </w:pPr>
-    <w:rPr/>
-  </w:style>
-  <w:style w:type="paragraph" w:styleId="Textbody1">
+  </w:style>
+  <w:style w:type="paragraph" w:customStyle="1" w:styleId="62">
     <w:name w:val="Text body"/>
-    <w:basedOn w:val="Standard"/>
-    <w:qFormat/>
+    <w:basedOn w:val="60"/>
+    <w:qFormat/>
+    <w:uiPriority w:val="0"/>
     <w:pPr>
       <w:spacing w:before="0" w:after="120"/>
     </w:pPr>
-    <w:rPr/>
-  </w:style>
-  <w:style w:type="paragraph" w:styleId="BodyText2CharChar">
+  </w:style>
+  <w:style w:type="paragraph" w:customStyle="1" w:styleId="63">
     <w:name w:val="Body Text 2 Char Char"/>
-    <w:basedOn w:val="Normal"/>
-    <w:qFormat/>
+    <w:basedOn w:val="1"/>
+    <w:qFormat/>
+    <w:uiPriority w:val="0"/>
     <w:pPr>
-      <w:spacing w:lineRule="auto" w:line="240" w:before="0" w:after="0"/>
+      <w:spacing w:before="0" w:after="0" w:line="240" w:lineRule="auto"/>
       <w:jc w:val="both"/>
     </w:pPr>
     <w:rPr>
@@ -3159,23 +3054,25 @@
       <w:szCs w:val="24"/>
     </w:rPr>
   </w:style>
-  <w:style w:type="paragraph" w:styleId="ListParagraph">
+  <w:style w:type="paragraph" w:customStyle="1" w:styleId="64">
     <w:name w:val="List Paragraph"/>
-    <w:basedOn w:val="Normal"/>
-    <w:qFormat/>
+    <w:basedOn w:val="1"/>
+    <w:qFormat/>
+    <w:uiPriority w:val="0"/>
     <w:pPr>
       <w:spacing w:before="0" w:after="200"/>
-      <w:ind w:start="720" w:hanging="0"/>
+      <w:ind w:firstLine="0"/>
       <w:contextualSpacing/>
     </w:pPr>
-    <w:rPr/>
-  </w:style>
-  <w:style w:type="paragraph" w:styleId="Default">
+  </w:style>
+  <w:style w:type="paragraph" w:customStyle="1" w:styleId="65">
     <w:name w:val="Default"/>
     <w:qFormat/>
+    <w:uiPriority w:val="0"/>
     <w:pPr>
-      <w:widowControl w:val="false"/>
-      <w:autoSpaceDE w:val="false"/>
+      <w:widowControl w:val="0"/>
+      <w:suppressAutoHyphens/>
+      <w:autoSpaceDE w:val="0"/>
       <w:bidi w:val="0"/>
     </w:pPr>
     <w:rPr>
@@ -3186,28 +3083,29 @@
       <w:lang w:val="en-US" w:eastAsia="en-US" w:bidi="ar-SA"/>
     </w:rPr>
   </w:style>
-  <w:style w:type="paragraph" w:styleId="WWTextBody">
+  <w:style w:type="paragraph" w:customStyle="1" w:styleId="66">
     <w:name w:val="WW-Text Body"/>
-    <w:basedOn w:val="Normal"/>
-    <w:qFormat/>
+    <w:basedOn w:val="1"/>
+    <w:qFormat/>
+    <w:uiPriority w:val="0"/>
     <w:pPr>
-      <w:spacing w:lineRule="auto" w:line="288" w:before="0" w:after="140"/>
+      <w:spacing w:before="0" w:after="140" w:line="288" w:lineRule="auto"/>
     </w:pPr>
-    <w:rPr/>
-  </w:style>
-  <w:style w:type="paragraph" w:styleId="Style11">
+  </w:style>
+  <w:style w:type="paragraph" w:customStyle="1" w:styleId="67">
     <w:name w:val="Style1"/>
-    <w:basedOn w:val="Normal"/>
-    <w:qFormat/>
-    <w:pPr/>
+    <w:basedOn w:val="1"/>
+    <w:qFormat/>
+    <w:uiPriority w:val="0"/>
     <w:rPr>
       <w:szCs w:val="20"/>
     </w:rPr>
   </w:style>
-  <w:style w:type="paragraph" w:styleId="NORMAL1">
+  <w:style w:type="paragraph" w:customStyle="1" w:styleId="68">
     <w:name w:val="LO-NORMAL"/>
-    <w:basedOn w:val="Normal"/>
-    <w:qFormat/>
+    <w:basedOn w:val="1"/>
+    <w:qFormat/>
+    <w:uiPriority w:val="0"/>
     <w:pPr>
       <w:jc w:val="both"/>
     </w:pPr>
@@ -3217,25 +3115,27 @@
       <w:u w:val="single"/>
     </w:rPr>
   </w:style>
-  <w:style w:type="paragraph" w:styleId="Data">
+  <w:style w:type="paragraph" w:customStyle="1" w:styleId="69">
     <w:name w:val="Data"/>
-    <w:basedOn w:val="Normal"/>
-    <w:qFormat/>
+    <w:basedOn w:val="1"/>
+    <w:qFormat/>
+    <w:uiPriority w:val="0"/>
     <w:pPr>
       <w:tabs>
-        <w:tab w:val="clear" w:pos="720"/>
-        <w:tab w:val="left" w:pos="0" w:leader="none"/>
+        <w:tab w:val="left" w:pos="0"/>
       </w:tabs>
     </w:pPr>
     <w:rPr>
       <w:szCs w:val="20"/>
     </w:rPr>
   </w:style>
-  <w:style w:type="paragraph" w:styleId="NoSpacing">
+  <w:style w:type="paragraph" w:customStyle="1" w:styleId="70">
     <w:name w:val="No Spacing"/>
     <w:qFormat/>
+    <w:uiPriority w:val="0"/>
     <w:pPr>
       <w:widowControl/>
+      <w:suppressAutoHyphens/>
       <w:bidi w:val="0"/>
     </w:pPr>
     <w:rPr>
@@ -3246,12 +3146,13 @@
       <w:lang w:val="en-US" w:eastAsia="en-US" w:bidi="ar-SA"/>
     </w:rPr>
   </w:style>
-  <w:style w:type="paragraph" w:styleId="Msonormal">
+  <w:style w:type="paragraph" w:customStyle="1" w:styleId="71">
     <w:name w:val="msonormal"/>
-    <w:basedOn w:val="Normal"/>
-    <w:qFormat/>
+    <w:basedOn w:val="1"/>
+    <w:qFormat/>
+    <w:uiPriority w:val="0"/>
     <w:pPr>
-      <w:spacing w:lineRule="auto" w:line="240" w:before="100" w:after="100"/>
+      <w:spacing w:before="100" w:after="100" w:line="240" w:lineRule="auto"/>
     </w:pPr>
     <w:rPr>
       <w:rFonts w:ascii="Times New Roman" w:hAnsi="Times New Roman" w:eastAsia="Times New Roman" w:cs="Times New Roman"/>
@@ -3259,10 +3160,11 @@
       <w:szCs w:val="24"/>
     </w:rPr>
   </w:style>
-  <w:style w:type="paragraph" w:styleId="TableHeading">
+  <w:style w:type="paragraph" w:customStyle="1" w:styleId="72">
     <w:name w:val="Table Heading"/>
-    <w:basedOn w:val="TableContents"/>
-    <w:qFormat/>
+    <w:basedOn w:val="61"/>
+    <w:qFormat/>
+    <w:uiPriority w:val="0"/>
     <w:pPr>
       <w:suppressLineNumbers/>
       <w:jc w:val="center"/>
@@ -3272,12 +3174,316 @@
       <w:bCs/>
     </w:rPr>
   </w:style>
-  <w:style w:type="paragraph" w:styleId="FrameContents">
+  <w:style w:type="paragraph" w:customStyle="1" w:styleId="73">
     <w:name w:val="Frame Contents"/>
-    <w:basedOn w:val="Normal"/>
-    <w:qFormat/>
-    <w:pPr/>
-    <w:rPr/>
+    <w:basedOn w:val="1"/>
+    <w:qFormat/>
+    <w:uiPriority w:val="0"/>
   </w:style>
 </w:styles>
+</file>
+
+<file path=word/theme/theme1.xml><?xml version="1.0" encoding="utf-8"?>
+<a:theme xmlns:a="http://schemas.openxmlformats.org/drawingml/2006/main" name="Office">
+  <a:themeElements>
+    <a:clrScheme name="Office">
+      <a:dk1>
+        <a:sysClr val="windowText" lastClr="3D3D3D"/>
+      </a:dk1>
+      <a:lt1>
+        <a:sysClr val="window" lastClr="FFFFFF"/>
+      </a:lt1>
+      <a:dk2>
+        <a:srgbClr val="1F497D"/>
+      </a:dk2>
+      <a:lt2>
+        <a:srgbClr val="EEECE1"/>
+      </a:lt2>
+      <a:accent1>
+        <a:srgbClr val="4F81BD"/>
+      </a:accent1>
+      <a:accent2>
+        <a:srgbClr val="C0504D"/>
+      </a:accent2>
+      <a:accent3>
+        <a:srgbClr val="9BBB59"/>
+      </a:accent3>
+      <a:accent4>
+        <a:srgbClr val="8064A2"/>
+      </a:accent4>
+      <a:accent5>
+        <a:srgbClr val="4BACC6"/>
+      </a:accent5>
+      <a:accent6>
+        <a:srgbClr val="F79646"/>
+      </a:accent6>
+      <a:hlink>
+        <a:srgbClr val="0000FF"/>
+      </a:hlink>
+      <a:folHlink>
+        <a:srgbClr val="800080"/>
+      </a:folHlink>
+    </a:clrScheme>
+    <a:fontScheme name="Office">
+      <a:majorFont>
+        <a:latin typeface="Cambria"/>
+        <a:ea typeface=""/>
+        <a:cs typeface=""/>
+        <a:font script="Jpan" typeface="ＭＳ ゴシック"/>
+        <a:font script="Hang" typeface="맑은 고딕"/>
+        <a:font script="Hans" typeface="宋体"/>
+        <a:font script="Hant" typeface="新細明體"/>
+        <a:font script="Arab" typeface="Times New Roman"/>
+        <a:font script="Hebr" typeface="Times New Roman"/>
+        <a:font script="Thai" typeface="Angsana New"/>
+        <a:font script="Ethi" typeface="Nyala"/>
+        <a:font script="Beng" typeface="Vrinda"/>
+        <a:font script="Gujr" typeface="Shruti"/>
+        <a:font script="Khmr" typeface="MoolBoran"/>
+        <a:font script="Knda" typeface="Tunga"/>
+        <a:font script="Guru" typeface="Raavi"/>
+        <a:font script="Cans" typeface="Euphemia"/>
+        <a:font script="Cher" typeface="Plantagenet Cherokee"/>
+        <a:font script="Yiii" typeface="Microsoft Yi Baiti"/>
+        <a:font script="Tibt" typeface="Microsoft Himalaya"/>
+        <a:font script="Thaa" typeface="MV Boli"/>
+        <a:font script="Deva" typeface="Mangal"/>
+        <a:font script="Telu" typeface="Gautami"/>
+        <a:font script="Taml" typeface="Latha"/>
+        <a:font script="Syrc" typeface="Estrangelo Edessa"/>
+        <a:font script="Orya" typeface="Kalinga"/>
+        <a:font script="Mlym" typeface="Kartika"/>
+        <a:font script="Laoo" typeface="DokChampa"/>
+        <a:font script="Sinh" typeface="Iskoola Pota"/>
+        <a:font script="Mong" typeface="Mongolian Baiti"/>
+        <a:font script="Viet" typeface="Times New Roman"/>
+        <a:font script="Uigh" typeface="Microsoft Uighur"/>
+        <a:font script="Geor" typeface="Sylfaen"/>
+      </a:majorFont>
+      <a:minorFont>
+        <a:latin typeface="Calibri"/>
+        <a:ea typeface=""/>
+        <a:cs typeface=""/>
+        <a:font script="Jpan" typeface="ＭＳ 明朝"/>
+        <a:font script="Hang" typeface="맑은 고딕"/>
+        <a:font script="Hans" typeface="宋体"/>
+        <a:font script="Hant" typeface="新細明體"/>
+        <a:font script="Arab" typeface="Arial"/>
+        <a:font script="Hebr" typeface="Arial"/>
+        <a:font script="Thai" typeface="Cordia New"/>
+        <a:font script="Ethi" typeface="Nyala"/>
+        <a:font script="Beng" typeface="Vrinda"/>
+        <a:font script="Gujr" typeface="Shruti"/>
+        <a:font script="Khmr" typeface="DaunPenh"/>
+        <a:font script="Knda" typeface="Tunga"/>
+        <a:font script="Guru" typeface="Raavi"/>
+        <a:font script="Cans" typeface="Euphemia"/>
+        <a:font script="Cher" typeface="Plantagenet Cherokee"/>
+        <a:font script="Yiii" typeface="Microsoft Yi Baiti"/>
+        <a:font script="Tibt" typeface="Microsoft Himalaya"/>
+        <a:font script="Thaa" typeface="MV Boli"/>
+        <a:font script="Deva" typeface="Mangal"/>
+        <a:font script="Telu" typeface="Gautami"/>
+        <a:font script="Taml" typeface="Latha"/>
+        <a:font script="Syrc" typeface="Estrangelo Edessa"/>
+        <a:font script="Orya" typeface="Kalinga"/>
+        <a:font script="Mlym" typeface="Kartika"/>
+        <a:font script="Laoo" typeface="DokChampa"/>
+        <a:font script="Sinh" typeface="Iskoola Pota"/>
+        <a:font script="Mong" typeface="Mongolian Baiti"/>
+        <a:font script="Viet" typeface="Arial"/>
+        <a:font script="Uigh" typeface="Microsoft Uighur"/>
+        <a:font script="Geor" typeface="Sylfaen"/>
+      </a:minorFont>
+    </a:fontScheme>
+    <a:fmtScheme name="Office">
+      <a:fillStyleLst>
+        <a:solidFill>
+          <a:schemeClr val="phClr"/>
+        </a:solidFill>
+        <a:gradFill rotWithShape="1">
+          <a:gsLst>
+            <a:gs pos="0">
+              <a:schemeClr val="phClr">
+                <a:tint val="50000"/>
+                <a:satMod val="300000"/>
+              </a:schemeClr>
+            </a:gs>
+            <a:gs pos="35000">
+              <a:schemeClr val="phClr">
+                <a:tint val="37000"/>
+                <a:satMod val="300000"/>
+              </a:schemeClr>
+            </a:gs>
+            <a:gs pos="100000">
+              <a:schemeClr val="phClr">
+                <a:tint val="15000"/>
+                <a:satMod val="350000"/>
+              </a:schemeClr>
+            </a:gs>
+          </a:gsLst>
+          <a:lin ang="16200000" scaled="1"/>
+        </a:gradFill>
+        <a:gradFill rotWithShape="1">
+          <a:gsLst>
+            <a:gs pos="0">
+              <a:schemeClr val="phClr">
+                <a:shade val="51000"/>
+                <a:satMod val="130000"/>
+              </a:schemeClr>
+            </a:gs>
+            <a:gs pos="80000">
+              <a:schemeClr val="phClr">
+                <a:shade val="93000"/>
+                <a:satMod val="130000"/>
+              </a:schemeClr>
+            </a:gs>
+            <a:gs pos="100000">
+              <a:schemeClr val="phClr">
+                <a:shade val="94000"/>
+                <a:satMod val="135000"/>
+              </a:schemeClr>
+            </a:gs>
+          </a:gsLst>
+          <a:lin ang="16200000" scaled="0"/>
+        </a:gradFill>
+      </a:fillStyleLst>
+      <a:lnStyleLst>
+        <a:ln w="9525" cap="flat" cmpd="sng" algn="ctr">
+          <a:solidFill>
+            <a:schemeClr val="phClr">
+              <a:shade val="95000"/>
+              <a:satMod val="105000"/>
+            </a:schemeClr>
+          </a:solidFill>
+          <a:prstDash val="solid"/>
+        </a:ln>
+        <a:ln w="25400" cap="flat" cmpd="sng" algn="ctr">
+          <a:solidFill>
+            <a:schemeClr val="phClr"/>
+          </a:solidFill>
+          <a:prstDash val="solid"/>
+        </a:ln>
+        <a:ln w="38100" cap="flat" cmpd="sng" algn="ctr">
+          <a:solidFill>
+            <a:schemeClr val="phClr"/>
+          </a:solidFill>
+          <a:prstDash val="solid"/>
+        </a:ln>
+      </a:lnStyleLst>
+      <a:effectStyleLst>
+        <a:effectStyle>
+          <a:effectLst>
+            <a:outerShdw blurRad="40000" dist="20000" dir="5400000" rotWithShape="0">
+              <a:srgbClr val="000000">
+                <a:alpha val="38000"/>
+              </a:srgbClr>
+            </a:outerShdw>
+          </a:effectLst>
+        </a:effectStyle>
+        <a:effectStyle>
+          <a:effectLst>
+            <a:outerShdw blurRad="40000" dist="23000" dir="5400000" rotWithShape="0">
+              <a:srgbClr val="000000">
+                <a:alpha val="35000"/>
+              </a:srgbClr>
+            </a:outerShdw>
+          </a:effectLst>
+        </a:effectStyle>
+        <a:effectStyle>
+          <a:effectLst>
+            <a:outerShdw blurRad="40000" dist="23000" dir="5400000" rotWithShape="0">
+              <a:srgbClr val="000000">
+                <a:alpha val="35000"/>
+              </a:srgbClr>
+            </a:outerShdw>
+          </a:effectLst>
+          <a:scene3d>
+            <a:camera prst="orthographicFront">
+              <a:rot lat="0" lon="0" rev="0"/>
+            </a:camera>
+            <a:lightRig rig="threePt" dir="t">
+              <a:rot lat="0" lon="0" rev="1200000"/>
+            </a:lightRig>
+          </a:scene3d>
+          <a:sp3d>
+            <a:bevelT w="63500" h="25400"/>
+          </a:sp3d>
+        </a:effectStyle>
+      </a:effectStyleLst>
+      <a:bgFillStyleLst>
+        <a:solidFill>
+          <a:schemeClr val="phClr"/>
+        </a:solidFill>
+        <a:gradFill rotWithShape="1">
+          <a:gsLst>
+            <a:gs pos="0">
+              <a:schemeClr val="phClr">
+                <a:tint val="40000"/>
+                <a:satMod val="350000"/>
+              </a:schemeClr>
+            </a:gs>
+            <a:gs pos="40000">
+              <a:schemeClr val="phClr">
+                <a:tint val="45000"/>
+                <a:satMod val="350000"/>
+                <a:shade val="99000"/>
+              </a:schemeClr>
+            </a:gs>
+            <a:gs pos="100000">
+              <a:schemeClr val="phClr">
+                <a:shade val="20000"/>
+                <a:satMod val="255000"/>
+              </a:schemeClr>
+            </a:gs>
+          </a:gsLst>
+          <a:path path="circle">
+            <a:fillToRect l="50000" t="-80000" r="50000" b="180000"/>
+          </a:path>
+        </a:gradFill>
+        <a:gradFill rotWithShape="1">
+          <a:gsLst>
+            <a:gs pos="0">
+              <a:schemeClr val="phClr">
+                <a:tint val="80000"/>
+                <a:satMod val="300000"/>
+              </a:schemeClr>
+            </a:gs>
+            <a:gs pos="100000">
+              <a:schemeClr val="phClr">
+                <a:shade val="30000"/>
+                <a:satMod val="200000"/>
+              </a:schemeClr>
+            </a:gs>
+          </a:gsLst>
+          <a:path path="circle">
+            <a:fillToRect l="50000" t="50000" r="50000" b="50000"/>
+          </a:path>
+        </a:gradFill>
+      </a:bgFillStyleLst>
+    </a:fmtScheme>
+  </a:themeElements>
+  <a:objectDefaults/>
+  <a:extraClrSchemeLst/>
+</a:theme>
+</file>
+
+<file path=customXml/item1.xml><?xml version="1.0" encoding="utf-8"?>
+<s:customData xmlns="http://www.wps.cn/officeDocument/2013/wpsCustomData" xmlns:s="http://www.wps.cn/officeDocument/2013/wpsCustomData">
+  <customSectProps>
+    <customSectPr/>
+  </customSectProps>
+  <customShpExts>
+    <customShpInfo spid="_x0000_s2049"/>
+    <customShpInfo spid="_x0000_s1026" textRotate="1"/>
+  </customShpExts>
+</s:customData>
+</file>
+
+<file path=customXml/itemProps1.xml><?xml version="1.0" encoding="utf-8"?>
+<ds:datastoreItem xmlns:ds="http://schemas.openxmlformats.org/officeDocument/2006/customXml" ds:itemID="{B1977F7D-205B-4081-913C-38D41E755F92}">
+  <ds:schemaRefs>
+    <ds:schemaRef ds:uri="http://www.wps.cn/officeDocument/2013/wpsCustomData"/>
+  </ds:schemaRefs>
+</ds:datastoreItem>
 </file>
</xml_diff>